<commit_message>
docs: translate DPIA responses and align risk ratings with course matrix
</commit_message>
<xml_diff>
--- a/docs/DPIA_Laboratorio_11.docx
+++ b/docs/DPIA_Laboratorio_11.docx
@@ -307,9 +307,13 @@
         </w:tblBorders>
       </w:tblPr>
       <w:tblGrid>
-        <w:gridCol w:w="2400"/>
-        <w:gridCol w:w="3600"/>
-        <w:gridCol w:w="3780"/>
+        <w:gridCol w:w="1000"/>
+        <w:gridCol w:w="1450"/>
+        <w:gridCol w:w="1100"/>
+        <w:gridCol w:w="1550"/>
+        <w:gridCol w:w="1250"/>
+        <w:gridCol w:w="1750"/>
+        <w:gridCol w:w="1680"/>
       </w:tblGrid>
       <w:tr>
         <w:trPr>
@@ -318,7 +322,7 @@
         </w:trPr>
         <w:tc>
           <w:tcPr>
-            <w:tcW w:w="2400" w:type="dxa"/>
+            <w:tcW w:w="1000" w:type="dxa"/>
             <w:shd w:fill="F2F2F2" w:val="clear"/>
             <w:tcMar>
               <w:top w:w="75" w:type="dxa"/>
@@ -334,17 +338,17 @@
             <w:r>
               <w:rPr>
                 <w:rFonts w:ascii="Times New Roman" w:hAnsi="Times New Roman" w:cs="Times New Roman"/>
-                <w:sz w:val="21"/>
+                <w:sz w:val="19"/>
                 <w:color w:val="000000"/>
                 <w:b/>
               </w:rPr>
-              <w:t>Campo y obligatoriedad</w:t>
-            </w:r>
-          </w:p>
-        </w:tc>
-        <w:tc>
-          <w:tcPr>
-            <w:tcW w:w="3600" w:type="dxa"/>
+              <w:t>Campo</w:t>
+            </w:r>
+          </w:p>
+        </w:tc>
+        <w:tc>
+          <w:tcPr>
+            <w:tcW w:w="1450" w:type="dxa"/>
             <w:shd w:fill="F2F2F2" w:val="clear"/>
             <w:tcMar>
               <w:top w:w="75" w:type="dxa"/>
@@ -360,17 +364,17 @@
             <w:r>
               <w:rPr>
                 <w:rFonts w:ascii="Times New Roman" w:hAnsi="Times New Roman" w:cs="Times New Roman"/>
-                <w:sz w:val="21"/>
+                <w:sz w:val="19"/>
                 <w:color w:val="000000"/>
                 <w:b/>
               </w:rPr>
-              <w:t>Finalidad y necesidad</w:t>
-            </w:r>
-          </w:p>
-        </w:tc>
-        <w:tc>
-          <w:tcPr>
-            <w:tcW w:w="3780" w:type="dxa"/>
+              <w:t>Finalidad</w:t>
+            </w:r>
+          </w:p>
+        </w:tc>
+        <w:tc>
+          <w:tcPr>
+            <w:tcW w:w="1100" w:type="dxa"/>
             <w:shd w:fill="F2F2F2" w:val="clear"/>
             <w:tcMar>
               <w:top w:w="75" w:type="dxa"/>
@@ -386,22 +390,18 @@
             <w:r>
               <w:rPr>
                 <w:rFonts w:ascii="Times New Roman" w:hAnsi="Times New Roman" w:cs="Times New Roman"/>
-                <w:sz w:val="21"/>
+                <w:sz w:val="19"/>
                 <w:color w:val="000000"/>
                 <w:b/>
               </w:rPr>
-              <w:t>Base y estado actual</w:t>
-            </w:r>
-          </w:p>
-        </w:tc>
-      </w:tr>
-      <w:tr>
-        <w:trPr>
-          <w:cantSplit/>
-        </w:trPr>
-        <w:tc>
-          <w:tcPr>
-            <w:tcW w:w="2400" w:type="dxa"/>
+              <w:t>Obligatorio</w:t>
+            </w:r>
+          </w:p>
+        </w:tc>
+        <w:tc>
+          <w:tcPr>
+            <w:tcW w:w="1550" w:type="dxa"/>
+            <w:shd w:fill="F2F2F2" w:val="clear"/>
             <w:tcMar>
               <w:top w:w="75" w:type="dxa"/>
               <w:bottom w:w="75" w:type="dxa"/>
@@ -416,17 +416,18 @@
             <w:r>
               <w:rPr>
                 <w:rFonts w:ascii="Times New Roman" w:hAnsi="Times New Roman" w:cs="Times New Roman"/>
-                <w:sz w:val="21"/>
+                <w:sz w:val="19"/>
                 <w:color w:val="000000"/>
-              </w:rPr>
-              <w:t>Nombres y apellidos
-Obligatorios</w:t>
-            </w:r>
-          </w:p>
-        </w:tc>
-        <w:tc>
-          <w:tcPr>
-            <w:tcW w:w="3600" w:type="dxa"/>
+                <w:b/>
+              </w:rPr>
+              <w:t>Base actual</w:t>
+            </w:r>
+          </w:p>
+        </w:tc>
+        <w:tc>
+          <w:tcPr>
+            <w:tcW w:w="1250" w:type="dxa"/>
+            <w:shd w:fill="F2F2F2" w:val="clear"/>
             <w:tcMar>
               <w:top w:w="75" w:type="dxa"/>
               <w:bottom w:w="75" w:type="dxa"/>
@@ -441,16 +442,18 @@
             <w:r>
               <w:rPr>
                 <w:rFonts w:ascii="Times New Roman" w:hAnsi="Times New Roman" w:cs="Times New Roman"/>
-                <w:sz w:val="21"/>
+                <w:sz w:val="19"/>
                 <w:color w:val="000000"/>
-              </w:rPr>
-              <w:t>Distinguir registros. Requeridos por el ejercicio; reconsiderar para un uso real.</w:t>
-            </w:r>
-          </w:p>
-        </w:tc>
-        <w:tc>
-          <w:tcPr>
-            <w:tcW w:w="3780" w:type="dxa"/>
+                <w:b/>
+              </w:rPr>
+              <w:t>Retención actual</w:t>
+            </w:r>
+          </w:p>
+        </w:tc>
+        <w:tc>
+          <w:tcPr>
+            <w:tcW w:w="1750" w:type="dxa"/>
+            <w:shd w:fill="F2F2F2" w:val="clear"/>
             <w:tcMar>
               <w:top w:w="75" w:type="dxa"/>
               <w:bottom w:w="75" w:type="dxa"/>
@@ -465,21 +468,18 @@
             <w:r>
               <w:rPr>
                 <w:rFonts w:ascii="Times New Roman" w:hAnsi="Times New Roman" w:cs="Times New Roman"/>
-                <w:sz w:val="21"/>
+                <w:sz w:val="19"/>
                 <w:color w:val="000000"/>
-              </w:rPr>
-              <w:t>Datos inventados para la práctica. No se ha establecido una base para recolectar datos reales.</w:t>
-            </w:r>
-          </w:p>
-        </w:tc>
-      </w:tr>
-      <w:tr>
-        <w:trPr>
-          <w:cantSplit/>
-        </w:trPr>
-        <w:tc>
-          <w:tcPr>
-            <w:tcW w:w="2400" w:type="dxa"/>
+                <w:b/>
+              </w:rPr>
+              <w:t>Quién lo ve</w:t>
+            </w:r>
+          </w:p>
+        </w:tc>
+        <w:tc>
+          <w:tcPr>
+            <w:tcW w:w="1680" w:type="dxa"/>
+            <w:shd w:fill="F2F2F2" w:val="clear"/>
             <w:tcMar>
               <w:top w:w="75" w:type="dxa"/>
               <w:bottom w:w="75" w:type="dxa"/>
@@ -494,17 +494,22 @@
             <w:r>
               <w:rPr>
                 <w:rFonts w:ascii="Times New Roman" w:hAnsi="Times New Roman" w:cs="Times New Roman"/>
-                <w:sz w:val="21"/>
+                <w:sz w:val="19"/>
                 <w:color w:val="000000"/>
-              </w:rPr>
-              <w:t>Correo
-Obligatorio</w:t>
-            </w:r>
-          </w:p>
-        </w:tc>
-        <w:tc>
-          <w:tcPr>
-            <w:tcW w:w="3600" w:type="dxa"/>
+                <w:b/>
+              </w:rPr>
+              <w:t>Necesidad</w:t>
+            </w:r>
+          </w:p>
+        </w:tc>
+      </w:tr>
+      <w:tr>
+        <w:trPr>
+          <w:cantSplit/>
+        </w:trPr>
+        <w:tc>
+          <w:tcPr>
+            <w:tcW w:w="1000" w:type="dxa"/>
             <w:tcMar>
               <w:top w:w="75" w:type="dxa"/>
               <w:bottom w:w="75" w:type="dxa"/>
@@ -519,16 +524,16 @@
             <w:r>
               <w:rPr>
                 <w:rFonts w:ascii="Times New Roman" w:hAnsi="Times New Roman" w:cs="Times New Roman"/>
-                <w:sz w:val="21"/>
+                <w:sz w:val="19"/>
                 <w:color w:val="000000"/>
               </w:rPr>
-              <w:t>Representar un dato de contacto. No se envían mensajes; no se valida formato ni duplicado.</w:t>
-            </w:r>
-          </w:p>
-        </w:tc>
-        <w:tc>
-          <w:tcPr>
-            <w:tcW w:w="3780" w:type="dxa"/>
+              <w:t>nombres</w:t>
+            </w:r>
+          </w:p>
+        </w:tc>
+        <w:tc>
+          <w:tcPr>
+            <w:tcW w:w="1450" w:type="dxa"/>
             <w:tcMar>
               <w:top w:w="75" w:type="dxa"/>
               <w:bottom w:w="75" w:type="dxa"/>
@@ -543,21 +548,16 @@
             <w:r>
               <w:rPr>
                 <w:rFonts w:ascii="Times New Roman" w:hAnsi="Times New Roman" w:cs="Times New Roman"/>
-                <w:sz w:val="21"/>
+                <w:sz w:val="19"/>
                 <w:color w:val="000000"/>
               </w:rPr>
-              <w:t>Datos inventados para la práctica. La futura base depende de una finalidad concreta.</w:t>
-            </w:r>
-          </w:p>
-        </w:tc>
-      </w:tr>
-      <w:tr>
-        <w:trPr>
-          <w:cantSplit/>
-        </w:trPr>
-        <w:tc>
-          <w:tcPr>
-            <w:tcW w:w="2400" w:type="dxa"/>
+              <w:t>Distinguir entradas</w:t>
+            </w:r>
+          </w:p>
+        </w:tc>
+        <w:tc>
+          <w:tcPr>
+            <w:tcW w:w="1100" w:type="dxa"/>
             <w:tcMar>
               <w:top w:w="75" w:type="dxa"/>
               <w:bottom w:w="75" w:type="dxa"/>
@@ -572,17 +572,16 @@
             <w:r>
               <w:rPr>
                 <w:rFonts w:ascii="Times New Roman" w:hAnsi="Times New Roman" w:cs="Times New Roman"/>
-                <w:sz w:val="21"/>
+                <w:sz w:val="19"/>
                 <w:color w:val="000000"/>
               </w:rPr>
-              <w:t>Teléfono
-Opcional</w:t>
-            </w:r>
-          </w:p>
-        </w:tc>
-        <w:tc>
-          <w:tcPr>
-            <w:tcW w:w="3600" w:type="dxa"/>
+              <w:t>Sí</w:t>
+            </w:r>
+          </w:p>
+        </w:tc>
+        <w:tc>
+          <w:tcPr>
+            <w:tcW w:w="1550" w:type="dxa"/>
             <w:tcMar>
               <w:top w:w="75" w:type="dxa"/>
               <w:bottom w:w="75" w:type="dxa"/>
@@ -597,16 +596,16 @@
             <w:r>
               <w:rPr>
                 <w:rFonts w:ascii="Times New Roman" w:hAnsi="Times New Roman" w:cs="Times New Roman"/>
-                <w:sz w:val="21"/>
+                <w:sz w:val="19"/>
                 <w:color w:val="000000"/>
               </w:rPr>
-              <w:t>No tiene una necesidad demostrada. C03 propone eliminarlo.</w:t>
-            </w:r>
-          </w:p>
-        </w:tc>
-        <w:tc>
-          <w:tcPr>
-            <w:tcW w:w="3780" w:type="dxa"/>
+              <w:t>Práctica con datos ficticios</w:t>
+            </w:r>
+          </w:p>
+        </w:tc>
+        <w:tc>
+          <w:tcPr>
+            <w:tcW w:w="1250" w:type="dxa"/>
             <w:tcMar>
               <w:top w:w="75" w:type="dxa"/>
               <w:bottom w:w="75" w:type="dxa"/>
@@ -621,21 +620,16 @@
             <w:r>
               <w:rPr>
                 <w:rFonts w:ascii="Times New Roman" w:hAnsi="Times New Roman" w:cs="Times New Roman"/>
-                <w:sz w:val="21"/>
+                <w:sz w:val="19"/>
                 <w:color w:val="000000"/>
               </w:rPr>
-              <w:t>Sin finalidad operativa adicional ni base documentada para un servicio real.</w:t>
-            </w:r>
-          </w:p>
-        </w:tc>
-      </w:tr>
-      <w:tr>
-        <w:trPr>
-          <w:cantSplit/>
-        </w:trPr>
-        <w:tc>
-          <w:tcPr>
-            <w:tcW w:w="2400" w:type="dxa"/>
+              <w:t>Indefinida</w:t>
+            </w:r>
+          </w:p>
+        </w:tc>
+        <w:tc>
+          <w:tcPr>
+            <w:tcW w:w="1750" w:type="dxa"/>
             <w:tcMar>
               <w:top w:w="75" w:type="dxa"/>
               <w:bottom w:w="75" w:type="dxa"/>
@@ -650,17 +644,16 @@
             <w:r>
               <w:rPr>
                 <w:rFonts w:ascii="Times New Roman" w:hAnsi="Times New Roman" w:cs="Times New Roman"/>
-                <w:sz w:val="21"/>
+                <w:sz w:val="19"/>
                 <w:color w:val="000000"/>
               </w:rPr>
-              <w:t>id y creado_en
-Automáticos</w:t>
-            </w:r>
-          </w:p>
-        </w:tc>
-        <w:tc>
-          <w:tcPr>
-            <w:tcW w:w="3600" w:type="dxa"/>
+              <w:t>Cliente local y quien copie la BD</w:t>
+            </w:r>
+          </w:p>
+        </w:tc>
+        <w:tc>
+          <w:tcPr>
+            <w:tcW w:w="1680" w:type="dxa"/>
             <w:tcMar>
               <w:top w:w="75" w:type="dxa"/>
               <w:bottom w:w="75" w:type="dxa"/>
@@ -675,16 +668,21 @@
             <w:r>
               <w:rPr>
                 <w:rFonts w:ascii="Times New Roman" w:hAnsi="Times New Roman" w:cs="Times New Roman"/>
-                <w:sz w:val="21"/>
+                <w:sz w:val="19"/>
                 <w:color w:val="000000"/>
               </w:rPr>
-              <w:t>Identificar y fechar cada entrada. Útiles para localizar registros y definir un futuro plazo.</w:t>
-            </w:r>
-          </w:p>
-        </w:tc>
-        <w:tc>
-          <w:tcPr>
-            <w:tcW w:w="3780" w:type="dxa"/>
+              <w:t>Exigido por el ejercicio</w:t>
+            </w:r>
+          </w:p>
+        </w:tc>
+      </w:tr>
+      <w:tr>
+        <w:trPr>
+          <w:cantSplit/>
+        </w:trPr>
+        <w:tc>
+          <w:tcPr>
+            <w:tcW w:w="1000" w:type="dxa"/>
             <w:tcMar>
               <w:top w:w="75" w:type="dxa"/>
               <w:bottom w:w="75" w:type="dxa"/>
@@ -699,10 +697,846 @@
             <w:r>
               <w:rPr>
                 <w:rFonts w:ascii="Times New Roman" w:hAnsi="Times New Roman" w:cs="Times New Roman"/>
-                <w:sz w:val="21"/>
+                <w:sz w:val="19"/>
                 <w:color w:val="000000"/>
               </w:rPr>
-              <w:t>Metadatos locales del ejercicio. No acreditan identidad ni consentimiento.</w:t>
+              <w:t>apellidos</w:t>
+            </w:r>
+          </w:p>
+        </w:tc>
+        <w:tc>
+          <w:tcPr>
+            <w:tcW w:w="1450" w:type="dxa"/>
+            <w:tcMar>
+              <w:top w:w="75" w:type="dxa"/>
+              <w:bottom w:w="75" w:type="dxa"/>
+              <w:left w:w="75" w:type="dxa"/>
+              <w:right w:w="75" w:type="dxa"/>
+            </w:tcMar>
+          </w:tcPr>
+          <w:p>
+            <w:pPr>
+              <w:spacing w:before="0" w:after="0" w:line="260" w:lineRule="auto"/>
+            </w:pPr>
+            <w:r>
+              <w:rPr>
+                <w:rFonts w:ascii="Times New Roman" w:hAnsi="Times New Roman" w:cs="Times New Roman"/>
+                <w:sz w:val="19"/>
+                <w:color w:val="000000"/>
+              </w:rPr>
+              <w:t>Distinguir entradas</w:t>
+            </w:r>
+          </w:p>
+        </w:tc>
+        <w:tc>
+          <w:tcPr>
+            <w:tcW w:w="1100" w:type="dxa"/>
+            <w:tcMar>
+              <w:top w:w="75" w:type="dxa"/>
+              <w:bottom w:w="75" w:type="dxa"/>
+              <w:left w:w="75" w:type="dxa"/>
+              <w:right w:w="75" w:type="dxa"/>
+            </w:tcMar>
+          </w:tcPr>
+          <w:p>
+            <w:pPr>
+              <w:spacing w:before="0" w:after="0" w:line="260" w:lineRule="auto"/>
+            </w:pPr>
+            <w:r>
+              <w:rPr>
+                <w:rFonts w:ascii="Times New Roman" w:hAnsi="Times New Roman" w:cs="Times New Roman"/>
+                <w:sz w:val="19"/>
+                <w:color w:val="000000"/>
+              </w:rPr>
+              <w:t>Sí</w:t>
+            </w:r>
+          </w:p>
+        </w:tc>
+        <w:tc>
+          <w:tcPr>
+            <w:tcW w:w="1550" w:type="dxa"/>
+            <w:tcMar>
+              <w:top w:w="75" w:type="dxa"/>
+              <w:bottom w:w="75" w:type="dxa"/>
+              <w:left w:w="75" w:type="dxa"/>
+              <w:right w:w="75" w:type="dxa"/>
+            </w:tcMar>
+          </w:tcPr>
+          <w:p>
+            <w:pPr>
+              <w:spacing w:before="0" w:after="0" w:line="260" w:lineRule="auto"/>
+            </w:pPr>
+            <w:r>
+              <w:rPr>
+                <w:rFonts w:ascii="Times New Roman" w:hAnsi="Times New Roman" w:cs="Times New Roman"/>
+                <w:sz w:val="19"/>
+                <w:color w:val="000000"/>
+              </w:rPr>
+              <w:t>Práctica con datos ficticios</w:t>
+            </w:r>
+          </w:p>
+        </w:tc>
+        <w:tc>
+          <w:tcPr>
+            <w:tcW w:w="1250" w:type="dxa"/>
+            <w:tcMar>
+              <w:top w:w="75" w:type="dxa"/>
+              <w:bottom w:w="75" w:type="dxa"/>
+              <w:left w:w="75" w:type="dxa"/>
+              <w:right w:w="75" w:type="dxa"/>
+            </w:tcMar>
+          </w:tcPr>
+          <w:p>
+            <w:pPr>
+              <w:spacing w:before="0" w:after="0" w:line="260" w:lineRule="auto"/>
+            </w:pPr>
+            <w:r>
+              <w:rPr>
+                <w:rFonts w:ascii="Times New Roman" w:hAnsi="Times New Roman" w:cs="Times New Roman"/>
+                <w:sz w:val="19"/>
+                <w:color w:val="000000"/>
+              </w:rPr>
+              <w:t>Indefinida</w:t>
+            </w:r>
+          </w:p>
+        </w:tc>
+        <w:tc>
+          <w:tcPr>
+            <w:tcW w:w="1750" w:type="dxa"/>
+            <w:tcMar>
+              <w:top w:w="75" w:type="dxa"/>
+              <w:bottom w:w="75" w:type="dxa"/>
+              <w:left w:w="75" w:type="dxa"/>
+              <w:right w:w="75" w:type="dxa"/>
+            </w:tcMar>
+          </w:tcPr>
+          <w:p>
+            <w:pPr>
+              <w:spacing w:before="0" w:after="0" w:line="260" w:lineRule="auto"/>
+            </w:pPr>
+            <w:r>
+              <w:rPr>
+                <w:rFonts w:ascii="Times New Roman" w:hAnsi="Times New Roman" w:cs="Times New Roman"/>
+                <w:sz w:val="19"/>
+                <w:color w:val="000000"/>
+              </w:rPr>
+              <w:t>Cliente local y quien copie la BD</w:t>
+            </w:r>
+          </w:p>
+        </w:tc>
+        <w:tc>
+          <w:tcPr>
+            <w:tcW w:w="1680" w:type="dxa"/>
+            <w:tcMar>
+              <w:top w:w="75" w:type="dxa"/>
+              <w:bottom w:w="75" w:type="dxa"/>
+              <w:left w:w="75" w:type="dxa"/>
+              <w:right w:w="75" w:type="dxa"/>
+            </w:tcMar>
+          </w:tcPr>
+          <w:p>
+            <w:pPr>
+              <w:spacing w:before="0" w:after="0" w:line="260" w:lineRule="auto"/>
+            </w:pPr>
+            <w:r>
+              <w:rPr>
+                <w:rFonts w:ascii="Times New Roman" w:hAnsi="Times New Roman" w:cs="Times New Roman"/>
+                <w:sz w:val="19"/>
+                <w:color w:val="000000"/>
+              </w:rPr>
+              <w:t>Exigido por el ejercicio</w:t>
+            </w:r>
+          </w:p>
+        </w:tc>
+      </w:tr>
+      <w:tr>
+        <w:trPr>
+          <w:cantSplit/>
+        </w:trPr>
+        <w:tc>
+          <w:tcPr>
+            <w:tcW w:w="1000" w:type="dxa"/>
+            <w:tcMar>
+              <w:top w:w="75" w:type="dxa"/>
+              <w:bottom w:w="75" w:type="dxa"/>
+              <w:left w:w="75" w:type="dxa"/>
+              <w:right w:w="75" w:type="dxa"/>
+            </w:tcMar>
+          </w:tcPr>
+          <w:p>
+            <w:pPr>
+              <w:spacing w:before="0" w:after="0" w:line="260" w:lineRule="auto"/>
+            </w:pPr>
+            <w:r>
+              <w:rPr>
+                <w:rFonts w:ascii="Times New Roman" w:hAnsi="Times New Roman" w:cs="Times New Roman"/>
+                <w:sz w:val="19"/>
+                <w:color w:val="000000"/>
+              </w:rPr>
+              <w:t>correo</w:t>
+            </w:r>
+          </w:p>
+        </w:tc>
+        <w:tc>
+          <w:tcPr>
+            <w:tcW w:w="1450" w:type="dxa"/>
+            <w:tcMar>
+              <w:top w:w="75" w:type="dxa"/>
+              <w:bottom w:w="75" w:type="dxa"/>
+              <w:left w:w="75" w:type="dxa"/>
+              <w:right w:w="75" w:type="dxa"/>
+            </w:tcMar>
+          </w:tcPr>
+          <w:p>
+            <w:pPr>
+              <w:spacing w:before="0" w:after="0" w:line="260" w:lineRule="auto"/>
+            </w:pPr>
+            <w:r>
+              <w:rPr>
+                <w:rFonts w:ascii="Times New Roman" w:hAnsi="Times New Roman" w:cs="Times New Roman"/>
+                <w:sz w:val="19"/>
+                <w:color w:val="000000"/>
+              </w:rPr>
+              <w:t>Representar contacto; sin envío</w:t>
+            </w:r>
+          </w:p>
+        </w:tc>
+        <w:tc>
+          <w:tcPr>
+            <w:tcW w:w="1100" w:type="dxa"/>
+            <w:tcMar>
+              <w:top w:w="75" w:type="dxa"/>
+              <w:bottom w:w="75" w:type="dxa"/>
+              <w:left w:w="75" w:type="dxa"/>
+              <w:right w:w="75" w:type="dxa"/>
+            </w:tcMar>
+          </w:tcPr>
+          <w:p>
+            <w:pPr>
+              <w:spacing w:before="0" w:after="0" w:line="260" w:lineRule="auto"/>
+            </w:pPr>
+            <w:r>
+              <w:rPr>
+                <w:rFonts w:ascii="Times New Roman" w:hAnsi="Times New Roman" w:cs="Times New Roman"/>
+                <w:sz w:val="19"/>
+                <w:color w:val="000000"/>
+              </w:rPr>
+              <w:t>Sí</w:t>
+            </w:r>
+          </w:p>
+        </w:tc>
+        <w:tc>
+          <w:tcPr>
+            <w:tcW w:w="1550" w:type="dxa"/>
+            <w:tcMar>
+              <w:top w:w="75" w:type="dxa"/>
+              <w:bottom w:w="75" w:type="dxa"/>
+              <w:left w:w="75" w:type="dxa"/>
+              <w:right w:w="75" w:type="dxa"/>
+            </w:tcMar>
+          </w:tcPr>
+          <w:p>
+            <w:pPr>
+              <w:spacing w:before="0" w:after="0" w:line="260" w:lineRule="auto"/>
+            </w:pPr>
+            <w:r>
+              <w:rPr>
+                <w:rFonts w:ascii="Times New Roman" w:hAnsi="Times New Roman" w:cs="Times New Roman"/>
+                <w:sz w:val="19"/>
+                <w:color w:val="000000"/>
+              </w:rPr>
+              <w:t>Práctica con datos ficticios</w:t>
+            </w:r>
+          </w:p>
+        </w:tc>
+        <w:tc>
+          <w:tcPr>
+            <w:tcW w:w="1250" w:type="dxa"/>
+            <w:tcMar>
+              <w:top w:w="75" w:type="dxa"/>
+              <w:bottom w:w="75" w:type="dxa"/>
+              <w:left w:w="75" w:type="dxa"/>
+              <w:right w:w="75" w:type="dxa"/>
+            </w:tcMar>
+          </w:tcPr>
+          <w:p>
+            <w:pPr>
+              <w:spacing w:before="0" w:after="0" w:line="260" w:lineRule="auto"/>
+            </w:pPr>
+            <w:r>
+              <w:rPr>
+                <w:rFonts w:ascii="Times New Roman" w:hAnsi="Times New Roman" w:cs="Times New Roman"/>
+                <w:sz w:val="19"/>
+                <w:color w:val="000000"/>
+              </w:rPr>
+              <w:t>Indefinida</w:t>
+            </w:r>
+          </w:p>
+        </w:tc>
+        <w:tc>
+          <w:tcPr>
+            <w:tcW w:w="1750" w:type="dxa"/>
+            <w:tcMar>
+              <w:top w:w="75" w:type="dxa"/>
+              <w:bottom w:w="75" w:type="dxa"/>
+              <w:left w:w="75" w:type="dxa"/>
+              <w:right w:w="75" w:type="dxa"/>
+            </w:tcMar>
+          </w:tcPr>
+          <w:p>
+            <w:pPr>
+              <w:spacing w:before="0" w:after="0" w:line="260" w:lineRule="auto"/>
+            </w:pPr>
+            <w:r>
+              <w:rPr>
+                <w:rFonts w:ascii="Times New Roman" w:hAnsi="Times New Roman" w:cs="Times New Roman"/>
+                <w:sz w:val="19"/>
+                <w:color w:val="000000"/>
+              </w:rPr>
+              <w:t>Cliente local y quien copie la BD</w:t>
+            </w:r>
+          </w:p>
+        </w:tc>
+        <w:tc>
+          <w:tcPr>
+            <w:tcW w:w="1680" w:type="dxa"/>
+            <w:tcMar>
+              <w:top w:w="75" w:type="dxa"/>
+              <w:bottom w:w="75" w:type="dxa"/>
+              <w:left w:w="75" w:type="dxa"/>
+              <w:right w:w="75" w:type="dxa"/>
+            </w:tcMar>
+          </w:tcPr>
+          <w:p>
+            <w:pPr>
+              <w:spacing w:before="0" w:after="0" w:line="260" w:lineRule="auto"/>
+            </w:pPr>
+            <w:r>
+              <w:rPr>
+                <w:rFonts w:ascii="Times New Roman" w:hAnsi="Times New Roman" w:cs="Times New Roman"/>
+                <w:sz w:val="19"/>
+                <w:color w:val="000000"/>
+              </w:rPr>
+              <w:t>Exigido por el ejercicio</w:t>
+            </w:r>
+          </w:p>
+        </w:tc>
+      </w:tr>
+      <w:tr>
+        <w:trPr>
+          <w:cantSplit/>
+        </w:trPr>
+        <w:tc>
+          <w:tcPr>
+            <w:tcW w:w="1000" w:type="dxa"/>
+            <w:tcMar>
+              <w:top w:w="75" w:type="dxa"/>
+              <w:bottom w:w="75" w:type="dxa"/>
+              <w:left w:w="75" w:type="dxa"/>
+              <w:right w:w="75" w:type="dxa"/>
+            </w:tcMar>
+          </w:tcPr>
+          <w:p>
+            <w:pPr>
+              <w:spacing w:before="0" w:after="0" w:line="260" w:lineRule="auto"/>
+            </w:pPr>
+            <w:r>
+              <w:rPr>
+                <w:rFonts w:ascii="Times New Roman" w:hAnsi="Times New Roman" w:cs="Times New Roman"/>
+                <w:sz w:val="19"/>
+                <w:color w:val="000000"/>
+              </w:rPr>
+              <w:t>telefono</w:t>
+            </w:r>
+          </w:p>
+        </w:tc>
+        <w:tc>
+          <w:tcPr>
+            <w:tcW w:w="1450" w:type="dxa"/>
+            <w:tcMar>
+              <w:top w:w="75" w:type="dxa"/>
+              <w:bottom w:w="75" w:type="dxa"/>
+              <w:left w:w="75" w:type="dxa"/>
+              <w:right w:w="75" w:type="dxa"/>
+            </w:tcMar>
+          </w:tcPr>
+          <w:p>
+            <w:pPr>
+              <w:spacing w:before="0" w:after="0" w:line="260" w:lineRule="auto"/>
+            </w:pPr>
+            <w:r>
+              <w:rPr>
+                <w:rFonts w:ascii="Times New Roman" w:hAnsi="Times New Roman" w:cs="Times New Roman"/>
+                <w:sz w:val="19"/>
+                <w:color w:val="000000"/>
+              </w:rPr>
+              <w:t>Sin uso operativo</w:t>
+            </w:r>
+          </w:p>
+        </w:tc>
+        <w:tc>
+          <w:tcPr>
+            <w:tcW w:w="1100" w:type="dxa"/>
+            <w:tcMar>
+              <w:top w:w="75" w:type="dxa"/>
+              <w:bottom w:w="75" w:type="dxa"/>
+              <w:left w:w="75" w:type="dxa"/>
+              <w:right w:w="75" w:type="dxa"/>
+            </w:tcMar>
+          </w:tcPr>
+          <w:p>
+            <w:pPr>
+              <w:spacing w:before="0" w:after="0" w:line="260" w:lineRule="auto"/>
+            </w:pPr>
+            <w:r>
+              <w:rPr>
+                <w:rFonts w:ascii="Times New Roman" w:hAnsi="Times New Roman" w:cs="Times New Roman"/>
+                <w:sz w:val="19"/>
+                <w:color w:val="000000"/>
+              </w:rPr>
+              <w:t>No</w:t>
+            </w:r>
+          </w:p>
+        </w:tc>
+        <w:tc>
+          <w:tcPr>
+            <w:tcW w:w="1550" w:type="dxa"/>
+            <w:tcMar>
+              <w:top w:w="75" w:type="dxa"/>
+              <w:bottom w:w="75" w:type="dxa"/>
+              <w:left w:w="75" w:type="dxa"/>
+              <w:right w:w="75" w:type="dxa"/>
+            </w:tcMar>
+          </w:tcPr>
+          <w:p>
+            <w:pPr>
+              <w:spacing w:before="0" w:after="0" w:line="260" w:lineRule="auto"/>
+            </w:pPr>
+            <w:r>
+              <w:rPr>
+                <w:rFonts w:ascii="Times New Roman" w:hAnsi="Times New Roman" w:cs="Times New Roman"/>
+                <w:sz w:val="19"/>
+                <w:color w:val="000000"/>
+              </w:rPr>
+              <w:t>Sin base para uso real</w:t>
+            </w:r>
+          </w:p>
+        </w:tc>
+        <w:tc>
+          <w:tcPr>
+            <w:tcW w:w="1250" w:type="dxa"/>
+            <w:tcMar>
+              <w:top w:w="75" w:type="dxa"/>
+              <w:bottom w:w="75" w:type="dxa"/>
+              <w:left w:w="75" w:type="dxa"/>
+              <w:right w:w="75" w:type="dxa"/>
+            </w:tcMar>
+          </w:tcPr>
+          <w:p>
+            <w:pPr>
+              <w:spacing w:before="0" w:after="0" w:line="260" w:lineRule="auto"/>
+            </w:pPr>
+            <w:r>
+              <w:rPr>
+                <w:rFonts w:ascii="Times New Roman" w:hAnsi="Times New Roman" w:cs="Times New Roman"/>
+                <w:sz w:val="19"/>
+                <w:color w:val="000000"/>
+              </w:rPr>
+              <w:t>Indefinida</w:t>
+            </w:r>
+          </w:p>
+        </w:tc>
+        <w:tc>
+          <w:tcPr>
+            <w:tcW w:w="1750" w:type="dxa"/>
+            <w:tcMar>
+              <w:top w:w="75" w:type="dxa"/>
+              <w:bottom w:w="75" w:type="dxa"/>
+              <w:left w:w="75" w:type="dxa"/>
+              <w:right w:w="75" w:type="dxa"/>
+            </w:tcMar>
+          </w:tcPr>
+          <w:p>
+            <w:pPr>
+              <w:spacing w:before="0" w:after="0" w:line="260" w:lineRule="auto"/>
+            </w:pPr>
+            <w:r>
+              <w:rPr>
+                <w:rFonts w:ascii="Times New Roman" w:hAnsi="Times New Roman" w:cs="Times New Roman"/>
+                <w:sz w:val="19"/>
+                <w:color w:val="000000"/>
+              </w:rPr>
+              <w:t>Cliente local y quien copie la BD</w:t>
+            </w:r>
+          </w:p>
+        </w:tc>
+        <w:tc>
+          <w:tcPr>
+            <w:tcW w:w="1680" w:type="dxa"/>
+            <w:tcMar>
+              <w:top w:w="75" w:type="dxa"/>
+              <w:bottom w:w="75" w:type="dxa"/>
+              <w:left w:w="75" w:type="dxa"/>
+              <w:right w:w="75" w:type="dxa"/>
+            </w:tcMar>
+          </w:tcPr>
+          <w:p>
+            <w:pPr>
+              <w:spacing w:before="0" w:after="0" w:line="260" w:lineRule="auto"/>
+            </w:pPr>
+            <w:r>
+              <w:rPr>
+                <w:rFonts w:ascii="Times New Roman" w:hAnsi="Times New Roman" w:cs="Times New Roman"/>
+                <w:sz w:val="19"/>
+                <w:color w:val="000000"/>
+              </w:rPr>
+              <w:t>No; se propone eliminar</w:t>
+            </w:r>
+          </w:p>
+        </w:tc>
+      </w:tr>
+      <w:tr>
+        <w:trPr>
+          <w:cantSplit/>
+        </w:trPr>
+        <w:tc>
+          <w:tcPr>
+            <w:tcW w:w="1000" w:type="dxa"/>
+            <w:tcMar>
+              <w:top w:w="75" w:type="dxa"/>
+              <w:bottom w:w="75" w:type="dxa"/>
+              <w:left w:w="75" w:type="dxa"/>
+              <w:right w:w="75" w:type="dxa"/>
+            </w:tcMar>
+          </w:tcPr>
+          <w:p>
+            <w:pPr>
+              <w:spacing w:before="0" w:after="0" w:line="260" w:lineRule="auto"/>
+            </w:pPr>
+            <w:r>
+              <w:rPr>
+                <w:rFonts w:ascii="Times New Roman" w:hAnsi="Times New Roman" w:cs="Times New Roman"/>
+                <w:sz w:val="19"/>
+                <w:color w:val="000000"/>
+              </w:rPr>
+              <w:t>id</w:t>
+            </w:r>
+          </w:p>
+        </w:tc>
+        <w:tc>
+          <w:tcPr>
+            <w:tcW w:w="1450" w:type="dxa"/>
+            <w:tcMar>
+              <w:top w:w="75" w:type="dxa"/>
+              <w:bottom w:w="75" w:type="dxa"/>
+              <w:left w:w="75" w:type="dxa"/>
+              <w:right w:w="75" w:type="dxa"/>
+            </w:tcMar>
+          </w:tcPr>
+          <w:p>
+            <w:pPr>
+              <w:spacing w:before="0" w:after="0" w:line="260" w:lineRule="auto"/>
+            </w:pPr>
+            <w:r>
+              <w:rPr>
+                <w:rFonts w:ascii="Times New Roman" w:hAnsi="Times New Roman" w:cs="Times New Roman"/>
+                <w:sz w:val="19"/>
+                <w:color w:val="000000"/>
+              </w:rPr>
+              <w:t>Identificar registro</w:t>
+            </w:r>
+          </w:p>
+        </w:tc>
+        <w:tc>
+          <w:tcPr>
+            <w:tcW w:w="1100" w:type="dxa"/>
+            <w:tcMar>
+              <w:top w:w="75" w:type="dxa"/>
+              <w:bottom w:w="75" w:type="dxa"/>
+              <w:left w:w="75" w:type="dxa"/>
+              <w:right w:w="75" w:type="dxa"/>
+            </w:tcMar>
+          </w:tcPr>
+          <w:p>
+            <w:pPr>
+              <w:spacing w:before="0" w:after="0" w:line="260" w:lineRule="auto"/>
+            </w:pPr>
+            <w:r>
+              <w:rPr>
+                <w:rFonts w:ascii="Times New Roman" w:hAnsi="Times New Roman" w:cs="Times New Roman"/>
+                <w:sz w:val="19"/>
+                <w:color w:val="000000"/>
+              </w:rPr>
+              <w:t>Automático</w:t>
+            </w:r>
+          </w:p>
+        </w:tc>
+        <w:tc>
+          <w:tcPr>
+            <w:tcW w:w="1550" w:type="dxa"/>
+            <w:tcMar>
+              <w:top w:w="75" w:type="dxa"/>
+              <w:bottom w:w="75" w:type="dxa"/>
+              <w:left w:w="75" w:type="dxa"/>
+              <w:right w:w="75" w:type="dxa"/>
+            </w:tcMar>
+          </w:tcPr>
+          <w:p>
+            <w:pPr>
+              <w:spacing w:before="0" w:after="0" w:line="260" w:lineRule="auto"/>
+            </w:pPr>
+            <w:r>
+              <w:rPr>
+                <w:rFonts w:ascii="Times New Roman" w:hAnsi="Times New Roman" w:cs="Times New Roman"/>
+                <w:sz w:val="19"/>
+                <w:color w:val="000000"/>
+              </w:rPr>
+              <w:t>Metadato de la práctica</w:t>
+            </w:r>
+          </w:p>
+        </w:tc>
+        <w:tc>
+          <w:tcPr>
+            <w:tcW w:w="1250" w:type="dxa"/>
+            <w:tcMar>
+              <w:top w:w="75" w:type="dxa"/>
+              <w:bottom w:w="75" w:type="dxa"/>
+              <w:left w:w="75" w:type="dxa"/>
+              <w:right w:w="75" w:type="dxa"/>
+            </w:tcMar>
+          </w:tcPr>
+          <w:p>
+            <w:pPr>
+              <w:spacing w:before="0" w:after="0" w:line="260" w:lineRule="auto"/>
+            </w:pPr>
+            <w:r>
+              <w:rPr>
+                <w:rFonts w:ascii="Times New Roman" w:hAnsi="Times New Roman" w:cs="Times New Roman"/>
+                <w:sz w:val="19"/>
+                <w:color w:val="000000"/>
+              </w:rPr>
+              <w:t>Indefinida</w:t>
+            </w:r>
+          </w:p>
+        </w:tc>
+        <w:tc>
+          <w:tcPr>
+            <w:tcW w:w="1750" w:type="dxa"/>
+            <w:tcMar>
+              <w:top w:w="75" w:type="dxa"/>
+              <w:bottom w:w="75" w:type="dxa"/>
+              <w:left w:w="75" w:type="dxa"/>
+              <w:right w:w="75" w:type="dxa"/>
+            </w:tcMar>
+          </w:tcPr>
+          <w:p>
+            <w:pPr>
+              <w:spacing w:before="0" w:after="0" w:line="260" w:lineRule="auto"/>
+            </w:pPr>
+            <w:r>
+              <w:rPr>
+                <w:rFonts w:ascii="Times New Roman" w:hAnsi="Times New Roman" w:cs="Times New Roman"/>
+                <w:sz w:val="19"/>
+                <w:color w:val="000000"/>
+              </w:rPr>
+              <w:t>Cliente local y quien copie la BD</w:t>
+            </w:r>
+          </w:p>
+        </w:tc>
+        <w:tc>
+          <w:tcPr>
+            <w:tcW w:w="1680" w:type="dxa"/>
+            <w:tcMar>
+              <w:top w:w="75" w:type="dxa"/>
+              <w:bottom w:w="75" w:type="dxa"/>
+              <w:left w:w="75" w:type="dxa"/>
+              <w:right w:w="75" w:type="dxa"/>
+            </w:tcMar>
+          </w:tcPr>
+          <w:p>
+            <w:pPr>
+              <w:spacing w:before="0" w:after="0" w:line="260" w:lineRule="auto"/>
+            </w:pPr>
+            <w:r>
+              <w:rPr>
+                <w:rFonts w:ascii="Times New Roman" w:hAnsi="Times New Roman" w:cs="Times New Roman"/>
+                <w:sz w:val="19"/>
+                <w:color w:val="000000"/>
+              </w:rPr>
+              <w:t>Sí, para localizarlo</w:t>
+            </w:r>
+          </w:p>
+        </w:tc>
+      </w:tr>
+      <w:tr>
+        <w:trPr>
+          <w:cantSplit/>
+        </w:trPr>
+        <w:tc>
+          <w:tcPr>
+            <w:tcW w:w="1000" w:type="dxa"/>
+            <w:tcMar>
+              <w:top w:w="75" w:type="dxa"/>
+              <w:bottom w:w="75" w:type="dxa"/>
+              <w:left w:w="75" w:type="dxa"/>
+              <w:right w:w="75" w:type="dxa"/>
+            </w:tcMar>
+          </w:tcPr>
+          <w:p>
+            <w:pPr>
+              <w:spacing w:before="0" w:after="0" w:line="260" w:lineRule="auto"/>
+            </w:pPr>
+            <w:r>
+              <w:rPr>
+                <w:rFonts w:ascii="Times New Roman" w:hAnsi="Times New Roman" w:cs="Times New Roman"/>
+                <w:sz w:val="19"/>
+                <w:color w:val="000000"/>
+              </w:rPr>
+              <w:t>creado_en</w:t>
+            </w:r>
+          </w:p>
+        </w:tc>
+        <w:tc>
+          <w:tcPr>
+            <w:tcW w:w="1450" w:type="dxa"/>
+            <w:tcMar>
+              <w:top w:w="75" w:type="dxa"/>
+              <w:bottom w:w="75" w:type="dxa"/>
+              <w:left w:w="75" w:type="dxa"/>
+              <w:right w:w="75" w:type="dxa"/>
+            </w:tcMar>
+          </w:tcPr>
+          <w:p>
+            <w:pPr>
+              <w:spacing w:before="0" w:after="0" w:line="260" w:lineRule="auto"/>
+            </w:pPr>
+            <w:r>
+              <w:rPr>
+                <w:rFonts w:ascii="Times New Roman" w:hAnsi="Times New Roman" w:cs="Times New Roman"/>
+                <w:sz w:val="19"/>
+                <w:color w:val="000000"/>
+              </w:rPr>
+              <w:t>Fechar el alta</w:t>
+            </w:r>
+          </w:p>
+        </w:tc>
+        <w:tc>
+          <w:tcPr>
+            <w:tcW w:w="1100" w:type="dxa"/>
+            <w:tcMar>
+              <w:top w:w="75" w:type="dxa"/>
+              <w:bottom w:w="75" w:type="dxa"/>
+              <w:left w:w="75" w:type="dxa"/>
+              <w:right w:w="75" w:type="dxa"/>
+            </w:tcMar>
+          </w:tcPr>
+          <w:p>
+            <w:pPr>
+              <w:spacing w:before="0" w:after="0" w:line="260" w:lineRule="auto"/>
+            </w:pPr>
+            <w:r>
+              <w:rPr>
+                <w:rFonts w:ascii="Times New Roman" w:hAnsi="Times New Roman" w:cs="Times New Roman"/>
+                <w:sz w:val="19"/>
+                <w:color w:val="000000"/>
+              </w:rPr>
+              <w:t>Automático</w:t>
+            </w:r>
+          </w:p>
+        </w:tc>
+        <w:tc>
+          <w:tcPr>
+            <w:tcW w:w="1550" w:type="dxa"/>
+            <w:tcMar>
+              <w:top w:w="75" w:type="dxa"/>
+              <w:bottom w:w="75" w:type="dxa"/>
+              <w:left w:w="75" w:type="dxa"/>
+              <w:right w:w="75" w:type="dxa"/>
+            </w:tcMar>
+          </w:tcPr>
+          <w:p>
+            <w:pPr>
+              <w:spacing w:before="0" w:after="0" w:line="260" w:lineRule="auto"/>
+            </w:pPr>
+            <w:r>
+              <w:rPr>
+                <w:rFonts w:ascii="Times New Roman" w:hAnsi="Times New Roman" w:cs="Times New Roman"/>
+                <w:sz w:val="19"/>
+                <w:color w:val="000000"/>
+              </w:rPr>
+              <w:t>Metadato de la práctica</w:t>
+            </w:r>
+          </w:p>
+        </w:tc>
+        <w:tc>
+          <w:tcPr>
+            <w:tcW w:w="1250" w:type="dxa"/>
+            <w:tcMar>
+              <w:top w:w="75" w:type="dxa"/>
+              <w:bottom w:w="75" w:type="dxa"/>
+              <w:left w:w="75" w:type="dxa"/>
+              <w:right w:w="75" w:type="dxa"/>
+            </w:tcMar>
+          </w:tcPr>
+          <w:p>
+            <w:pPr>
+              <w:spacing w:before="0" w:after="0" w:line="260" w:lineRule="auto"/>
+            </w:pPr>
+            <w:r>
+              <w:rPr>
+                <w:rFonts w:ascii="Times New Roman" w:hAnsi="Times New Roman" w:cs="Times New Roman"/>
+                <w:sz w:val="19"/>
+                <w:color w:val="000000"/>
+              </w:rPr>
+              <w:t>Indefinida</w:t>
+            </w:r>
+          </w:p>
+        </w:tc>
+        <w:tc>
+          <w:tcPr>
+            <w:tcW w:w="1750" w:type="dxa"/>
+            <w:tcMar>
+              <w:top w:w="75" w:type="dxa"/>
+              <w:bottom w:w="75" w:type="dxa"/>
+              <w:left w:w="75" w:type="dxa"/>
+              <w:right w:w="75" w:type="dxa"/>
+            </w:tcMar>
+          </w:tcPr>
+          <w:p>
+            <w:pPr>
+              <w:spacing w:before="0" w:after="0" w:line="260" w:lineRule="auto"/>
+            </w:pPr>
+            <w:r>
+              <w:rPr>
+                <w:rFonts w:ascii="Times New Roman" w:hAnsi="Times New Roman" w:cs="Times New Roman"/>
+                <w:sz w:val="19"/>
+                <w:color w:val="000000"/>
+              </w:rPr>
+              <w:t>Cliente local y quien copie la BD</w:t>
+            </w:r>
+          </w:p>
+        </w:tc>
+        <w:tc>
+          <w:tcPr>
+            <w:tcW w:w="1680" w:type="dxa"/>
+            <w:tcMar>
+              <w:top w:w="75" w:type="dxa"/>
+              <w:bottom w:w="75" w:type="dxa"/>
+              <w:left w:w="75" w:type="dxa"/>
+              <w:right w:w="75" w:type="dxa"/>
+            </w:tcMar>
+          </w:tcPr>
+          <w:p>
+            <w:pPr>
+              <w:spacing w:before="0" w:after="0" w:line="260" w:lineRule="auto"/>
+            </w:pPr>
+            <w:r>
+              <w:rPr>
+                <w:rFonts w:ascii="Times New Roman" w:hAnsi="Times New Roman" w:cs="Times New Roman"/>
+                <w:sz w:val="19"/>
+                <w:color w:val="000000"/>
+              </w:rPr>
+              <w:t>Sí, para definir plazo</w:t>
             </w:r>
           </w:p>
         </w:tc>
@@ -802,7 +1636,7 @@
           <w:sz w:val="21"/>
           <w:color w:val="000000"/>
         </w:rPr>
-        <w:t>Probabilidad y gravedad: 1 a 3. Producto: bajo de 1 a 3, medio de 4 a 6 y alto de 7 a 9. Step 5 describe el sistema actual. Step 6 estima el resultado esperado únicamente después de aplicar las restricciones por escrito. El riesgo R2 seguiría siendo medio por la posibilidad de comprometer el equipo o la clave.</w:t>
+        <w:t>Probabilidad e impacto se puntúan de 1 a 3. El número entre paréntesis es su producto; el nivel se asigna con la matriz de la diapositiva 25: media × alto y alta × medio son altos; baja × alto es medio. El paso 5 describe el riesgo actual y el paso 6, el residual previsto. R1 y R2 quedan en medio por su impacto potencial.</w:t>
       </w:r>
     </w:p>
     <w:p>
@@ -1104,7 +1938,17 @@
                 <w:rFonts w:ascii="Verdana" w:hAnsi="Verdana"/>
                 <w:lang w:val="en-US"/>
               </w:rPr>
-            </w:pPr>
+              <w:spacing w:after="0"/>
+              <w:keepNext w:val="0"/>
+              <w:keepLines w:val="1"/>
+            </w:pPr>
+            <w:r>
+              <w:rPr>
+                <w:rFonts w:ascii="Verdana" w:hAnsi="Verdana"/>
+                <w:lang w:val="en-US"/>
+              </w:rPr>
+              <w:t>Ronal Condor Blas</w:t>
+            </w:r>
           </w:p>
         </w:tc>
       </w:tr>
@@ -1295,7 +2139,7 @@
                 <w:rFonts w:ascii="Verdana" w:hAnsi="Verdana"/>
                 <w:lang w:val="en-US"/>
               </w:rPr>
-              <w:t>This DPIA assesses the local Flask and SQLite backend in laboratorio-minimo, based on slides 20 and 21 of the DS3031 Laboratory 11 presentation. POST /registro stores first name, last name, email and optional telephone; GET /registros returns every record without authentication. SQL uses bound parameters, as required by the exercise.</w:t>
+              <w:t>Esta evaluación analiza el backend local de Flask y SQLite de laboratorio-minimo, basado en las diapositivas 20 y 21 de DS3031. POST /registro guarda nombres, apellidos, correo y teléfono opcional; GET /registros entrega todos los registros sin autenticación. La inserción utiliza SQL parametrizado.</w:t>
             </w:r>
           </w:p>
           <w:p>
@@ -1313,25 +2157,25 @@
                 <w:rFonts w:ascii="Verdana" w:hAnsi="Verdana"/>
                 <w:lang w:val="en-US"/>
               </w:rPr>
-              <w:t>The laboratory asks students to identify privacy problems in the working backend and specify restrictions on paper. Those proposed restrictions are not implemented in this version. The optional Next.js application on Vercel is a separate, improved demonstration and is not the system assessed here.</w:t>
-            </w:r>
-          </w:p>
-          <w:p>
-            <w:pPr>
-              <w:rPr>
-                <w:rFonts w:ascii="Verdana" w:hAnsi="Verdana"/>
-                <w:lang w:val="en-US"/>
-              </w:rPr>
-              <w:spacing w:after="0"/>
-              <w:keepNext w:val="0"/>
-              <w:keepLines w:val="1"/>
-            </w:pPr>
-            <w:r>
-              <w:rPr>
-                <w:rFonts w:ascii="Verdana" w:hAnsi="Verdana"/>
-                <w:lang w:val="en-US"/>
-              </w:rPr>
-              <w:t>Four invented people are used for observation. Ratings describe potential harm if real contacts were entered into the unchanged backend. Expected residual scores assume implementation of C01-C08; these protections are not present. Decision: launch with conditions only after implementation and verification. The current backend remains a local exercise with invented data.</w:t>
+              <w:t>El objetivo del laboratorio es identificar brechas del backend y formular restricciones de diseño por escrito. C01–C08 son propuestas y no están implementadas. La aplicación Next.js publicada en Vercel es una demostración complementaria; sus controles no se atribuyen al sistema evaluado.</w:t>
+            </w:r>
+          </w:p>
+          <w:p>
+            <w:pPr>
+              <w:rPr>
+                <w:rFonts w:ascii="Verdana" w:hAnsi="Verdana"/>
+                <w:lang w:val="en-US"/>
+              </w:rPr>
+              <w:spacing w:after="0"/>
+              <w:keepNext w:val="0"/>
+              <w:keepLines w:val="1"/>
+            </w:pPr>
+            <w:r>
+              <w:rPr>
+                <w:rFonts w:ascii="Verdana" w:hAnsi="Verdana"/>
+                <w:lang w:val="en-US"/>
+              </w:rPr>
+              <w:t>Se observan cuatro personas inventadas. Los riesgos expresan el daño potencial si se introdujeran contactos reales en este backend. El riesgo residual estima el resultado de aplicar las restricciones en papel. La decisión es un lanzamiento condicionado a implementarlas y verificarlas antes del primer dato real.</w:t>
             </w:r>
           </w:p>
         </w:tc>
@@ -1483,7 +2327,7 @@
                 <w:rFonts w:ascii="Verdana" w:hAnsi="Verdana"/>
                 <w:lang w:val="en-US"/>
               </w:rPr>
-              <w:t>Collection: a local client sends JSON to POST /registro. The API checks that the three required keys exist, then inserts their values and optional telephone. It does not validate email format, reject duplicate email addresses, verify identity or record consent. Telephone is optional in both the API and database.</w:t>
+              <w:t>Recolección: un cliente local envía JSON a POST /registro. La API exige las claves nombres, apellidos y correo, y acepta teléfono opcional. No valida el formato ni la unicidad del correo, no verifica identidad y no registra consentimiento.</w:t>
             </w:r>
           </w:p>
           <w:p>
@@ -1501,7 +2345,7 @@
                 <w:rFonts w:ascii="Verdana" w:hAnsi="Verdana"/>
                 <w:lang w:val="en-US"/>
               </w:rPr>
-              <w:t>Storage and use: SQLite stores id, nombres, apellidos, correo, telefono and creado_en in lab.db. Names and contact details remain readable in the file. GET /registros returns all columns for all records to any client able to reach the service. There are no accounts, roles or ownership filters.</w:t>
+              <w:t>Almacenamiento y consulta: lab.db contiene id, nombres, apellidos, correo, telefono y creado_en. Los valores son legibles en SQLite. GET /registros devuelve todas las columnas y filas a cualquier cliente que alcance el servicio, sin cuentas, roles ni filtros por titular.</w:t>
             </w:r>
           </w:p>
           <w:p>
@@ -1519,25 +2363,25 @@
                 <w:rFonts w:ascii="Verdana" w:hAnsi="Verdana"/>
                 <w:lang w:val="en-US"/>
               </w:rPr>
-              <w:t>Retention and control: records remain stored without an automatic deletion rule. The API has no correction, deletion or export route. There is no dedicated access-audit trail, consent history or complete privacy notice. Ordinary server request output is not a dedicated accountability record.</w:t>
-            </w:r>
-          </w:p>
-          <w:p>
-            <w:pPr>
-              <w:rPr>
-                <w:rFonts w:ascii="Verdana" w:hAnsi="Verdana"/>
-                <w:lang w:val="en-US"/>
-              </w:rPr>
-              <w:spacing w:after="0"/>
-              <w:keepNext w:val="0"/>
-              <w:keepLines w:val="1"/>
-            </w:pPr>
-            <w:r>
-              <w:rPr>
-                <w:rFonts w:ascii="Verdana" w:hAnsi="Verdana"/>
-                <w:lang w:val="en-US"/>
-              </w:rPr>
-              <w:t>The supplied launcher binds to 127.0.0.1:5111 with debug disabled. Only invented values are used, and lab.db is excluded from Git. No cloud provider, analytics service, messaging service or external recipient is part of this baseline. SQL parameterisation is implemented; SQL injection is not listed as an identified vulnerability.</w:t>
+              <w:t>Conservación y control: no existe vencimiento automático ni rutas de corrección, eliminación o exportación. Tampoco hay aviso completo, historial de consentimiento, auditoría dedicada de accesos o procedimiento de incidentes. La salida ordinaria del servidor no sustituye una auditoría.</w:t>
+            </w:r>
+          </w:p>
+          <w:p>
+            <w:pPr>
+              <w:rPr>
+                <w:rFonts w:ascii="Verdana" w:hAnsi="Verdana"/>
+                <w:lang w:val="en-US"/>
+              </w:rPr>
+              <w:spacing w:after="0"/>
+              <w:keepNext w:val="0"/>
+              <w:keepLines w:val="1"/>
+            </w:pPr>
+            <w:r>
+              <w:rPr>
+                <w:rFonts w:ascii="Verdana" w:hAnsi="Verdana"/>
+                <w:lang w:val="en-US"/>
+              </w:rPr>
+              <w:t>El servidor escucha en 127.0.0.1:5111, sin depuración. Se utilizan datos inventados y lab.db se excluye de Git. Este backend no envía datos a proveedores externos. La inserción parametrizada funciona: la inyección SQL no se presenta como una vulnerabilidad detectada.</w:t>
             </w:r>
           </w:p>
         </w:tc>
@@ -1625,7 +2469,7 @@
                 <w:rFonts w:ascii="Verdana" w:hAnsi="Verdana"/>
                 <w:lang w:val="en-US"/>
               </w:rPr>
-              <w:t>The main observation creates four invented persons, including one without telephone. Additional disposable records test duplicate email, malformed email and literal handling of SQL-like text. verificar.py uses a temporary database and removes it afterwards. The schema does not impose an application-level population cap or expiry date.</w:t>
+              <w:t>La observación inicial registra cuatro personas inventadas, una sin teléfono. Otras tres entradas temporales prueban correo duplicado, formato inválido y una cadena similar a SQL. verificar.py elimina su base temporal al terminar. La aplicación no fija un máximo de personas ni un plazo de conservación.</w:t>
             </w:r>
           </w:p>
           <w:p>
@@ -1643,7 +2487,7 @@
                 <w:rFonts w:ascii="Verdana" w:hAnsi="Verdana"/>
                 <w:lang w:val="en-US"/>
               </w:rPr>
-              <w:t>Inventory: nombres and apellidos are required and distinguish entries in the exercise; correo is required and demonstrates contact-data storage, although no messages are sent. telefono is optional and has no demonstrated operational need. id and creado_en are generated automatically to identify and timestamp records. No sensitive categories, files, location or identity documents are requested.</w:t>
+              <w:t>El inventario inicial detalla cada campo, finalidad, obligatoriedad, base, retención, acceso y necesidad. Nombres, apellidos y correo son obligatorios en el ejercicio; teléfono es opcional y carece de necesidad demostrada. id y creado_en se generan automáticamente. No se solicitan datos sensibles, archivos, ubicación ni documentos de identidad.</w:t>
             </w:r>
           </w:p>
           <w:p>
@@ -1661,25 +2505,25 @@
                 <w:rFonts w:ascii="Verdana" w:hAnsi="Verdana"/>
                 <w:lang w:val="en-US"/>
               </w:rPr>
-              <w:t>For every field, current retention is indefinite and access is available through the unfiltered GET endpoint and to anyone with a copy of the SQLite file. The proposed inventory in the introduction distinguishes necessity and a future basis for processing from present behaviour. A lawful basis for collecting real contacts has not been established by this academic exercise.</w:t>
-            </w:r>
-          </w:p>
-          <w:p>
-            <w:pPr>
-              <w:rPr>
-                <w:rFonts w:ascii="Verdana" w:hAnsi="Verdana"/>
-                <w:lang w:val="en-US"/>
-              </w:rPr>
-              <w:spacing w:after="0"/>
-              <w:keepNext w:val="0"/>
-              <w:keepLines w:val="1"/>
-            </w:pPr>
-            <w:r>
-              <w:rPr>
-                <w:rFonts w:ascii="Verdana" w:hAnsi="Verdana"/>
-                <w:lang w:val="en-US"/>
-              </w:rPr>
-              <w:t>The processing is local on one development computer in Peru. This DPIA does not assess the separate Vercel and Neon demonstration. Changing the baseline to public hosting, real users, additional recipients or sensitive information requires a fresh scope and risk review.</w:t>
+              <w:t>Todos los campos se conservan indefinidamente y se exponen mediante el listado completo o una copia de SQLite. El propósito académico utiliza información ficticia; no se ha establecido una base que autorice recolectar contactos reales. El plazo de 30 días es una propuesta de diseño, no una obligación legal acreditada.</w:t>
+            </w:r>
+          </w:p>
+          <w:p>
+            <w:pPr>
+              <w:rPr>
+                <w:rFonts w:ascii="Verdana" w:hAnsi="Verdana"/>
+                <w:lang w:val="en-US"/>
+              </w:rPr>
+              <w:spacing w:after="0"/>
+              <w:keepNext w:val="0"/>
+              <w:keepLines w:val="1"/>
+            </w:pPr>
+            <w:r>
+              <w:rPr>
+                <w:rFonts w:ascii="Verdana" w:hAnsi="Verdana"/>
+                <w:lang w:val="en-US"/>
+              </w:rPr>
+              <w:t>El tratamiento se ejecuta localmente en un equipo de desarrollo en Perú. La demostración Vercel/Neon queda fuera del alcance. Un cambio a usuarios reales, publicación en Internet, datos sensibles o nuevos destinatarios exigiría revisar esta evaluación.</w:t>
             </w:r>
           </w:p>
         </w:tc>
@@ -1817,7 +2661,7 @@
                 <w:rFonts w:ascii="Verdana" w:hAnsi="Verdana"/>
                 <w:lang w:val="en-US"/>
               </w:rPr>
-              <w:t>The context is an individual academic exercise with invented contacts, not an operational student directory. The same fields would identify and link real individuals if real information were entered. Intended live users have not been recruited and their expectations have not been established.</w:t>
+              <w:t>Es una práctica académica individual con contactos inventados. No administra un directorio real de estudiantes ni está dirigida a menores o personas vulnerables. Los mismos campos permitirían identificar y vincular personas si se introdujeran datos reales.</w:t>
             </w:r>
           </w:p>
           <w:p>
@@ -1835,25 +2679,25 @@
                 <w:rFonts w:ascii="Verdana" w:hAnsi="Verdana"/>
                 <w:lang w:val="en-US"/>
               </w:rPr>
-              <w:t>A second anonymous test client can read the first client's records, including email and unmasked telephone. People would have no API mechanism to correct or delete an entry, and the system could not distinguish the data subject from another requester. Names and addresses could be entered for someone else.</w:t>
-            </w:r>
-          </w:p>
-          <w:p>
-            <w:pPr>
-              <w:rPr>
-                <w:rFonts w:ascii="Verdana" w:hAnsi="Verdana"/>
-                <w:lang w:val="en-US"/>
-              </w:rPr>
-              <w:spacing w:after="0"/>
-              <w:keepNext w:val="0"/>
-              <w:keepLines w:val="1"/>
-            </w:pPr>
-            <w:r>
-              <w:rPr>
-                <w:rFonts w:ascii="Verdana" w:hAnsi="Verdana"/>
-                <w:lang w:val="en-US"/>
-              </w:rPr>
-              <w:t>Flask and SQLite are conventional technologies. No profiling or automated decisions are performed. The main concerns are disclosure, unnecessary contact collection, lack of transparency, indefinite retention and lack of effective individual control. No certification, approved code membership or legal compliance conclusion is claimed.</w:t>
+              <w:t>Un segundo cliente anónimo puede leer los registros del primero, incluidos correo y teléfono sin ocultar. No hay un mecanismo para distinguir al titular de otro solicitante ni para corregir o eliminar una entrada. También se pueden atribuir datos a otra persona.</w:t>
+            </w:r>
+          </w:p>
+          <w:p>
+            <w:pPr>
+              <w:rPr>
+                <w:rFonts w:ascii="Verdana" w:hAnsi="Verdana"/>
+                <w:lang w:val="en-US"/>
+              </w:rPr>
+              <w:spacing w:after="0"/>
+              <w:keepNext w:val="0"/>
+              <w:keepLines w:val="1"/>
+            </w:pPr>
+            <w:r>
+              <w:rPr>
+                <w:rFonts w:ascii="Verdana" w:hAnsi="Verdana"/>
+                <w:lang w:val="en-US"/>
+              </w:rPr>
+              <w:t>Flask y SQLite son tecnologías convencionales. No se realizan perfiles ni decisiones automatizadas. Las preocupaciones principales son divulgación, recopilación innecesaria, falta de información, conservación indefinida y ausencia de control individual. No se afirma certificación ni cumplimiento jurídico.</w:t>
             </w:r>
           </w:p>
         </w:tc>
@@ -1941,7 +2785,7 @@
                 <w:rFonts w:ascii="Verdana" w:hAnsi="Verdana"/>
                 <w:lang w:val="en-US"/>
               </w:rPr>
-              <w:t>The purpose is to demonstrate collection, persistence and listing of a small contact register, then assess its actual privacy weaknesses. The expected educational outcome is a coherent inventory, at least five concrete risks, verifiable restrictions and a justified decision after reassessing risk on paper.</w:t>
+              <w:t>La finalidad es demostrar el registro, almacenamiento y listado de contactos y evaluar sus brechas de privacidad. El resultado es un inventario justificado, ocho riesgos concretos, restricciones comprobables y una decisión coherente con la valoración residual en papel.</w:t>
             </w:r>
           </w:p>
           <w:p>
@@ -1959,25 +2803,25 @@
                 <w:rFonts w:ascii="Verdana" w:hAnsi="Verdana"/>
                 <w:lang w:val="en-US"/>
               </w:rPr>
-              <w:t>A database-backed example is needed to observe persistence and cross-client disclosure. First name, surname and email reproduce the minimum exercise fields. Telephone is included as the optional fourth field so its necessity can be questioned; collecting it is not justified by a messaging or operational contact purpose.</w:t>
-            </w:r>
-          </w:p>
-          <w:p>
-            <w:pPr>
-              <w:rPr>
-                <w:rFonts w:ascii="Verdana" w:hAnsi="Verdana"/>
-                <w:lang w:val="en-US"/>
-              </w:rPr>
-              <w:spacing w:after="0"/>
-              <w:keepNext w:val="0"/>
-              <w:keepLines w:val="1"/>
-            </w:pPr>
-            <w:r>
-              <w:rPr>
-                <w:rFonts w:ascii="Verdana" w:hAnsi="Verdana"/>
-                <w:lang w:val="en-US"/>
-              </w:rPr>
-              <w:t>There is no advertising, sale of data, communication campaign or secondary-use objective. A non-persistent screen would not expose the storage and access problems being studied. For any real service, a specific purpose and appropriate basis must be established before data collection.</w:t>
+              <w:t>La persistencia permite observar qué queda guardado y qué obtiene otro cliente. Nombres, apellidos y correo reproducen los campos mínimos del ejercicio. El teléfono permite examinar una recopilación opcional que no resulta necesaria para el funcionamiento demostrado.</w:t>
+            </w:r>
+          </w:p>
+          <w:p>
+            <w:pPr>
+              <w:rPr>
+                <w:rFonts w:ascii="Verdana" w:hAnsi="Verdana"/>
+                <w:lang w:val="en-US"/>
+              </w:rPr>
+              <w:spacing w:after="0"/>
+              <w:keepNext w:val="0"/>
+              <w:keepLines w:val="1"/>
+            </w:pPr>
+            <w:r>
+              <w:rPr>
+                <w:rFonts w:ascii="Verdana" w:hAnsi="Verdana"/>
+                <w:lang w:val="en-US"/>
+              </w:rPr>
+              <w:t>No hay publicidad, venta, envío de mensajes ni usos secundarios. Una pantalla sin almacenamiento no permitiría observar estas brechas. Un servicio real necesitaría justificar su finalidad y base antes de recolectar información.</w:t>
             </w:r>
           </w:p>
         </w:tc>
@@ -2155,25 +2999,25 @@
                 <w:rFonts w:ascii="Verdana" w:hAnsi="Verdana"/>
                 <w:lang w:val="en-US"/>
               </w:rPr>
-              <w:t>The baseline demonstrates persistence using invented records; it establishes no basis for real-contact collection. Telephone is unnecessary. C03 would remove it. C04 would document each purpose and basis, provide a complete notice and record consent only where appropriate.</w:t>
-            </w:r>
-          </w:p>
-          <w:p>
-            <w:pPr>
-              <w:rPr>
-                <w:rFonts w:ascii="Verdana" w:hAnsi="Verdana"/>
-                <w:lang w:val="en-US"/>
-              </w:rPr>
-              <w:spacing w:after="0"/>
-              <w:keepNext w:val="0"/>
-              <w:keepLines w:val="1"/>
-            </w:pPr>
-            <w:r>
-              <w:rPr>
-                <w:rFonts w:ascii="Verdana" w:hAnsi="Verdana"/>
-                <w:lang w:val="en-US"/>
-              </w:rPr>
-              <w:t>C01-C02 would restrict access and encrypt contacts; C05 would limit retention; C06 would enable authenticated individual rights; C07 would validate quality; C08 would provide audit and incident procedures. Step 6 defines tests and priorities. These are paper proposals, not implemented controls. Real-data launch requires verification and reassessment. There are no external processors or transfers in this local baseline.</w:t>
+              <w:t>La práctica demuestra persistencia con datos inventados. No establece una base para contactos reales. C03 propone eliminar el teléfono; C04, documentar cada finalidad y base, informar al titular y registrar consentimiento cuando corresponda. La necesidad de nombres y correo debe reconsiderarse para un servicio real.</w:t>
+            </w:r>
+          </w:p>
+          <w:p>
+            <w:pPr>
+              <w:rPr>
+                <w:rFonts w:ascii="Verdana" w:hAnsi="Verdana"/>
+                <w:lang w:val="en-US"/>
+              </w:rPr>
+              <w:spacing w:after="0"/>
+              <w:keepNext w:val="0"/>
+              <w:keepLines w:val="1"/>
+            </w:pPr>
+            <w:r>
+              <w:rPr>
+                <w:rFonts w:ascii="Verdana" w:hAnsi="Verdana"/>
+                <w:lang w:val="en-US"/>
+              </w:rPr>
+              <w:t>C01–C02 limitarían el acceso y cifrarían contactos; C05 fijaría la conservación; C06 permitiría ejercer derechos; C07 validaría calidad; C08 establecería auditoría y respuesta a incidentes. El paso 6 define prioridad y pruebas. Son propuestas sin implementar. Este backend local no tiene encargados externos ni transferencias internacionales.</w:t>
             </w:r>
           </w:p>
         </w:tc>
@@ -2360,7 +3204,7 @@
                 <w:rFonts w:ascii="Verdana" w:hAnsi="Verdana"/>
                 <w:lang w:val="es-PE"/>
               </w:rPr>
-              <w:t>R1 Any reachable client can list all names and contacts through GET /registros, enabling unwanted contact or impersonation.</w:t>
+              <w:t>R1 El listado completo expone nombres y contactos a cualquier cliente del servicio; puede facilitar contacto no deseado o suplantación. Divulgación.</w:t>
             </w:r>
           </w:p>
         </w:tc>
@@ -2385,7 +3229,7 @@
                 <w:sz w:val="22"/>
                 <w:lang w:val="en-US"/>
               </w:rPr>
-              <w:t>Probable (3)</w:t>
+              <w:t>Alta (3)</w:t>
             </w:r>
           </w:p>
         </w:tc>
@@ -2410,7 +3254,7 @@
                 <w:sz w:val="22"/>
                 <w:lang w:val="en-US"/>
               </w:rPr>
-              <w:t>Severe (3)</w:t>
+              <w:t>Alto (3)</w:t>
             </w:r>
           </w:p>
         </w:tc>
@@ -2435,7 +3279,7 @@
                 <w:sz w:val="22"/>
                 <w:lang w:val="en-US"/>
               </w:rPr>
-              <w:t>High (9)</w:t>
+              <w:t>Alto (9)</w:t>
             </w:r>
           </w:p>
         </w:tc>
@@ -2463,7 +3307,7 @@
                 <w:rFonts w:ascii="Verdana" w:hAnsi="Verdana"/>
                 <w:lang w:val="es-PE"/>
               </w:rPr>
-              <w:t>R2 A copied lab.db reveals readable contact values without using the API. Disclosure.</w:t>
+              <w:t>R2 Una copia de lab.db revela contactos legibles sin pasar por la API; permite su reutilización no autorizada. Divulgación.</w:t>
             </w:r>
           </w:p>
         </w:tc>
@@ -2488,7 +3332,7 @@
                 <w:sz w:val="22"/>
                 <w:lang w:val="en-US"/>
               </w:rPr>
-              <w:t>Possible (2)</w:t>
+              <w:t>Media (2)</w:t>
             </w:r>
           </w:p>
         </w:tc>
@@ -2513,7 +3357,7 @@
                 <w:sz w:val="22"/>
                 <w:lang w:val="en-US"/>
               </w:rPr>
-              <w:t>Severe (3)</w:t>
+              <w:t>Alto (3)</w:t>
             </w:r>
           </w:p>
         </w:tc>
@@ -2538,7 +3382,7 @@
                 <w:sz w:val="22"/>
                 <w:lang w:val="en-US"/>
               </w:rPr>
-              <w:t>Medium (6)</w:t>
+              <w:t>Alto (6)</w:t>
             </w:r>
           </w:p>
         </w:tc>
@@ -2566,7 +3410,7 @@
                 <w:rFonts w:ascii="Verdana" w:hAnsi="Verdana"/>
                 <w:lang w:val="es-PE"/>
               </w:rPr>
-              <w:t>R3 Optional telephone is collected and exposed without a demonstrated need. Non-compliance and linkability.</w:t>
+              <w:t>R3 Se recopila y expone teléfono opcional sin necesidad demostrada, aumentando la información vinculable a una persona. Incumplimiento y vinculación.</w:t>
             </w:r>
           </w:p>
         </w:tc>
@@ -2591,7 +3435,7 @@
                 <w:sz w:val="22"/>
                 <w:lang w:val="en-US"/>
               </w:rPr>
-              <w:t>Probable (3)</w:t>
+              <w:t>Alta (3)</w:t>
             </w:r>
           </w:p>
         </w:tc>
@@ -2616,7 +3460,7 @@
                 <w:sz w:val="22"/>
                 <w:lang w:val="en-US"/>
               </w:rPr>
-              <w:t>Significant (2)</w:t>
+              <w:t>Medio (2)</w:t>
             </w:r>
           </w:p>
         </w:tc>
@@ -2641,7 +3485,7 @@
                 <w:sz w:val="22"/>
                 <w:lang w:val="en-US"/>
               </w:rPr>
-              <w:t>Medium (6)</w:t>
+              <w:t>Alto (6)</w:t>
             </w:r>
           </w:p>
         </w:tc>
@@ -2669,7 +3513,7 @@
                 <w:rFonts w:ascii="Verdana" w:hAnsi="Verdana"/>
                 <w:lang w:val="es-PE"/>
               </w:rPr>
-              <w:t>R4 No complete privacy notice or documented basis informs individuals about use, access and retention. Unawareness.</w:t>
+              <w:t>R4 La ausencia de aviso completo y base documentada impide conocer finalidad, acceso y conservación. Falta de conocimiento.</w:t>
             </w:r>
           </w:p>
         </w:tc>
@@ -2694,7 +3538,7 @@
                 <w:sz w:val="22"/>
                 <w:lang w:val="en-US"/>
               </w:rPr>
-              <w:t>Probable (3)</w:t>
+              <w:t>Alta (3)</w:t>
             </w:r>
           </w:p>
         </w:tc>
@@ -2719,7 +3563,7 @@
                 <w:sz w:val="22"/>
                 <w:lang w:val="en-US"/>
               </w:rPr>
-              <w:t>Significant (2)</w:t>
+              <w:t>Medio (2)</w:t>
             </w:r>
           </w:p>
         </w:tc>
@@ -2744,7 +3588,7 @@
                 <w:sz w:val="22"/>
                 <w:lang w:val="en-US"/>
               </w:rPr>
-              <w:t>Medium (6)</w:t>
+              <w:t>Alto (6)</w:t>
             </w:r>
           </w:p>
         </w:tc>
@@ -2772,7 +3616,7 @@
                 <w:rFonts w:ascii="Verdana" w:hAnsi="Verdana"/>
                 <w:lang w:val="es-PE"/>
               </w:rPr>
-              <w:t>R5 Records remain stored indefinitely because no expiry rule or deletion job exists. Non-compliance.</w:t>
+              <w:t>R5 No hay plazo ni borrado automático; los contactos siguen expuestos después de terminar su finalidad. Incumplimiento.</w:t>
             </w:r>
           </w:p>
         </w:tc>
@@ -2797,7 +3641,7 @@
                 <w:sz w:val="22"/>
                 <w:lang w:val="en-US"/>
               </w:rPr>
-              <w:t>Probable (3)</w:t>
+              <w:t>Alta (3)</w:t>
             </w:r>
           </w:p>
         </w:tc>
@@ -2822,7 +3666,7 @@
                 <w:sz w:val="22"/>
                 <w:lang w:val="en-US"/>
               </w:rPr>
-              <w:t>Significant (2)</w:t>
+              <w:t>Medio (2)</w:t>
             </w:r>
           </w:p>
         </w:tc>
@@ -2847,7 +3691,7 @@
                 <w:sz w:val="22"/>
                 <w:lang w:val="en-US"/>
               </w:rPr>
-              <w:t>Medium (6)</w:t>
+              <w:t>Alto (6)</w:t>
             </w:r>
           </w:p>
         </w:tc>
@@ -2875,7 +3719,7 @@
                 <w:rFonts w:ascii="Verdana" w:hAnsi="Verdana"/>
                 <w:lang w:val="es-PE"/>
               </w:rPr>
-              <w:t>R6 Individuals cannot authenticate to access, correct, delete or export their own information. Non-compliance.</w:t>
+              <w:t>R6 El titular no puede autenticarse para consultar, corregir, eliminar o exportar sus datos. Incumplimiento.</w:t>
             </w:r>
           </w:p>
         </w:tc>
@@ -2900,7 +3744,7 @@
                 <w:sz w:val="22"/>
                 <w:lang w:val="en-US"/>
               </w:rPr>
-              <w:t>Probable (3)</w:t>
+              <w:t>Alta (3)</w:t>
             </w:r>
           </w:p>
         </w:tc>
@@ -2925,7 +3769,7 @@
                 <w:sz w:val="22"/>
                 <w:lang w:val="en-US"/>
               </w:rPr>
-              <w:t>Significant (2)</w:t>
+              <w:t>Medio (2)</w:t>
             </w:r>
           </w:p>
         </w:tc>
@@ -2950,7 +3794,7 @@
                 <w:sz w:val="22"/>
                 <w:lang w:val="en-US"/>
               </w:rPr>
-              <w:t>Medium (6)</w:t>
+              <w:t>Alto (6)</w:t>
             </w:r>
           </w:p>
         </w:tc>
@@ -2978,7 +3822,7 @@
                 <w:rFonts w:ascii="Verdana" w:hAnsi="Verdana"/>
                 <w:lang w:val="es-PE"/>
               </w:rPr>
-              <w:t>R7 Duplicate and malformed email values are accepted; inaccurate details may be attributed to another person.</w:t>
+              <w:t>R7 Se admiten correos repetidos o inválidos; una entrada puede atribuir información incorrecta a otra persona. Incumplimiento.</w:t>
             </w:r>
           </w:p>
         </w:tc>
@@ -3003,7 +3847,7 @@
                 <w:sz w:val="22"/>
                 <w:lang w:val="en-US"/>
               </w:rPr>
-              <w:t>Possible (2)</w:t>
+              <w:t>Media (2)</w:t>
             </w:r>
           </w:p>
         </w:tc>
@@ -3028,7 +3872,7 @@
                 <w:sz w:val="22"/>
                 <w:lang w:val="en-US"/>
               </w:rPr>
-              <w:t>Significant (2)</w:t>
+              <w:t>Medio (2)</w:t>
             </w:r>
           </w:p>
         </w:tc>
@@ -3053,7 +3897,7 @@
                 <w:sz w:val="22"/>
                 <w:lang w:val="en-US"/>
               </w:rPr>
-              <w:t>Medium (4)</w:t>
+              <w:t>Medio (4)</w:t>
             </w:r>
           </w:p>
         </w:tc>
@@ -3081,7 +3925,7 @@
                 <w:rFonts w:ascii="Verdana" w:hAnsi="Verdana"/>
                 <w:lang w:val="es-PE"/>
               </w:rPr>
-              <w:t>R8 Missing access-audit evidence and incident procedures can delay discovering and limiting a contact-data disclosure.</w:t>
+              <w:t>R8 Sin auditoría de accesos ni procedimiento de incidentes, una divulgación puede detectarse tarde y prolongar el daño. Divulgación.</w:t>
             </w:r>
           </w:p>
         </w:tc>
@@ -3106,7 +3950,7 @@
                 <w:sz w:val="22"/>
                 <w:lang w:val="en-US"/>
               </w:rPr>
-              <w:t>Possible (2)</w:t>
+              <w:t>Media (2)</w:t>
             </w:r>
           </w:p>
         </w:tc>
@@ -3131,7 +3975,7 @@
                 <w:sz w:val="22"/>
                 <w:lang w:val="en-US"/>
               </w:rPr>
-              <w:t>Significant (2)</w:t>
+              <w:t>Medio (2)</w:t>
             </w:r>
           </w:p>
         </w:tc>
@@ -3156,7 +4000,7 @@
                 <w:sz w:val="22"/>
                 <w:lang w:val="en-US"/>
               </w:rPr>
-              <w:t>Medium (4)</w:t>
+              <w:t>Medio (4)</w:t>
             </w:r>
           </w:p>
         </w:tc>
@@ -3428,7 +4272,7 @@
                 <w:rFonts w:ascii="Verdana" w:hAnsi="Verdana"/>
                 <w:lang w:val="en-US"/>
               </w:rPr>
-              <w:t>C01 API. Before real data: authenticate access, restrict global lists to administrators and mask contacts. Verify anonymous GET = 401, non-admin list = 403 and no other person's raw contacts.</w:t>
+              <w:t>C01 API. Antes del primer dato real: autenticar; limitar el listado global al administrador y ocultar contactos. Prueba: anónimo recibe 401; otro rol, 403; el listado no revela contactos completos.</w:t>
             </w:r>
           </w:p>
         </w:tc>
@@ -3451,7 +4295,7 @@
                 <w:rFonts w:ascii="Verdana" w:hAnsi="Verdana"/>
                 <w:lang w:val="en-US"/>
               </w:rPr>
-              <w:t>Expected reduction</w:t>
+              <w:t>Reducción prevista</w:t>
             </w:r>
           </w:p>
         </w:tc>
@@ -3474,9 +4318,9 @@
                 <w:rFonts w:ascii="Verdana" w:hAnsi="Verdana"/>
                 <w:lang w:val="en-US"/>
               </w:rPr>
-              <w:t>Low (3)</w:t>
+              <w:t>Medio (3)</w:t>
               <w:br/>
-              <w:t>P1 x I3</w:t>
+              <w:t>P1 × I3</w:t>
             </w:r>
           </w:p>
         </w:tc>
@@ -3499,7 +4343,7 @@
                 <w:rFonts w:ascii="Verdana" w:hAnsi="Verdana"/>
                 <w:lang w:val="en-US"/>
               </w:rPr>
-              <w:t>Proposal</w:t>
+              <w:t>Propuesta</w:t>
             </w:r>
           </w:p>
         </w:tc>
@@ -3550,7 +4394,7 @@
                 <w:rFonts w:ascii="Verdana" w:hAnsi="Verdana"/>
                 <w:lang w:val="en-US"/>
               </w:rPr>
-              <w:t>C02 Storage. Before real data: encrypt retained contact values with authenticated encryption; keep keys outside the database and Git. Verify a copied database has no readable contacts and authorised decryption works.</w:t>
+              <w:t>C02 BD/configuración. Antes del primer dato real: cifrar contactos conservados y separar claves de la BD y Git. Prueba: una copia no revela contactos; el servidor autorizado puede descifrarlos.</w:t>
             </w:r>
           </w:p>
         </w:tc>
@@ -3573,7 +4417,7 @@
                 <w:rFonts w:ascii="Verdana" w:hAnsi="Verdana"/>
                 <w:lang w:val="en-US"/>
               </w:rPr>
-              <w:t>Possible host/key compromise; score retained</w:t>
+              <w:t>Baja probabilidad; impacto alto</w:t>
             </w:r>
           </w:p>
         </w:tc>
@@ -3596,9 +4440,9 @@
                 <w:rFonts w:ascii="Verdana" w:hAnsi="Verdana"/>
                 <w:lang w:val="en-US"/>
               </w:rPr>
-              <w:t>Medium (6)</w:t>
+              <w:t>Medio (3)</w:t>
               <w:br/>
-              <w:t>P2 x I3</w:t>
+              <w:t>P1 × I3</w:t>
             </w:r>
           </w:p>
         </w:tc>
@@ -3621,7 +4465,7 @@
                 <w:rFonts w:ascii="Verdana" w:hAnsi="Verdana"/>
                 <w:lang w:val="en-US"/>
               </w:rPr>
-              <w:t>Proposal</w:t>
+              <w:t>Propuesta</w:t>
             </w:r>
           </w:p>
         </w:tc>
@@ -3672,7 +4516,7 @@
                 <w:rFonts w:ascii="Verdana" w:hAnsi="Verdana"/>
                 <w:lang w:val="en-US"/>
               </w:rPr>
-              <w:t>C03 Schema/API. Before real data: remove telephone unless a necessary purpose is established. Verify no phone field remains in requests, schema or responses after migration.</w:t>
+              <w:t>C03 API/BD. Antes del primer dato real: eliminar teléfono si no se justifica una finalidad necesaria. Prueba: tras migrar, el campo no existe en esquema, solicitudes ni respuestas.</w:t>
             </w:r>
           </w:p>
         </w:tc>
@@ -3695,7 +4539,7 @@
                 <w:rFonts w:ascii="Verdana" w:hAnsi="Verdana"/>
                 <w:lang w:val="en-US"/>
               </w:rPr>
-              <w:t>Expected reduction</w:t>
+              <w:t>Reducción prevista</w:t>
             </w:r>
           </w:p>
         </w:tc>
@@ -3718,9 +4562,9 @@
                 <w:rFonts w:ascii="Verdana" w:hAnsi="Verdana"/>
                 <w:lang w:val="en-US"/>
               </w:rPr>
-              <w:t>Low (2)</w:t>
+              <w:t>Bajo (2)</w:t>
               <w:br/>
-              <w:t>P1 x I2</w:t>
+              <w:t>P1 × I2</w:t>
             </w:r>
           </w:p>
         </w:tc>
@@ -3743,7 +4587,7 @@
                 <w:rFonts w:ascii="Verdana" w:hAnsi="Verdana"/>
                 <w:lang w:val="en-US"/>
               </w:rPr>
-              <w:t>Proposal</w:t>
+              <w:t>Propuesta</w:t>
             </w:r>
           </w:p>
         </w:tc>
@@ -3794,7 +4638,7 @@
                 <w:rFonts w:ascii="Verdana" w:hAnsi="Verdana"/>
                 <w:lang w:val="en-US"/>
               </w:rPr>
-              <w:t>C04 Interface/process. Before collection: state purposes, fields, access, retention, basis and rights contact. Where consent is selected, record purpose/version/time and withdrawal. Verify notice and evidence.</w:t>
+              <w:t>C04 Interfaz/proceso. Antes de recolectar: aviso con identidad, finalidad, base, destinatarios, retención, derechos, contacto y campos obligatorios. Si corresponde consentimiento, registrar finalidad, versión, fecha y retiro. Prueba: cotejar aviso y evidencia.</w:t>
             </w:r>
           </w:p>
         </w:tc>
@@ -3817,7 +4661,7 @@
                 <w:rFonts w:ascii="Verdana" w:hAnsi="Verdana"/>
                 <w:lang w:val="en-US"/>
               </w:rPr>
-              <w:t>Expected reduction</w:t>
+              <w:t>Reducción prevista</w:t>
             </w:r>
           </w:p>
         </w:tc>
@@ -3840,9 +4684,9 @@
                 <w:rFonts w:ascii="Verdana" w:hAnsi="Verdana"/>
                 <w:lang w:val="en-US"/>
               </w:rPr>
-              <w:t>Low (2)</w:t>
+              <w:t>Bajo (2)</w:t>
               <w:br/>
-              <w:t>P1 x I2</w:t>
+              <w:t>P1 × I2</w:t>
             </w:r>
           </w:p>
         </w:tc>
@@ -3865,7 +4709,7 @@
                 <w:rFonts w:ascii="Verdana" w:hAnsi="Verdana"/>
                 <w:lang w:val="en-US"/>
               </w:rPr>
-              <w:t>Proposal</w:t>
+              <w:t>Propuesta</w:t>
             </w:r>
           </w:p>
         </w:tc>
@@ -3916,7 +4760,7 @@
                 <w:rFonts w:ascii="Verdana" w:hAnsi="Verdana"/>
                 <w:lang w:val="en-US"/>
               </w:rPr>
-              <w:t>C05 Database/job. Before real data: justify a maximum of 30 days from creation and run daily deletion. Verify a 31-day record is removed and a 29-day record retained. Define backup expiry too.</w:t>
+              <w:t>C05 BD/tarea. Antes del primer dato real: justificar máximo de 30 días desde el alta y borrado diario; definir vencimiento de copias. Prueba: eliminar entrada de 31 días y conservar la de 29.</w:t>
             </w:r>
           </w:p>
         </w:tc>
@@ -3939,7 +4783,7 @@
                 <w:rFonts w:ascii="Verdana" w:hAnsi="Verdana"/>
                 <w:lang w:val="en-US"/>
               </w:rPr>
-              <w:t>Expected reduction</w:t>
+              <w:t>Reducción prevista</w:t>
             </w:r>
           </w:p>
         </w:tc>
@@ -3962,9 +4806,9 @@
                 <w:rFonts w:ascii="Verdana" w:hAnsi="Verdana"/>
                 <w:lang w:val="en-US"/>
               </w:rPr>
-              <w:t>Low (2)</w:t>
+              <w:t>Bajo (2)</w:t>
               <w:br/>
-              <w:t>P1 x I2</w:t>
+              <w:t>P1 × I2</w:t>
             </w:r>
           </w:p>
         </w:tc>
@@ -3987,7 +4831,7 @@
                 <w:rFonts w:ascii="Verdana" w:hAnsi="Verdana"/>
                 <w:lang w:val="en-US"/>
               </w:rPr>
-              <w:t>Proposal</w:t>
+              <w:t>Propuesta</w:t>
             </w:r>
           </w:p>
         </w:tc>
@@ -4038,7 +4882,7 @@
                 <w:rFonts w:ascii="Verdana" w:hAnsi="Verdana"/>
                 <w:lang w:val="en-US"/>
               </w:rPr>
-              <w:t>C06 API/process. Before real data: provide authenticated own-record access, correction, deletion and export. Verify another user cannot use those operations; verify updates, erasure and export content.</w:t>
+              <w:t>C06 API/proceso. Antes del primer dato real: acceso propio, corrección, borrado y exportación autenticados. Prueba: bloquear operaciones sobre otro titular; comprobar cambio, eliminación y contenido exportado.</w:t>
             </w:r>
           </w:p>
         </w:tc>
@@ -4061,7 +4905,7 @@
                 <w:rFonts w:ascii="Verdana" w:hAnsi="Verdana"/>
                 <w:lang w:val="en-US"/>
               </w:rPr>
-              <w:t>Expected reduction</w:t>
+              <w:t>Reducción prevista</w:t>
             </w:r>
           </w:p>
         </w:tc>
@@ -4084,9 +4928,9 @@
                 <w:rFonts w:ascii="Verdana" w:hAnsi="Verdana"/>
                 <w:lang w:val="en-US"/>
               </w:rPr>
-              <w:t>Low (2)</w:t>
+              <w:t>Bajo (2)</w:t>
               <w:br/>
-              <w:t>P1 x I2</w:t>
+              <w:t>P1 × I2</w:t>
             </w:r>
           </w:p>
         </w:tc>
@@ -4109,7 +4953,7 @@
                 <w:rFonts w:ascii="Verdana" w:hAnsi="Verdana"/>
                 <w:lang w:val="en-US"/>
               </w:rPr>
-              <w:t>Proposal</w:t>
+              <w:t>Propuesta</w:t>
             </w:r>
           </w:p>
         </w:tc>
@@ -4160,7 +5004,7 @@
                 <w:rFonts w:ascii="Verdana" w:hAnsi="Verdana"/>
                 <w:lang w:val="en-US"/>
               </w:rPr>
-              <w:t>C07 API/database. Before real data: validate required non-empty text and email format; normalise email and enforce uniqueness. Verify bad format = 400 and duplicate = 409. Identity claims still require review.</w:t>
+              <w:t>C07 API/BD. Antes del primer dato real: exigir texto no vacío, validar formato y normalizar correo con unicidad. Prueba: formato inválido devuelve 400; duplicado, 409. No acredita identidad.</w:t>
             </w:r>
           </w:p>
         </w:tc>
@@ -4183,7 +5027,7 @@
                 <w:rFonts w:ascii="Verdana" w:hAnsi="Verdana"/>
                 <w:lang w:val="en-US"/>
               </w:rPr>
-              <w:t>Expected reduction</w:t>
+              <w:t>Reducción prevista</w:t>
             </w:r>
           </w:p>
         </w:tc>
@@ -4206,9 +5050,9 @@
                 <w:rFonts w:ascii="Verdana" w:hAnsi="Verdana"/>
                 <w:lang w:val="en-US"/>
               </w:rPr>
-              <w:t>Low (2)</w:t>
+              <w:t>Bajo (2)</w:t>
               <w:br/>
-              <w:t>P1 x I2</w:t>
+              <w:t>P1 × I2</w:t>
             </w:r>
           </w:p>
         </w:tc>
@@ -4231,7 +5075,7 @@
                 <w:rFonts w:ascii="Verdana" w:hAnsi="Verdana"/>
                 <w:lang w:val="en-US"/>
               </w:rPr>
-              <w:t>Proposal</w:t>
+              <w:t>Propuesta</w:t>
             </w:r>
           </w:p>
         </w:tc>
@@ -4282,7 +5126,7 @@
                 <w:rFonts w:ascii="Verdana" w:hAnsi="Verdana"/>
                 <w:lang w:val="en-US"/>
               </w:rPr>
-              <w:t>C08 Audit/process. Before real data: record actor/action/time without raw contacts; restrict log access and define incident assessment and response. Simulate disclosure and verify trace and response record.</w:t>
+              <w:t>C08 Auditoría/proceso. Antes del primer dato real: registrar actor, acción y fecha sin contactos completos; restringir consulta y definir respuesta a incidentes. Prueba: simular divulgación y comprobar traza y respuesta.</w:t>
             </w:r>
           </w:p>
         </w:tc>
@@ -4305,7 +5149,7 @@
                 <w:rFonts w:ascii="Verdana" w:hAnsi="Verdana"/>
                 <w:lang w:val="en-US"/>
               </w:rPr>
-              <w:t>Expected reduction</w:t>
+              <w:t>Reducción prevista</w:t>
             </w:r>
           </w:p>
         </w:tc>
@@ -4328,9 +5172,9 @@
                 <w:rFonts w:ascii="Verdana" w:hAnsi="Verdana"/>
                 <w:lang w:val="en-US"/>
               </w:rPr>
-              <w:t>Low (2)</w:t>
+              <w:t>Bajo (2)</w:t>
               <w:br/>
-              <w:t>P1 x I2</w:t>
+              <w:t>P1 × I2</w:t>
             </w:r>
           </w:p>
         </w:tc>
@@ -4353,7 +5197,7 @@
                 <w:rFonts w:ascii="Verdana" w:hAnsi="Verdana"/>
                 <w:lang w:val="en-US"/>
               </w:rPr>
-              <w:t>Proposal</w:t>
+              <w:t>Propuesta</w:t>
             </w:r>
           </w:p>
         </w:tc>
@@ -4537,7 +5381,7 @@
               </w:rPr>
               <w:t>Ronal Condor Blas</w:t>
               <w:br/>
-              <w:t>23 October 2026</w:t>
+              <w:t>23 de octubre de 2026</w:t>
             </w:r>
           </w:p>
         </w:tc>
@@ -4608,7 +5452,7 @@
               </w:rPr>
               <w:t>Ronal Condor Blas</w:t>
               <w:br/>
-              <w:t>23 October 2026</w:t>
+              <w:t>23 de octubre de 2026</w:t>
             </w:r>
           </w:p>
         </w:tc>
@@ -4840,25 +5684,25 @@
                 <w:rFonts w:ascii="Verdana" w:hAnsi="Verdana"/>
                 <w:lang w:val="en-US"/>
               </w:rPr>
-              <w:t>Launch with conditions: implement and verify C01-C08 before collecting real contacts. Approval concerns the proposed design; current scores remain those in Step 5.</w:t>
-            </w:r>
-          </w:p>
-          <w:p>
-            <w:pPr>
-              <w:rPr>
-                <w:rFonts w:ascii="Verdana" w:hAnsi="Verdana"/>
-                <w:lang w:val="en-US"/>
-              </w:rPr>
-              <w:spacing w:after="0"/>
-              <w:keepNext w:val="0"/>
-              <w:keepLines w:val="1"/>
-            </w:pPr>
-            <w:r>
-              <w:rPr>
-                <w:rFonts w:ascii="Verdana" w:hAnsi="Verdana"/>
-                <w:lang w:val="en-US"/>
-              </w:rPr>
-              <w:t>Expected medium residual R2 is conditionally accepted because host or key compromise remains possible. Restrict host/key access, verify C02 and reassess before operation. No expected high risk remains.</w:t>
+              <w:t>Se puede lanzar con condiciones: implementar y verificar C01–C08 antes del primer dato real. Se aprueba el diseño propuesto; hasta verificarlo, rige el riesgo actual del paso 5.</w:t>
+            </w:r>
+          </w:p>
+          <w:p>
+            <w:pPr>
+              <w:rPr>
+                <w:rFonts w:ascii="Verdana" w:hAnsi="Verdana"/>
+                <w:lang w:val="en-US"/>
+              </w:rPr>
+              <w:spacing w:after="0"/>
+              <w:keepNext w:val="0"/>
+              <w:keepLines w:val="1"/>
+            </w:pPr>
+            <w:r>
+              <w:rPr>
+                <w:rFonts w:ascii="Verdana" w:hAnsi="Verdana"/>
+                <w:lang w:val="en-US"/>
+              </w:rPr>
+              <w:t>R1 y R2 quedan en medio por el impacto de un acceso o compromiso de claves. Se acepta ese residual condicionado a probar C01 y C02, limitar privilegios y revisar el resultado antes de operar. No queda riesgo residual alto previsto.</w:t>
             </w:r>
           </w:p>
         </w:tc>

</xml_diff>

<commit_message>
docs: refine DPIA narrative using supplied reference
</commit_message>
<xml_diff>
--- a/docs/DPIA_Laboratorio_11.docx
+++ b/docs/DPIA_Laboratorio_11.docx
@@ -420,7 +420,7 @@
                 <w:color w:val="000000"/>
                 <w:b/>
               </w:rPr>
-              <w:t>Base actual</w:t>
+              <w:t>Base para uso real</w:t>
             </w:r>
           </w:p>
         </w:tc>
@@ -599,7 +599,7 @@
                 <w:sz w:val="19"/>
                 <w:color w:val="000000"/>
               </w:rPr>
-              <w:t>Práctica con datos ficticios</w:t>
+              <w:t>No definida; solo datos ficticios</w:t>
             </w:r>
           </w:p>
         </w:tc>
@@ -772,7 +772,7 @@
                 <w:sz w:val="19"/>
                 <w:color w:val="000000"/>
               </w:rPr>
-              <w:t>Práctica con datos ficticios</w:t>
+              <w:t>No definida; solo datos ficticios</w:t>
             </w:r>
           </w:p>
         </w:tc>
@@ -945,7 +945,7 @@
                 <w:sz w:val="19"/>
                 <w:color w:val="000000"/>
               </w:rPr>
-              <w:t>Práctica con datos ficticios</w:t>
+              <w:t>No definida; solo datos ficticios</w:t>
             </w:r>
           </w:p>
         </w:tc>
@@ -1291,7 +1291,7 @@
                 <w:sz w:val="19"/>
                 <w:color w:val="000000"/>
               </w:rPr>
-              <w:t>Metadato de la práctica</w:t>
+              <w:t>Vinculada a la finalidad; no definida</w:t>
             </w:r>
           </w:p>
         </w:tc>
@@ -1464,7 +1464,7 @@
                 <w:sz w:val="19"/>
                 <w:color w:val="000000"/>
               </w:rPr>
-              <w:t>Metadato de la práctica</w:t>
+              <w:t>Vinculada a la finalidad; no definida</w:t>
             </w:r>
           </w:p>
         </w:tc>
@@ -1567,7 +1567,7 @@
           <w:sz w:val="22"/>
           <w:color w:val="000000"/>
         </w:rPr>
-        <w:t>Estado actual para todos los campos: conservación indefinida; cualquier cliente con acceso al servicio obtiene el listado completo y quien copie lab.db puede leer sus valores. Propuesta C05: justificar un máximo de 30 días desde el alta, con eliminación diaria y reglas para copias. C01 y C06 restringirían quién puede consultar y operar sobre cada registro.</w:t>
+        <w:t>Estado actual para todos los campos: conservación indefinida; cualquier cliente con acceso al servicio obtiene el listado completo y quien copie lab.db puede leer sus valores. Propuesta C05: máximo de 30 días desde el alta para evaluación y correcciones, con eliminación diaria y reglas para copias. C01 y C06 restringirían quién puede consultar y operar sobre cada registro.</w:t>
       </w:r>
     </w:p>
     <w:p>
@@ -2139,7 +2139,7 @@
                 <w:rFonts w:ascii="Verdana" w:hAnsi="Verdana"/>
                 <w:lang w:val="en-US"/>
               </w:rPr>
-              <w:t>Esta evaluación analiza el backend local de Flask y SQLite de laboratorio-minimo, basado en las diapositivas 20 y 21 de DS3031. POST /registro guarda nombres, apellidos, correo y teléfono opcional; GET /registros entrega todos los registros sin autenticación. La inserción utiliza SQL parametrizado.</w:t>
+              <w:t>Proyecto y tratamiento: backend local de registro de personas del Laboratorio 11 de DS3031, implementado en Flask y SQLite. Recolecta, almacena y consulta nombres, apellidos, correo y teléfono opcional mediante POST /registro y GET /registros. La inserción utiliza SQL parametrizado.</w:t>
             </w:r>
           </w:p>
           <w:p>
@@ -2157,25 +2157,25 @@
                 <w:rFonts w:ascii="Verdana" w:hAnsi="Verdana"/>
                 <w:lang w:val="en-US"/>
               </w:rPr>
-              <w:t>El objetivo del laboratorio es identificar brechas del backend y formular restricciones de diseño por escrito. C01–C08 son propuestas y no están implementadas. La aplicación Next.js publicada en Vercel es una demostración complementaria; sus controles no se atribuyen al sistema evaluado.</w:t>
-            </w:r>
-          </w:p>
-          <w:p>
-            <w:pPr>
-              <w:rPr>
-                <w:rFonts w:ascii="Verdana" w:hAnsi="Verdana"/>
-                <w:lang w:val="en-US"/>
-              </w:rPr>
-              <w:spacing w:after="0"/>
-              <w:keepNext w:val="0"/>
-              <w:keepLines w:val="1"/>
-            </w:pPr>
-            <w:r>
-              <w:rPr>
-                <w:rFonts w:ascii="Verdana" w:hAnsi="Verdana"/>
-                <w:lang w:val="en-US"/>
-              </w:rPr>
-              <w:t>Se observan cuatro personas inventadas. Los riesgos expresan el daño potencial si se introdujeran contactos reales en este backend. El riesgo residual estima el resultado de aplicar las restricciones en papel. La decisión es un lanzamiento condicionado a implementarlas y verificarlas antes del primer dato real.</w:t>
+              <w:t>Necesidad de la evaluación: el listado no exige credenciales, los contactos son legibles en lab.db y no existe borrado. Se evalúa el daño que estas brechas causarían con datos reales y se definen restricciones verificables antes de autorizar ese uso. Las pruebas utilizan cuatro personas inventadas.</w:t>
+            </w:r>
+          </w:p>
+          <w:p>
+            <w:pPr>
+              <w:rPr>
+                <w:rFonts w:ascii="Verdana" w:hAnsi="Verdana"/>
+                <w:lang w:val="en-US"/>
+              </w:rPr>
+              <w:spacing w:after="0"/>
+              <w:keepNext w:val="0"/>
+              <w:keepLines w:val="1"/>
+            </w:pPr>
+            <w:r>
+              <w:rPr>
+                <w:rFonts w:ascii="Verdana" w:hAnsi="Verdana"/>
+                <w:lang w:val="en-US"/>
+              </w:rPr>
+              <w:t>Alcance documental: laboratorio-minimo contiene el código y verificar.py reproduce las observaciones. C01–C08 se proponen por escrito, conforme al encargo. El residual supone su aplicación en papel. La web Next.js/Vercel es una demostración complementaria y no aporta controles a este backend.</w:t>
             </w:r>
           </w:p>
         </w:tc>
@@ -2327,7 +2327,7 @@
                 <w:rFonts w:ascii="Verdana" w:hAnsi="Verdana"/>
                 <w:lang w:val="en-US"/>
               </w:rPr>
-              <w:t>Recolección: un cliente local envía JSON a POST /registro. La API exige las claves nombres, apellidos y correo, y acepta teléfono opcional. No valida el formato ni la unicidad del correo, no verifica identidad y no registra consentimiento.</w:t>
+              <w:t>Recolección: un cliente local envía JSON a POST /registro. Nombres, apellidos y correo son obligatorios; teléfono es opcional. La ausencia de una clave requerida devuelve 400. No se valida formato ni unicidad del correo, no se verifica identidad y no se registra consentimiento.</w:t>
             </w:r>
           </w:p>
           <w:p>
@@ -2345,7 +2345,7 @@
                 <w:rFonts w:ascii="Verdana" w:hAnsi="Verdana"/>
                 <w:lang w:val="en-US"/>
               </w:rPr>
-              <w:t>Almacenamiento y consulta: lab.db contiene id, nombres, apellidos, correo, telefono y creado_en. Los valores son legibles en SQLite. GET /registros devuelve todas las columnas y filas a cualquier cliente que alcance el servicio, sin cuentas, roles ni filtros por titular.</w:t>
+              <w:t>Almacenamiento y uso: SQLite guarda id, nombres, apellidos, correo, telefono y creado_en en lab.db, con contactos legibles. GET /registros devuelve todas las filas y columnas sin cuentas, roles ni filtros por titular. No hay un formulario web propio en esta versión.</w:t>
             </w:r>
           </w:p>
           <w:p>
@@ -2363,25 +2363,25 @@
                 <w:rFonts w:ascii="Verdana" w:hAnsi="Verdana"/>
                 <w:lang w:val="en-US"/>
               </w:rPr>
-              <w:t>Conservación y control: no existe vencimiento automático ni rutas de corrección, eliminación o exportación. Tampoco hay aviso completo, historial de consentimiento, auditoría dedicada de accesos o procedimiento de incidentes. La salida ordinaria del servidor no sustituye una auditoría.</w:t>
-            </w:r>
-          </w:p>
-          <w:p>
-            <w:pPr>
-              <w:rPr>
-                <w:rFonts w:ascii="Verdana" w:hAnsi="Verdana"/>
-                <w:lang w:val="en-US"/>
-              </w:rPr>
-              <w:spacing w:after="0"/>
-              <w:keepNext w:val="0"/>
-              <w:keepLines w:val="1"/>
-            </w:pPr>
-            <w:r>
-              <w:rPr>
-                <w:rFonts w:ascii="Verdana" w:hAnsi="Verdana"/>
-                <w:lang w:val="en-US"/>
-              </w:rPr>
-              <w:t>El servidor escucha en 127.0.0.1:5111, sin depuración. Se utilizan datos inventados y lab.db se excluye de Git. Este backend no envía datos a proveedores externos. La inserción parametrizada funciona: la inyección SQL no se presenta como una vulnerabilidad detectada.</w:t>
+              <w:t>Eliminación y destinatarios: no existen plazo, borrado, corrección o exportación. No hay cesión prevista a terceros, pero cualquier cliente que alcance el servicio obtiene el listado completo. Flask escribe información ordinaria de peticiones en consola; no es una auditoría dedicada ni se ha acreditado su conservación.</w:t>
+            </w:r>
+          </w:p>
+          <w:p>
+            <w:pPr>
+              <w:rPr>
+                <w:rFonts w:ascii="Verdana" w:hAnsi="Verdana"/>
+                <w:lang w:val="en-US"/>
+              </w:rPr>
+              <w:spacing w:after="0"/>
+              <w:keepNext w:val="0"/>
+              <w:keepLines w:val="1"/>
+            </w:pPr>
+            <w:r>
+              <w:rPr>
+                <w:rFonts w:ascii="Verdana" w:hAnsi="Verdana"/>
+                <w:lang w:val="en-US"/>
+              </w:rPr>
+              <w:t>Flujo: cliente local → POST /registro → lab.db → GET /registros → JSON completo. El servidor escucha en 127.0.0.1:5111, sin depuración. La BD se excluye de Git. Las pruebas confirman lectura por otro cliente, correo repetido o inválido y SQL similar a inyección guardado como texto.</w:t>
             </w:r>
           </w:p>
         </w:tc>
@@ -2469,7 +2469,7 @@
                 <w:rFonts w:ascii="Verdana" w:hAnsi="Verdana"/>
                 <w:lang w:val="en-US"/>
               </w:rPr>
-              <w:t>La observación inicial registra cuatro personas inventadas, una sin teléfono. Otras tres entradas temporales prueban correo duplicado, formato inválido y una cadena similar a SQL. verificar.py elimina su base temporal al terminar. La aplicación no fija un máximo de personas ni un plazo de conservación.</w:t>
+              <w:t>Datos: identificativos y de contacto inventados. El inventario detalla campo, finalidad, obligatoriedad, base, retención, acceso y necesidad. No se solicitan datos sensibles, ubicación, archivos ni documentos; el contenido de los nombres no se verifica.</w:t>
             </w:r>
           </w:p>
           <w:p>
@@ -2487,7 +2487,7 @@
                 <w:rFonts w:ascii="Verdana" w:hAnsi="Verdana"/>
                 <w:lang w:val="en-US"/>
               </w:rPr>
-              <w:t>El inventario inicial detalla cada campo, finalidad, obligatoriedad, base, retención, acceso y necesidad. Nombres, apellidos y correo son obligatorios en el ejercicio; teléfono es opcional y carece de necesidad demostrada. id y creado_en se generan automáticamente. No se solicitan datos sensibles, archivos, ubicación ni documentos de identidad.</w:t>
+              <w:t>Volumen y frecuencia: cuatro registros iniciales permiten observar el listado. Tres entradas adicionales prueban duplicado, formato e inserción parametrizada. verificar.py utiliza una base temporal que elimina al terminar. Fuera de esa prueba, la aplicación no impone máximo de personas ni limita altas repetidas.</w:t>
             </w:r>
           </w:p>
           <w:p>
@@ -2505,25 +2505,25 @@
                 <w:rFonts w:ascii="Verdana" w:hAnsi="Verdana"/>
                 <w:lang w:val="en-US"/>
               </w:rPr>
-              <w:t>Todos los campos se conservan indefinidamente y se exponen mediante el listado completo o una copia de SQLite. El propósito académico utiliza información ficticia; no se ha establecido una base que autorice recolectar contactos reales. El plazo de 30 días es una propuesta de diseño, no una obligación legal acreditada.</w:t>
-            </w:r>
-          </w:p>
-          <w:p>
-            <w:pPr>
-              <w:rPr>
-                <w:rFonts w:ascii="Verdana" w:hAnsi="Verdana"/>
-                <w:lang w:val="en-US"/>
-              </w:rPr>
-              <w:spacing w:after="0"/>
-              <w:keepNext w:val="0"/>
-              <w:keepLines w:val="1"/>
-            </w:pPr>
-            <w:r>
-              <w:rPr>
-                <w:rFonts w:ascii="Verdana" w:hAnsi="Verdana"/>
-                <w:lang w:val="en-US"/>
-              </w:rPr>
-              <w:t>El tratamiento se ejecuta localmente en un equipo de desarrollo en Perú. La demostración Vercel/Neon queda fuera del alcance. Un cambio a usuarios reales, publicación en Internet, datos sensibles o nuevos destinatarios exigiría revisar esta evaluación.</w:t>
+              <w:t>Conservación: actualmente es indefinida. Se propone borrar diariamente las entradas con más de 30 días desde el alta: un margen acotado para evaluar y corregir el ejercicio, sin una finalidad permanente que justifique conservarlas. Es una decisión propuesta, no un plazo legal ni un control existente.</w:t>
+            </w:r>
+          </w:p>
+          <w:p>
+            <w:pPr>
+              <w:rPr>
+                <w:rFonts w:ascii="Verdana" w:hAnsi="Verdana"/>
+                <w:lang w:val="en-US"/>
+              </w:rPr>
+              <w:spacing w:after="0"/>
+              <w:keepNext w:val="0"/>
+              <w:keepLines w:val="1"/>
+            </w:pPr>
+            <w:r>
+              <w:rPr>
+                <w:rFonts w:ascii="Verdana" w:hAnsi="Verdana"/>
+                <w:lang w:val="en-US"/>
+              </w:rPr>
+              <w:t>Ámbito: un equipo local en Perú, sin proveedores externos. La base para recoger datos reales no está definida. Vercel/Neon queda fuera del alcance. Incorporar usuarios reales, publicar en Internet o cambiar destinatarios exige revisar la evaluación.</w:t>
             </w:r>
           </w:p>
         </w:tc>
@@ -2661,7 +2661,7 @@
                 <w:rFonts w:ascii="Verdana" w:hAnsi="Verdana"/>
                 <w:lang w:val="en-US"/>
               </w:rPr>
-              <w:t>Es una práctica académica individual con contactos inventados. No administra un directorio real de estudiantes ni está dirigida a menores o personas vulnerables. Los mismos campos permitirían identificar y vincular personas si se introdujeran datos reales.</w:t>
+              <w:t>Relación y expectativas: práctica académica individual, sin usuarios reales. Si se introdujeran contactos reales, sus titulares podrían esperar que otros solicitantes no accedieran al listado completo. El sistema no ofrece esa separación ni acredita quién introdujo cada dato.</w:t>
             </w:r>
           </w:p>
           <w:p>
@@ -2679,25 +2679,25 @@
                 <w:rFonts w:ascii="Verdana" w:hAnsi="Verdana"/>
                 <w:lang w:val="en-US"/>
               </w:rPr>
-              <w:t>Un segundo cliente anónimo puede leer los registros del primero, incluidos correo y teléfono sin ocultar. No hay un mecanismo para distinguir al titular de otro solicitante ni para corregir o eliminar una entrada. También se pueden atribuir datos a otra persona.</w:t>
-            </w:r>
-          </w:p>
-          <w:p>
-            <w:pPr>
-              <w:rPr>
-                <w:rFonts w:ascii="Verdana" w:hAnsi="Verdana"/>
-                <w:lang w:val="en-US"/>
-              </w:rPr>
-              <w:spacing w:after="0"/>
-              <w:keepNext w:val="0"/>
-              <w:keepLines w:val="1"/>
-            </w:pPr>
-            <w:r>
-              <w:rPr>
-                <w:rFonts w:ascii="Verdana" w:hAnsi="Verdana"/>
-                <w:lang w:val="en-US"/>
-              </w:rPr>
-              <w:t>Flask y SQLite son tecnologías convencionales. No se realizan perfiles ni decisiones automatizadas. Las preocupaciones principales son divulgación, recopilación innecesaria, falta de información, conservación indefinida y ausencia de control individual. No se afirma certificación ni cumplimiento jurídico.</w:t>
+              <w:t>Control del titular: no hay autenticación ni operaciones para corregir, borrar o exportar su información. La consulta global permite leer entradas, pero no equivale a un acceso individual protegido. Otra persona puede atribuirle datos incorrectos. No se verifica edad; la práctica no está dirigida a menores o grupos vulnerables.</w:t>
+            </w:r>
+          </w:p>
+          <w:p>
+            <w:pPr>
+              <w:rPr>
+                <w:rFonts w:ascii="Verdana" w:hAnsi="Verdana"/>
+                <w:lang w:val="en-US"/>
+              </w:rPr>
+              <w:spacing w:after="0"/>
+              <w:keepNext w:val="0"/>
+              <w:keepLines w:val="1"/>
+            </w:pPr>
+            <w:r>
+              <w:rPr>
+                <w:rFonts w:ascii="Verdana" w:hAnsi="Verdana"/>
+                <w:lang w:val="en-US"/>
+              </w:rPr>
+              <w:t>Tecnología y preocupaciones: Flask y SQLite son convencionales. No hay perfiles ni decisiones automatizadas. Las brechas relevantes son divulgación, recopilación innecesaria, falta de información, conservación indefinida y ausencia de control individual. No se afirma certificación ni cumplimiento jurídico.</w:t>
             </w:r>
           </w:p>
         </w:tc>
@@ -2785,7 +2785,7 @@
                 <w:rFonts w:ascii="Verdana" w:hAnsi="Verdana"/>
                 <w:lang w:val="en-US"/>
               </w:rPr>
-              <w:t>La finalidad es demostrar el registro, almacenamiento y listado de contactos y evaluar sus brechas de privacidad. El resultado es un inventario justificado, ocho riesgos concretos, restricciones comprobables y una decisión coherente con la valoración residual en papel.</w:t>
+              <w:t>Finalidad: demostrar registro, persistencia y consulta de contactos y utilizar el backend como objeto de una evaluación de privacidad. No se crean cuentas ni se envían mensajes; tampoco se administra un directorio real.</w:t>
             </w:r>
           </w:p>
           <w:p>
@@ -2803,25 +2803,25 @@
                 <w:rFonts w:ascii="Verdana" w:hAnsi="Verdana"/>
                 <w:lang w:val="en-US"/>
               </w:rPr>
-              <w:t>La persistencia permite observar qué queda guardado y qué obtiene otro cliente. Nombres, apellidos y correo reproducen los campos mínimos del ejercicio. El teléfono permite examinar una recopilación opcional que no resulta necesaria para el funcionamiento demostrado.</w:t>
-            </w:r>
-          </w:p>
-          <w:p>
-            <w:pPr>
-              <w:rPr>
-                <w:rFonts w:ascii="Verdana" w:hAnsi="Verdana"/>
-                <w:lang w:val="en-US"/>
-              </w:rPr>
-              <w:spacing w:after="0"/>
-              <w:keepNext w:val="0"/>
-              <w:keepLines w:val="1"/>
-            </w:pPr>
-            <w:r>
-              <w:rPr>
-                <w:rFonts w:ascii="Verdana" w:hAnsi="Verdana"/>
-                <w:lang w:val="en-US"/>
-              </w:rPr>
-              <w:t>No hay publicidad, venta, envío de mensajes ni usos secundarios. Una pantalla sin almacenamiento no permitiría observar estas brechas. Un servicio real necesitaría justificar su finalidad y base antes de recolectar información.</w:t>
+              <w:t>Beneficio del ejercicio: observar qué se guarda, quién puede consultarlo y qué daño surgiría con datos reales. De ahí se obtienen un inventario, ocho riesgos concretos, restricciones comprobables y una decisión condicionada.</w:t>
+            </w:r>
+          </w:p>
+          <w:p>
+            <w:pPr>
+              <w:rPr>
+                <w:rFonts w:ascii="Verdana" w:hAnsi="Verdana"/>
+                <w:lang w:val="en-US"/>
+              </w:rPr>
+              <w:spacing w:after="0"/>
+              <w:keepNext w:val="0"/>
+              <w:keepLines w:val="1"/>
+            </w:pPr>
+            <w:r>
+              <w:rPr>
+                <w:rFonts w:ascii="Verdana" w:hAnsi="Verdana"/>
+                <w:lang w:val="en-US"/>
+              </w:rPr>
+              <w:t>Límites: no hay publicidad, venta, perfiles ni usos secundarios. El teléfono no tiene utilidad operativa. La obligación académica de incluir nombres, apellidos y correo no demuestra que esos campos sean necesarios en cualquier servicio futuro; una finalidad nueva requiere revisar necesidad, base y riesgos.</w:t>
             </w:r>
           </w:p>
         </w:tc>
@@ -2919,6 +2919,7 @@
         <w:rPr>
           <w:lang w:eastAsia="en-GB"/>
         </w:rPr>
+        <w:pageBreakBefore/>
       </w:pPr>
       <w:r>
         <w:rPr>
@@ -2999,25 +3000,61 @@
                 <w:rFonts w:ascii="Verdana" w:hAnsi="Verdana"/>
                 <w:lang w:val="en-US"/>
               </w:rPr>
-              <w:t>La práctica demuestra persistencia con datos inventados. No establece una base para contactos reales. C03 propone eliminar el teléfono; C04, documentar cada finalidad y base, informar al titular y registrar consentimiento cuando corresponda. La necesidad de nombres y correo debe reconsiderarse para un servicio real.</w:t>
-            </w:r>
-          </w:p>
-          <w:p>
-            <w:pPr>
-              <w:rPr>
-                <w:rFonts w:ascii="Verdana" w:hAnsi="Verdana"/>
-                <w:lang w:val="en-US"/>
-              </w:rPr>
-              <w:spacing w:after="0"/>
-              <w:keepNext w:val="0"/>
-              <w:keepLines w:val="1"/>
-            </w:pPr>
-            <w:r>
-              <w:rPr>
-                <w:rFonts w:ascii="Verdana" w:hAnsi="Verdana"/>
-                <w:lang w:val="en-US"/>
-              </w:rPr>
-              <w:t>C01–C02 limitarían el acceso y cifrarían contactos; C05 fijaría la conservación; C06 permitiría ejercer derechos; C07 validaría calidad; C08 establecería auditoría y respuesta a incidentes. El paso 6 define prioridad y pruebas. Son propuestas sin implementar. Este backend local no tiene encargados externos ni transferencias internacionales.</w:t>
+              <w:t>Base y finalidad: la práctica utiliza datos ficticios con una finalidad académica. El registro permite observar persistencia y consulta; el listado abierto no es necesario para demostrar esas funciones. C04 exige definir y documentar una base antes de recolectar datos reales.</w:t>
+            </w:r>
+          </w:p>
+          <w:p>
+            <w:pPr>
+              <w:rPr>
+                <w:rFonts w:ascii="Verdana" w:hAnsi="Verdana"/>
+                <w:lang w:val="en-US"/>
+              </w:rPr>
+              <w:spacing w:after="80"/>
+              <w:keepNext w:val="0"/>
+              <w:keepLines w:val="1"/>
+            </w:pPr>
+            <w:r>
+              <w:rPr>
+                <w:rFonts w:ascii="Verdana" w:hAnsi="Verdana"/>
+                <w:lang w:val="en-US"/>
+              </w:rPr>
+              <w:t>Minimización y calidad: C03 elimina teléfono si no existe una finalidad necesaria. Nombres y apellidos se conservan en el ejercicio por el enunciado; para un servicio real se debe valorar si bastan menos datos. C07 validaría formato y unicidad del correo, sin confundir validación con prueba de identidad.</w:t>
+            </w:r>
+          </w:p>
+          <w:p>
+            <w:pPr>
+              <w:rPr>
+                <w:rFonts w:ascii="Verdana" w:hAnsi="Verdana"/>
+                <w:lang w:val="en-US"/>
+              </w:rPr>
+              <w:spacing w:after="80"/>
+              <w:keepNext w:val="0"/>
+              <w:keepLines w:val="1"/>
+            </w:pPr>
+            <w:r>
+              <w:rPr>
+                <w:rFonts w:ascii="Verdana" w:hAnsi="Verdana"/>
+                <w:lang w:val="en-US"/>
+              </w:rPr>
+              <w:t>Transparencia y derechos: C04 propone aviso breve y política versionada con finalidad, destinatarios, campos obligatorios, plazo y contacto para ejercer derechos. El consentimiento, cuando sea la base elegida, se registra por finalidad y versión. C06 prevé acceso, corrección, borrado y exportación autenticados, con pruebas de aislamiento.</w:t>
+            </w:r>
+          </w:p>
+          <w:p>
+            <w:pPr>
+              <w:rPr>
+                <w:rFonts w:ascii="Verdana" w:hAnsi="Verdana"/>
+                <w:lang w:val="en-US"/>
+              </w:rPr>
+              <w:spacing w:after="0"/>
+              <w:keepNext w:val="0"/>
+              <w:keepLines w:val="1"/>
+            </w:pPr>
+            <w:r>
+              <w:rPr>
+                <w:rFonts w:ascii="Verdana" w:hAnsi="Verdana"/>
+                <w:lang w:val="en-US"/>
+              </w:rPr>
+              <w:t>Conservación y seguridad: C01–C02 limitarían acceso y cifrarían contactos; C05 fijaría borrado diario a los 30 días; C08 aportaría auditoría y respuesta a incidentes. No hay encargados externos ni transferencias en este flujo local. Un cambio de finalidad, datos o tecnología exige revisar la DPIA. Todas estas medidas siguen siendo propuestas.</w:t>
             </w:r>
           </w:p>
         </w:tc>
@@ -3460,7 +3497,7 @@
                 <w:sz w:val="22"/>
                 <w:lang w:val="en-US"/>
               </w:rPr>
-              <w:t>Medio (2)</w:t>
+              <w:t>Bajo (1)</w:t>
             </w:r>
           </w:p>
         </w:tc>
@@ -3485,7 +3522,7 @@
                 <w:sz w:val="22"/>
                 <w:lang w:val="en-US"/>
               </w:rPr>
-              <w:t>Alto (6)</w:t>
+              <w:t>Medio (3)</w:t>
             </w:r>
           </w:p>
         </w:tc>
@@ -4394,7 +4431,7 @@
                 <w:rFonts w:ascii="Verdana" w:hAnsi="Verdana"/>
                 <w:lang w:val="en-US"/>
               </w:rPr>
-              <w:t>C02 BD/configuración. Antes del primer dato real: cifrar contactos conservados y separar claves de la BD y Git. Prueba: una copia no revela contactos; el servidor autorizado puede descifrarlos.</w:t>
+              <w:t>C02 BD/configuración. Antes del primer dato real: cifrar contactos con AES-GCM y separar claves de la BD y Git. Prueba: copia sin contactos legibles, descifrado autorizado y rechazo de datos cifrados alterados.</w:t>
             </w:r>
           </w:p>
         </w:tc>
@@ -4562,9 +4599,9 @@
                 <w:rFonts w:ascii="Verdana" w:hAnsi="Verdana"/>
                 <w:lang w:val="en-US"/>
               </w:rPr>
-              <w:t>Bajo (2)</w:t>
+              <w:t>Bajo (1)</w:t>
               <w:br/>
-              <w:t>P1 × I2</w:t>
+              <w:t>P1 × I1</w:t>
             </w:r>
           </w:p>
         </w:tc>
@@ -5684,7 +5721,7 @@
                 <w:rFonts w:ascii="Verdana" w:hAnsi="Verdana"/>
                 <w:lang w:val="en-US"/>
               </w:rPr>
-              <w:t>Se puede lanzar con condiciones: implementar y verificar C01–C08 antes del primer dato real. Se aprueba el diseño propuesto; hasta verificarlo, rige el riesgo actual del paso 5.</w:t>
+              <w:t>El backend actual no se puede lanzar con datos reales: R1, R2, R4, R5 y R6 son altos. Se puede lanzar con condiciones: implementar y verificar C01–C08 antes del primer dato real. La aprobación se refiere al diseño propuesto.</w:t>
             </w:r>
           </w:p>
           <w:p>

</xml_diff>

<commit_message>
docs: complete consultation plan and clarify design approvals
</commit_message>
<xml_diff>
--- a/docs/DPIA_Laboratorio_11.docx
+++ b/docs/DPIA_Laboratorio_11.docx
@@ -94,7 +94,7 @@
           <w:sz w:val="23"/>
           <w:color w:val="000000"/>
         </w:rPr>
-        <w:t>La evaluación identifica ocho riesgos observables y propone ocho restricciones verificables. Conforme a la diapositiva 20, esas restricciones se desarrollan por escrito y no se implementan en el backend evaluado. Las puntuaciones residuales son estimaciones del diseño propuesto.</w:t>
+        <w:t>La evaluación identifica ocho riesgos observables y propone ocho restricciones verificables. Conforme a la diapositiva 20, esas restricciones se aprueban para el diseño y se desarrollan por escrito; su implementación no forma parte del backend mínimo del ejercicio. Las puntuaciones residuales son estimaciones del diseño propuesto.</w:t>
       </w:r>
     </w:p>
     <w:p>
@@ -420,7 +420,7 @@
                 <w:color w:val="000000"/>
                 <w:b/>
               </w:rPr>
-              <w:t>Base para uso real</w:t>
+              <w:t>Base prevista para uso real</w:t>
             </w:r>
           </w:p>
         </w:tc>
@@ -599,7 +599,7 @@
                 <w:sz w:val="19"/>
                 <w:color w:val="000000"/>
               </w:rPr>
-              <w:t>No definida; solo datos ficticios</w:t>
+              <w:t>Consentimiento previo e informado (C04)</w:t>
             </w:r>
           </w:p>
         </w:tc>
@@ -772,7 +772,7 @@
                 <w:sz w:val="19"/>
                 <w:color w:val="000000"/>
               </w:rPr>
-              <w:t>No definida; solo datos ficticios</w:t>
+              <w:t>Consentimiento previo e informado (C04)</w:t>
             </w:r>
           </w:p>
         </w:tc>
@@ -945,7 +945,7 @@
                 <w:sz w:val="19"/>
                 <w:color w:val="000000"/>
               </w:rPr>
-              <w:t>No definida; solo datos ficticios</w:t>
+              <w:t>Consentimiento previo e informado (C04)</w:t>
             </w:r>
           </w:p>
         </w:tc>
@@ -1291,7 +1291,7 @@
                 <w:sz w:val="19"/>
                 <w:color w:val="000000"/>
               </w:rPr>
-              <w:t>Vinculada a la finalidad; no definida</w:t>
+              <w:t>Misma finalidad y base del registro</w:t>
             </w:r>
           </w:p>
         </w:tc>
@@ -1464,7 +1464,7 @@
                 <w:sz w:val="19"/>
                 <w:color w:val="000000"/>
               </w:rPr>
-              <w:t>Vinculada a la finalidad; no definida</w:t>
+              <w:t>Misma finalidad y base del registro</w:t>
             </w:r>
           </w:p>
         </w:tc>
@@ -1567,7 +1567,7 @@
           <w:sz w:val="22"/>
           <w:color w:val="000000"/>
         </w:rPr>
-        <w:t>Estado actual para todos los campos: conservación indefinida; cualquier cliente con acceso al servicio obtiene el listado completo y quien copie lab.db puede leer sus valores. Propuesta C05: máximo de 30 días desde el alta para evaluación y correcciones, con eliminación diaria y reglas para copias. C01 y C06 restringirían quién puede consultar y operar sobre cada registro.</w:t>
+        <w:t>Estado actual para todos los campos: conservación indefinida; cualquier cliente con acceso al servicio obtiene el listado completo y quien copie lab.db puede leer sus valores. Propuesta C05: máximo de 30 días desde el alta para evaluación y correcciones, con eliminación diaria y reglas para copias. C01 y C06 exigen restringir quién puede consultar y operar sobre cada registro.</w:t>
       </w:r>
     </w:p>
     <w:p>
@@ -1608,7 +1608,7 @@
           <w:sz w:val="22"/>
           <w:color w:val="000000"/>
         </w:rPr>
-        <w:t>El script verificar.py comprueba diez observaciones en una base temporal. También confirma que una cadena similar a inyección se almacena como texto sin ejecutar SQL. El inventario de código confirma que no hay política de vencimiento, aviso completo, consentimiento ni auditoría dedicada. La evidencia no demuestra cumplimiento de las restricciones propuestas.</w:t>
+        <w:t>El script verificar.py comprueba diez observaciones en una base temporal. También confirma que una cadena similar a inyección se almacena como texto sin ejecutar SQL. El inventario de código confirma que no hay política de vencimiento, aviso completo, consentimiento ni auditoría dedicada. La evidencia observa el estado actual; la aprobación de C01–C08 es una decisión de diseño.</w:t>
       </w:r>
     </w:p>
     <w:p>
@@ -1651,6 +1651,31 @@
         </w:rPr>
         <w:t>Fuente del encargo: L11 Fundamentos de privacidad de datos DS3031, diapositivas 20–29. Se conserva el diseño, los textos y los campos de la plantilla DPIA proporcionada.</w:t>
       </w:r>
+    </w:p>
+    <w:p>
+      <w:pPr>
+        <w:spacing w:before="0" w:after="140" w:line="260" w:lineRule="auto"/>
+      </w:pPr>
+      <w:r>
+        <w:rPr>
+          <w:rFonts w:ascii="Times New Roman" w:hAnsi="Times New Roman" w:cs="Times New Roman"/>
+          <w:sz w:val="23"/>
+          <w:color w:val="000000"/>
+          <w:b/>
+        </w:rPr>
+        <w:t xml:space="preserve">Fuente normativa  </w:t>
+      </w:r>
+      <w:hyperlink r:id="rIdDpiaLey29733">
+        <w:r>
+          <w:rPr>
+            <w:rFonts w:ascii="Times New Roman" w:hAnsi="Times New Roman"/>
+            <w:sz w:val="23"/>
+            <w:color w:val="000000"/>
+            <w:u w:val="single"/>
+          </w:rPr>
+          <w:t>https://www.minsa.gob.pe/Recursos/OGTI/SINADEF/Ley-29733.pdf</w:t>
+        </w:r>
+      </w:hyperlink>
     </w:p>
     <w:p>
       <w:pPr>
@@ -1945,9 +1970,10 @@
             <w:r>
               <w:rPr>
                 <w:rFonts w:ascii="Verdana" w:hAnsi="Verdana"/>
-                <w:lang w:val="en-US"/>
-              </w:rPr>
-              <w:t>Ronal Condor Blas</w:t>
+                <w:lang w:val="es-PE"/>
+                <w:b w:val="0"/>
+              </w:rPr>
+              <w:t xml:space="preserve">Ronal Condor Blas</w:t>
             </w:r>
           </w:p>
         </w:tc>
@@ -1983,7 +2009,18 @@
                 <w:rFonts w:ascii="Verdana" w:hAnsi="Verdana"/>
                 <w:lang w:val="en-US"/>
               </w:rPr>
-            </w:pPr>
+              <w:spacing w:after="0"/>
+              <w:keepNext w:val="0"/>
+              <w:keepLines w:val="1"/>
+            </w:pPr>
+            <w:r>
+              <w:rPr>
+                <w:rFonts w:ascii="Verdana" w:hAnsi="Verdana"/>
+                <w:lang w:val="es-PE"/>
+                <w:b w:val="0"/>
+              </w:rPr>
+              <w:t xml:space="preserve">Ejercicio académico individual, sin DPO designado.</w:t>
+            </w:r>
           </w:p>
         </w:tc>
       </w:tr>
@@ -2033,7 +2070,18 @@
                 <w:rFonts w:ascii="Verdana" w:hAnsi="Verdana"/>
                 <w:lang w:val="en-US"/>
               </w:rPr>
-            </w:pPr>
+              <w:spacing w:after="0"/>
+              <w:keepNext w:val="0"/>
+              <w:keepLines w:val="1"/>
+            </w:pPr>
+            <w:r>
+              <w:rPr>
+                <w:rFonts w:ascii="Verdana" w:hAnsi="Verdana"/>
+                <w:lang w:val="es-PE"/>
+                <w:b w:val="0"/>
+              </w:rPr>
+              <w:t xml:space="preserve">Ronal Condor Blas</w:t>
+            </w:r>
           </w:p>
         </w:tc>
       </w:tr>
@@ -2130,52 +2178,79 @@
                 <w:rFonts w:ascii="Verdana" w:hAnsi="Verdana"/>
                 <w:lang w:val="en-US"/>
               </w:rPr>
-              <w:spacing w:after="80"/>
-              <w:keepNext w:val="0"/>
-              <w:keepLines w:val="1"/>
-            </w:pPr>
-            <w:r>
-              <w:rPr>
-                <w:rFonts w:ascii="Verdana" w:hAnsi="Verdana"/>
-                <w:lang w:val="en-US"/>
-              </w:rPr>
-              <w:t>Proyecto y tratamiento: backend local de registro de personas del Laboratorio 11 de DS3031, implementado en Flask y SQLite. Recolecta, almacena y consulta nombres, apellidos, correo y teléfono opcional mediante POST /registro y GET /registros. La inserción utiliza SQL parametrizado.</w:t>
-            </w:r>
-          </w:p>
-          <w:p>
-            <w:pPr>
-              <w:rPr>
-                <w:rFonts w:ascii="Verdana" w:hAnsi="Verdana"/>
-                <w:lang w:val="en-US"/>
-              </w:rPr>
-              <w:spacing w:after="80"/>
-              <w:keepNext w:val="0"/>
-              <w:keepLines w:val="1"/>
-            </w:pPr>
-            <w:r>
-              <w:rPr>
-                <w:rFonts w:ascii="Verdana" w:hAnsi="Verdana"/>
-                <w:lang w:val="en-US"/>
-              </w:rPr>
-              <w:t>Necesidad de la evaluación: el listado no exige credenciales, los contactos son legibles en lab.db y no existe borrado. Se evalúa el daño que estas brechas causarían con datos reales y se definen restricciones verificables antes de autorizar ese uso. Las pruebas utilizan cuatro personas inventadas.</w:t>
-            </w:r>
-          </w:p>
-          <w:p>
-            <w:pPr>
-              <w:rPr>
-                <w:rFonts w:ascii="Verdana" w:hAnsi="Verdana"/>
-                <w:lang w:val="en-US"/>
-              </w:rPr>
-              <w:spacing w:after="0"/>
-              <w:keepNext w:val="0"/>
-              <w:keepLines w:val="1"/>
-            </w:pPr>
-            <w:r>
-              <w:rPr>
-                <w:rFonts w:ascii="Verdana" w:hAnsi="Verdana"/>
-                <w:lang w:val="en-US"/>
-              </w:rPr>
-              <w:t>Alcance documental: laboratorio-minimo contiene el código y verificar.py reproduce las observaciones. C01–C08 se proponen por escrito, conforme al encargo. El residual supone su aplicación en papel. La web Next.js/Vercel es una demostración complementaria y no aporta controles a este backend.</w:t>
+              <w:spacing w:after="100"/>
+              <w:keepNext w:val="0"/>
+              <w:keepLines w:val="1"/>
+            </w:pPr>
+            <w:r>
+              <w:rPr>
+                <w:rFonts w:ascii="Verdana" w:hAnsi="Verdana"/>
+                <w:lang w:val="es-PE"/>
+                <w:b w:val="1"/>
+              </w:rPr>
+              <w:t xml:space="preserve">Proyecto y tratamiento:</w:t>
+            </w:r>
+            <w:r>
+              <w:rPr>
+                <w:rFonts w:ascii="Verdana" w:hAnsi="Verdana"/>
+                <w:lang w:val="es-PE"/>
+                <w:b w:val="0"/>
+              </w:rPr>
+              <w:t xml:space="preserve"> backend local de registro de personas del Laboratorio 11 de DS3031, implementado en Flask y SQLite. Recolecta, almacena y consulta nombres, apellidos, correo y teléfono opcional mediante POST /registro y GET /registros. La inserción utiliza SQL parametrizado.</w:t>
+            </w:r>
+          </w:p>
+          <w:p>
+            <w:pPr>
+              <w:rPr>
+                <w:rFonts w:ascii="Verdana" w:hAnsi="Verdana"/>
+                <w:lang w:val="en-US"/>
+              </w:rPr>
+              <w:spacing w:after="100"/>
+              <w:keepNext w:val="0"/>
+              <w:keepLines w:val="1"/>
+            </w:pPr>
+            <w:r>
+              <w:rPr>
+                <w:rFonts w:ascii="Verdana" w:hAnsi="Verdana"/>
+                <w:lang w:val="es-PE"/>
+                <w:b w:val="1"/>
+              </w:rPr>
+              <w:t xml:space="preserve">Necesidad de la evaluación:</w:t>
+            </w:r>
+            <w:r>
+              <w:rPr>
+                <w:rFonts w:ascii="Verdana" w:hAnsi="Verdana"/>
+                <w:lang w:val="es-PE"/>
+                <w:b w:val="0"/>
+              </w:rPr>
+              <w:t xml:space="preserve"> el listado no exige credenciales, los contactos son legibles en lab.db y no existe borrado. Se evalúa el daño que estas brechas causarían con datos reales y se definen restricciones verificables antes de autorizar ese uso. Las pruebas utilizan cuatro personas inventadas.</w:t>
+            </w:r>
+          </w:p>
+          <w:p>
+            <w:pPr>
+              <w:rPr>
+                <w:rFonts w:ascii="Verdana" w:hAnsi="Verdana"/>
+                <w:lang w:val="en-US"/>
+              </w:rPr>
+              <w:spacing w:after="0"/>
+              <w:keepNext w:val="0"/>
+              <w:keepLines w:val="1"/>
+            </w:pPr>
+            <w:r>
+              <w:rPr>
+                <w:rFonts w:ascii="Verdana" w:hAnsi="Verdana"/>
+                <w:lang w:val="es-PE"/>
+                <w:b w:val="1"/>
+              </w:rPr>
+              <w:t xml:space="preserve">Alcance documental:</w:t>
+            </w:r>
+            <w:r>
+              <w:rPr>
+                <w:rFonts w:ascii="Verdana" w:hAnsi="Verdana"/>
+                <w:lang w:val="es-PE"/>
+                <w:b w:val="0"/>
+              </w:rPr>
+              <w:t xml:space="preserve"> laboratorio-minimo contiene el código y verificar.py reproduce las observaciones. C01–C08 se aprueban como restricciones de diseño por escrito, conforme al encargo. El residual supone su aplicación en papel. La web Next.js/Vercel es una demostración complementaria y no aporta controles a este backend.</w:t>
             </w:r>
           </w:p>
         </w:tc>
@@ -2318,70 +2393,106 @@
                 <w:rFonts w:ascii="Verdana" w:hAnsi="Verdana"/>
                 <w:lang w:val="en-US"/>
               </w:rPr>
-              <w:spacing w:after="80"/>
-              <w:keepNext w:val="0"/>
-              <w:keepLines w:val="1"/>
-            </w:pPr>
-            <w:r>
-              <w:rPr>
-                <w:rFonts w:ascii="Verdana" w:hAnsi="Verdana"/>
-                <w:lang w:val="en-US"/>
-              </w:rPr>
-              <w:t>Recolección: un cliente local envía JSON a POST /registro. Nombres, apellidos y correo son obligatorios; teléfono es opcional. La ausencia de una clave requerida devuelve 400. No se valida formato ni unicidad del correo, no se verifica identidad y no se registra consentimiento.</w:t>
-            </w:r>
-          </w:p>
-          <w:p>
-            <w:pPr>
-              <w:rPr>
-                <w:rFonts w:ascii="Verdana" w:hAnsi="Verdana"/>
-                <w:lang w:val="en-US"/>
-              </w:rPr>
-              <w:spacing w:after="80"/>
-              <w:keepNext w:val="0"/>
-              <w:keepLines w:val="1"/>
-            </w:pPr>
-            <w:r>
-              <w:rPr>
-                <w:rFonts w:ascii="Verdana" w:hAnsi="Verdana"/>
-                <w:lang w:val="en-US"/>
-              </w:rPr>
-              <w:t>Almacenamiento y uso: SQLite guarda id, nombres, apellidos, correo, telefono y creado_en en lab.db, con contactos legibles. GET /registros devuelve todas las filas y columnas sin cuentas, roles ni filtros por titular. No hay un formulario web propio en esta versión.</w:t>
-            </w:r>
-          </w:p>
-          <w:p>
-            <w:pPr>
-              <w:rPr>
-                <w:rFonts w:ascii="Verdana" w:hAnsi="Verdana"/>
-                <w:lang w:val="en-US"/>
-              </w:rPr>
-              <w:spacing w:after="80"/>
-              <w:keepNext w:val="0"/>
-              <w:keepLines w:val="1"/>
-            </w:pPr>
-            <w:r>
-              <w:rPr>
-                <w:rFonts w:ascii="Verdana" w:hAnsi="Verdana"/>
-                <w:lang w:val="en-US"/>
-              </w:rPr>
-              <w:t>Eliminación y destinatarios: no existen plazo, borrado, corrección o exportación. No hay cesión prevista a terceros, pero cualquier cliente que alcance el servicio obtiene el listado completo. Flask escribe información ordinaria de peticiones en consola; no es una auditoría dedicada ni se ha acreditado su conservación.</w:t>
-            </w:r>
-          </w:p>
-          <w:p>
-            <w:pPr>
-              <w:rPr>
-                <w:rFonts w:ascii="Verdana" w:hAnsi="Verdana"/>
-                <w:lang w:val="en-US"/>
-              </w:rPr>
-              <w:spacing w:after="0"/>
-              <w:keepNext w:val="0"/>
-              <w:keepLines w:val="1"/>
-            </w:pPr>
-            <w:r>
-              <w:rPr>
-                <w:rFonts w:ascii="Verdana" w:hAnsi="Verdana"/>
-                <w:lang w:val="en-US"/>
-              </w:rPr>
-              <w:t>Flujo: cliente local → POST /registro → lab.db → GET /registros → JSON completo. El servidor escucha en 127.0.0.1:5111, sin depuración. La BD se excluye de Git. Las pruebas confirman lectura por otro cliente, correo repetido o inválido y SQL similar a inyección guardado como texto.</w:t>
+              <w:spacing w:after="100"/>
+              <w:keepNext w:val="0"/>
+              <w:keepLines w:val="1"/>
+            </w:pPr>
+            <w:r>
+              <w:rPr>
+                <w:rFonts w:ascii="Verdana" w:hAnsi="Verdana"/>
+                <w:lang w:val="es-PE"/>
+                <w:b w:val="1"/>
+              </w:rPr>
+              <w:t xml:space="preserve">Recolección:</w:t>
+            </w:r>
+            <w:r>
+              <w:rPr>
+                <w:rFonts w:ascii="Verdana" w:hAnsi="Verdana"/>
+                <w:lang w:val="es-PE"/>
+                <w:b w:val="0"/>
+              </w:rPr>
+              <w:t xml:space="preserve"> un cliente local envía JSON a POST /registro. Nombres, apellidos y correo son obligatorios; teléfono es opcional. La ausencia de una clave requerida devuelve 400. No se valida formato ni unicidad del correo, no se verifica identidad y no se registra consentimiento.</w:t>
+            </w:r>
+          </w:p>
+          <w:p>
+            <w:pPr>
+              <w:rPr>
+                <w:rFonts w:ascii="Verdana" w:hAnsi="Verdana"/>
+                <w:lang w:val="en-US"/>
+              </w:rPr>
+              <w:spacing w:after="100"/>
+              <w:keepNext w:val="0"/>
+              <w:keepLines w:val="1"/>
+            </w:pPr>
+            <w:r>
+              <w:rPr>
+                <w:rFonts w:ascii="Verdana" w:hAnsi="Verdana"/>
+                <w:lang w:val="es-PE"/>
+                <w:b w:val="1"/>
+              </w:rPr>
+              <w:t xml:space="preserve">Almacenamiento y uso:</w:t>
+            </w:r>
+            <w:r>
+              <w:rPr>
+                <w:rFonts w:ascii="Verdana" w:hAnsi="Verdana"/>
+                <w:lang w:val="es-PE"/>
+                <w:b w:val="0"/>
+              </w:rPr>
+              <w:t xml:space="preserve"> SQLite guarda id, nombres, apellidos, correo, telefono y creado_en en lab.db, con contactos legibles. GET /registros devuelve todas las filas y columnas sin cuentas, roles ni filtros por titular. No hay un formulario web propio en esta versión.</w:t>
+            </w:r>
+          </w:p>
+          <w:p>
+            <w:pPr>
+              <w:rPr>
+                <w:rFonts w:ascii="Verdana" w:hAnsi="Verdana"/>
+                <w:lang w:val="en-US"/>
+              </w:rPr>
+              <w:spacing w:after="100"/>
+              <w:keepNext w:val="0"/>
+              <w:keepLines w:val="1"/>
+            </w:pPr>
+            <w:r>
+              <w:rPr>
+                <w:rFonts w:ascii="Verdana" w:hAnsi="Verdana"/>
+                <w:lang w:val="es-PE"/>
+                <w:b w:val="1"/>
+              </w:rPr>
+              <w:t xml:space="preserve">Eliminación y destinatarios:</w:t>
+            </w:r>
+            <w:r>
+              <w:rPr>
+                <w:rFonts w:ascii="Verdana" w:hAnsi="Verdana"/>
+                <w:lang w:val="es-PE"/>
+                <w:b w:val="0"/>
+              </w:rPr>
+              <w:t xml:space="preserve"> no existen plazo, borrado, corrección o exportación. No hay cesión prevista a terceros, pero cualquier cliente que alcance el servicio obtiene el listado completo. Flask escribe información ordinaria de peticiones en consola; no es una auditoría dedicada ni se ha acreditado su conservación.</w:t>
+            </w:r>
+          </w:p>
+          <w:p>
+            <w:pPr>
+              <w:rPr>
+                <w:rFonts w:ascii="Verdana" w:hAnsi="Verdana"/>
+                <w:lang w:val="en-US"/>
+              </w:rPr>
+              <w:spacing w:after="0"/>
+              <w:keepNext w:val="0"/>
+              <w:keepLines w:val="1"/>
+            </w:pPr>
+            <w:r>
+              <w:rPr>
+                <w:rFonts w:ascii="Verdana" w:hAnsi="Verdana"/>
+                <w:lang w:val="es-PE"/>
+                <w:b w:val="1"/>
+              </w:rPr>
+              <w:t xml:space="preserve">Flujo:</w:t>
+            </w:r>
+            <w:r>
+              <w:rPr>
+                <w:rFonts w:ascii="Verdana" w:hAnsi="Verdana"/>
+                <w:lang w:val="es-PE"/>
+                <w:b w:val="0"/>
+              </w:rPr>
+              <w:t xml:space="preserve"> cliente local → POST /registro → lab.db → GET /registros → JSON completo. El servidor escucha en 127.0.0.1:5111, sin depuración. La BD se excluye de Git. Las pruebas confirman lectura por otro cliente, correo repetido o inválido y SQL similar a inyección guardado como texto.</w:t>
             </w:r>
           </w:p>
         </w:tc>
@@ -2460,70 +2571,106 @@
                 <w:rFonts w:ascii="Verdana" w:hAnsi="Verdana"/>
                 <w:lang w:val="en-US"/>
               </w:rPr>
-              <w:spacing w:after="80"/>
-              <w:keepNext w:val="0"/>
-              <w:keepLines w:val="1"/>
-            </w:pPr>
-            <w:r>
-              <w:rPr>
-                <w:rFonts w:ascii="Verdana" w:hAnsi="Verdana"/>
-                <w:lang w:val="en-US"/>
-              </w:rPr>
-              <w:t>Datos: identificativos y de contacto inventados. El inventario detalla campo, finalidad, obligatoriedad, base, retención, acceso y necesidad. No se solicitan datos sensibles, ubicación, archivos ni documentos; el contenido de los nombres no se verifica.</w:t>
-            </w:r>
-          </w:p>
-          <w:p>
-            <w:pPr>
-              <w:rPr>
-                <w:rFonts w:ascii="Verdana" w:hAnsi="Verdana"/>
-                <w:lang w:val="en-US"/>
-              </w:rPr>
-              <w:spacing w:after="80"/>
-              <w:keepNext w:val="0"/>
-              <w:keepLines w:val="1"/>
-            </w:pPr>
-            <w:r>
-              <w:rPr>
-                <w:rFonts w:ascii="Verdana" w:hAnsi="Verdana"/>
-                <w:lang w:val="en-US"/>
-              </w:rPr>
-              <w:t>Volumen y frecuencia: cuatro registros iniciales permiten observar el listado. Tres entradas adicionales prueban duplicado, formato e inserción parametrizada. verificar.py utiliza una base temporal que elimina al terminar. Fuera de esa prueba, la aplicación no impone máximo de personas ni limita altas repetidas.</w:t>
-            </w:r>
-          </w:p>
-          <w:p>
-            <w:pPr>
-              <w:rPr>
-                <w:rFonts w:ascii="Verdana" w:hAnsi="Verdana"/>
-                <w:lang w:val="en-US"/>
-              </w:rPr>
-              <w:spacing w:after="80"/>
-              <w:keepNext w:val="0"/>
-              <w:keepLines w:val="1"/>
-            </w:pPr>
-            <w:r>
-              <w:rPr>
-                <w:rFonts w:ascii="Verdana" w:hAnsi="Verdana"/>
-                <w:lang w:val="en-US"/>
-              </w:rPr>
-              <w:t>Conservación: actualmente es indefinida. Se propone borrar diariamente las entradas con más de 30 días desde el alta: un margen acotado para evaluar y corregir el ejercicio, sin una finalidad permanente que justifique conservarlas. Es una decisión propuesta, no un plazo legal ni un control existente.</w:t>
-            </w:r>
-          </w:p>
-          <w:p>
-            <w:pPr>
-              <w:rPr>
-                <w:rFonts w:ascii="Verdana" w:hAnsi="Verdana"/>
-                <w:lang w:val="en-US"/>
-              </w:rPr>
-              <w:spacing w:after="0"/>
-              <w:keepNext w:val="0"/>
-              <w:keepLines w:val="1"/>
-            </w:pPr>
-            <w:r>
-              <w:rPr>
-                <w:rFonts w:ascii="Verdana" w:hAnsi="Verdana"/>
-                <w:lang w:val="en-US"/>
-              </w:rPr>
-              <w:t>Ámbito: un equipo local en Perú, sin proveedores externos. La base para recoger datos reales no está definida. Vercel/Neon queda fuera del alcance. Incorporar usuarios reales, publicar en Internet o cambiar destinatarios exige revisar la evaluación.</w:t>
+              <w:spacing w:after="100"/>
+              <w:keepNext w:val="0"/>
+              <w:keepLines w:val="1"/>
+            </w:pPr>
+            <w:r>
+              <w:rPr>
+                <w:rFonts w:ascii="Verdana" w:hAnsi="Verdana"/>
+                <w:lang w:val="es-PE"/>
+                <w:b w:val="1"/>
+              </w:rPr>
+              <w:t xml:space="preserve">Datos:</w:t>
+            </w:r>
+            <w:r>
+              <w:rPr>
+                <w:rFonts w:ascii="Verdana" w:hAnsi="Verdana"/>
+                <w:lang w:val="es-PE"/>
+                <w:b w:val="0"/>
+              </w:rPr>
+              <w:t xml:space="preserve"> identificativos y de contacto inventados. El inventario detalla campo, finalidad, obligatoriedad, base, retención, acceso y necesidad. No se solicitan datos sensibles, ubicación, archivos ni documentos; el contenido de los nombres no se verifica.</w:t>
+            </w:r>
+          </w:p>
+          <w:p>
+            <w:pPr>
+              <w:rPr>
+                <w:rFonts w:ascii="Verdana" w:hAnsi="Verdana"/>
+                <w:lang w:val="en-US"/>
+              </w:rPr>
+              <w:spacing w:after="100"/>
+              <w:keepNext w:val="0"/>
+              <w:keepLines w:val="1"/>
+            </w:pPr>
+            <w:r>
+              <w:rPr>
+                <w:rFonts w:ascii="Verdana" w:hAnsi="Verdana"/>
+                <w:lang w:val="es-PE"/>
+                <w:b w:val="1"/>
+              </w:rPr>
+              <w:t xml:space="preserve">Volumen y frecuencia:</w:t>
+            </w:r>
+            <w:r>
+              <w:rPr>
+                <w:rFonts w:ascii="Verdana" w:hAnsi="Verdana"/>
+                <w:lang w:val="es-PE"/>
+                <w:b w:val="0"/>
+              </w:rPr>
+              <w:t xml:space="preserve"> cuatro registros iniciales permiten observar el listado. Tres entradas adicionales prueban duplicado, formato e inserción parametrizada. verificar.py utiliza una base temporal que elimina al terminar. Fuera de esa prueba, la aplicación no impone máximo de personas ni limita altas repetidas.</w:t>
+            </w:r>
+          </w:p>
+          <w:p>
+            <w:pPr>
+              <w:rPr>
+                <w:rFonts w:ascii="Verdana" w:hAnsi="Verdana"/>
+                <w:lang w:val="en-US"/>
+              </w:rPr>
+              <w:spacing w:after="100"/>
+              <w:keepNext w:val="0"/>
+              <w:keepLines w:val="1"/>
+            </w:pPr>
+            <w:r>
+              <w:rPr>
+                <w:rFonts w:ascii="Verdana" w:hAnsi="Verdana"/>
+                <w:lang w:val="es-PE"/>
+                <w:b w:val="1"/>
+              </w:rPr>
+              <w:t xml:space="preserve">Conservación:</w:t>
+            </w:r>
+            <w:r>
+              <w:rPr>
+                <w:rFonts w:ascii="Verdana" w:hAnsi="Verdana"/>
+                <w:lang w:val="es-PE"/>
+                <w:b w:val="0"/>
+              </w:rPr>
+              <w:t xml:space="preserve"> actualmente es indefinida. Se propone borrar diariamente las entradas con más de 30 días desde el alta: un margen acotado para evaluar y corregir el ejercicio, sin una finalidad permanente que justifique conservarlas. Es una decisión propuesta, no un plazo legal ni un control existente.</w:t>
+            </w:r>
+          </w:p>
+          <w:p>
+            <w:pPr>
+              <w:rPr>
+                <w:rFonts w:ascii="Verdana" w:hAnsi="Verdana"/>
+                <w:lang w:val="en-US"/>
+              </w:rPr>
+              <w:spacing w:after="0"/>
+              <w:keepNext w:val="0"/>
+              <w:keepLines w:val="1"/>
+            </w:pPr>
+            <w:r>
+              <w:rPr>
+                <w:rFonts w:ascii="Verdana" w:hAnsi="Verdana"/>
+                <w:lang w:val="es-PE"/>
+                <w:b w:val="1"/>
+              </w:rPr>
+              <w:t xml:space="preserve">Ámbito:</w:t>
+            </w:r>
+            <w:r>
+              <w:rPr>
+                <w:rFonts w:ascii="Verdana" w:hAnsi="Verdana"/>
+                <w:lang w:val="es-PE"/>
+                <w:b w:val="0"/>
+              </w:rPr>
+              <w:t xml:space="preserve"> un equipo local en Perú, sin proveedores externos. Actualmente no se recoge consentimiento; C04 lo establece como base prevista para un registro voluntario. Vercel/Neon queda fuera del alcance. Incorporar usuarios reales, publicar en Internet o cambiar destinatarios exige revisar la evaluación.</w:t>
             </w:r>
           </w:p>
         </w:tc>
@@ -2652,52 +2799,79 @@
                 <w:rFonts w:ascii="Verdana" w:hAnsi="Verdana"/>
                 <w:lang w:val="en-US"/>
               </w:rPr>
-              <w:spacing w:after="80"/>
-              <w:keepNext w:val="0"/>
-              <w:keepLines w:val="1"/>
-            </w:pPr>
-            <w:r>
-              <w:rPr>
-                <w:rFonts w:ascii="Verdana" w:hAnsi="Verdana"/>
-                <w:lang w:val="en-US"/>
-              </w:rPr>
-              <w:t>Relación y expectativas: práctica académica individual, sin usuarios reales. Si se introdujeran contactos reales, sus titulares podrían esperar que otros solicitantes no accedieran al listado completo. El sistema no ofrece esa separación ni acredita quién introdujo cada dato.</w:t>
-            </w:r>
-          </w:p>
-          <w:p>
-            <w:pPr>
-              <w:rPr>
-                <w:rFonts w:ascii="Verdana" w:hAnsi="Verdana"/>
-                <w:lang w:val="en-US"/>
-              </w:rPr>
-              <w:spacing w:after="80"/>
-              <w:keepNext w:val="0"/>
-              <w:keepLines w:val="1"/>
-            </w:pPr>
-            <w:r>
-              <w:rPr>
-                <w:rFonts w:ascii="Verdana" w:hAnsi="Verdana"/>
-                <w:lang w:val="en-US"/>
-              </w:rPr>
-              <w:t>Control del titular: no hay autenticación ni operaciones para corregir, borrar o exportar su información. La consulta global permite leer entradas, pero no equivale a un acceso individual protegido. Otra persona puede atribuirle datos incorrectos. No se verifica edad; la práctica no está dirigida a menores o grupos vulnerables.</w:t>
-            </w:r>
-          </w:p>
-          <w:p>
-            <w:pPr>
-              <w:rPr>
-                <w:rFonts w:ascii="Verdana" w:hAnsi="Verdana"/>
-                <w:lang w:val="en-US"/>
-              </w:rPr>
-              <w:spacing w:after="0"/>
-              <w:keepNext w:val="0"/>
-              <w:keepLines w:val="1"/>
-            </w:pPr>
-            <w:r>
-              <w:rPr>
-                <w:rFonts w:ascii="Verdana" w:hAnsi="Verdana"/>
-                <w:lang w:val="en-US"/>
-              </w:rPr>
-              <w:t>Tecnología y preocupaciones: Flask y SQLite son convencionales. No hay perfiles ni decisiones automatizadas. Las brechas relevantes son divulgación, recopilación innecesaria, falta de información, conservación indefinida y ausencia de control individual. No se afirma certificación ni cumplimiento jurídico.</w:t>
+              <w:spacing w:after="100"/>
+              <w:keepNext w:val="0"/>
+              <w:keepLines w:val="1"/>
+            </w:pPr>
+            <w:r>
+              <w:rPr>
+                <w:rFonts w:ascii="Verdana" w:hAnsi="Verdana"/>
+                <w:lang w:val="es-PE"/>
+                <w:b w:val="1"/>
+              </w:rPr>
+              <w:t xml:space="preserve">Relación y expectativas:</w:t>
+            </w:r>
+            <w:r>
+              <w:rPr>
+                <w:rFonts w:ascii="Verdana" w:hAnsi="Verdana"/>
+                <w:lang w:val="es-PE"/>
+                <w:b w:val="0"/>
+              </w:rPr>
+              <w:t xml:space="preserve"> práctica académica individual, sin usuarios reales. Si se introdujeran contactos reales, sus titulares podrían esperar que otros solicitantes no accedieran al listado completo. El sistema no ofrece esa separación ni acredita quién introdujo cada dato.</w:t>
+            </w:r>
+          </w:p>
+          <w:p>
+            <w:pPr>
+              <w:rPr>
+                <w:rFonts w:ascii="Verdana" w:hAnsi="Verdana"/>
+                <w:lang w:val="en-US"/>
+              </w:rPr>
+              <w:spacing w:after="100"/>
+              <w:keepNext w:val="0"/>
+              <w:keepLines w:val="1"/>
+            </w:pPr>
+            <w:r>
+              <w:rPr>
+                <w:rFonts w:ascii="Verdana" w:hAnsi="Verdana"/>
+                <w:lang w:val="es-PE"/>
+                <w:b w:val="1"/>
+              </w:rPr>
+              <w:t xml:space="preserve">Control del titular:</w:t>
+            </w:r>
+            <w:r>
+              <w:rPr>
+                <w:rFonts w:ascii="Verdana" w:hAnsi="Verdana"/>
+                <w:lang w:val="es-PE"/>
+                <w:b w:val="0"/>
+              </w:rPr>
+              <w:t xml:space="preserve"> no hay autenticación ni operaciones para corregir, borrar o exportar su información. La consulta global permite leer entradas, pero no equivale a un acceso individual protegido. Otra persona puede atribuirle datos incorrectos. No se verifica edad; la práctica no está dirigida a menores o grupos vulnerables.</w:t>
+            </w:r>
+          </w:p>
+          <w:p>
+            <w:pPr>
+              <w:rPr>
+                <w:rFonts w:ascii="Verdana" w:hAnsi="Verdana"/>
+                <w:lang w:val="en-US"/>
+              </w:rPr>
+              <w:spacing w:after="0"/>
+              <w:keepNext w:val="0"/>
+              <w:keepLines w:val="1"/>
+            </w:pPr>
+            <w:r>
+              <w:rPr>
+                <w:rFonts w:ascii="Verdana" w:hAnsi="Verdana"/>
+                <w:lang w:val="es-PE"/>
+                <w:b w:val="1"/>
+              </w:rPr>
+              <w:t xml:space="preserve">Tecnología y preocupaciones:</w:t>
+            </w:r>
+            <w:r>
+              <w:rPr>
+                <w:rFonts w:ascii="Verdana" w:hAnsi="Verdana"/>
+                <w:lang w:val="es-PE"/>
+                <w:b w:val="0"/>
+              </w:rPr>
+              <w:t xml:space="preserve"> Flask y SQLite son convencionales. No hay perfiles ni decisiones automatizadas. Las brechas relevantes son divulgación, recopilación innecesaria, falta de información, conservación indefinida y ausencia de control individual. No se afirma certificación ni cumplimiento jurídico.</w:t>
             </w:r>
           </w:p>
         </w:tc>
@@ -2776,52 +2950,79 @@
                 <w:rFonts w:ascii="Verdana" w:hAnsi="Verdana"/>
                 <w:lang w:val="en-US"/>
               </w:rPr>
-              <w:spacing w:after="80"/>
-              <w:keepNext w:val="0"/>
-              <w:keepLines w:val="1"/>
-            </w:pPr>
-            <w:r>
-              <w:rPr>
-                <w:rFonts w:ascii="Verdana" w:hAnsi="Verdana"/>
-                <w:lang w:val="en-US"/>
-              </w:rPr>
-              <w:t>Finalidad: demostrar registro, persistencia y consulta de contactos y utilizar el backend como objeto de una evaluación de privacidad. No se crean cuentas ni se envían mensajes; tampoco se administra un directorio real.</w:t>
-            </w:r>
-          </w:p>
-          <w:p>
-            <w:pPr>
-              <w:rPr>
-                <w:rFonts w:ascii="Verdana" w:hAnsi="Verdana"/>
-                <w:lang w:val="en-US"/>
-              </w:rPr>
-              <w:spacing w:after="80"/>
-              <w:keepNext w:val="0"/>
-              <w:keepLines w:val="1"/>
-            </w:pPr>
-            <w:r>
-              <w:rPr>
-                <w:rFonts w:ascii="Verdana" w:hAnsi="Verdana"/>
-                <w:lang w:val="en-US"/>
-              </w:rPr>
-              <w:t>Beneficio del ejercicio: observar qué se guarda, quién puede consultarlo y qué daño surgiría con datos reales. De ahí se obtienen un inventario, ocho riesgos concretos, restricciones comprobables y una decisión condicionada.</w:t>
-            </w:r>
-          </w:p>
-          <w:p>
-            <w:pPr>
-              <w:rPr>
-                <w:rFonts w:ascii="Verdana" w:hAnsi="Verdana"/>
-                <w:lang w:val="en-US"/>
-              </w:rPr>
-              <w:spacing w:after="0"/>
-              <w:keepNext w:val="0"/>
-              <w:keepLines w:val="1"/>
-            </w:pPr>
-            <w:r>
-              <w:rPr>
-                <w:rFonts w:ascii="Verdana" w:hAnsi="Verdana"/>
-                <w:lang w:val="en-US"/>
-              </w:rPr>
-              <w:t>Límites: no hay publicidad, venta, perfiles ni usos secundarios. El teléfono no tiene utilidad operativa. La obligación académica de incluir nombres, apellidos y correo no demuestra que esos campos sean necesarios en cualquier servicio futuro; una finalidad nueva requiere revisar necesidad, base y riesgos.</w:t>
+              <w:spacing w:after="100"/>
+              <w:keepNext w:val="0"/>
+              <w:keepLines w:val="1"/>
+            </w:pPr>
+            <w:r>
+              <w:rPr>
+                <w:rFonts w:ascii="Verdana" w:hAnsi="Verdana"/>
+                <w:lang w:val="es-PE"/>
+                <w:b w:val="1"/>
+              </w:rPr>
+              <w:t xml:space="preserve">Finalidad:</w:t>
+            </w:r>
+            <w:r>
+              <w:rPr>
+                <w:rFonts w:ascii="Verdana" w:hAnsi="Verdana"/>
+                <w:lang w:val="es-PE"/>
+                <w:b w:val="0"/>
+              </w:rPr>
+              <w:t xml:space="preserve"> demostrar registro, persistencia y consulta de contactos y utilizar el backend como objeto de una evaluación de privacidad. No se crean cuentas ni se envían mensajes; tampoco se administra un directorio real.</w:t>
+            </w:r>
+          </w:p>
+          <w:p>
+            <w:pPr>
+              <w:rPr>
+                <w:rFonts w:ascii="Verdana" w:hAnsi="Verdana"/>
+                <w:lang w:val="en-US"/>
+              </w:rPr>
+              <w:spacing w:after="100"/>
+              <w:keepNext w:val="0"/>
+              <w:keepLines w:val="1"/>
+            </w:pPr>
+            <w:r>
+              <w:rPr>
+                <w:rFonts w:ascii="Verdana" w:hAnsi="Verdana"/>
+                <w:lang w:val="es-PE"/>
+                <w:b w:val="1"/>
+              </w:rPr>
+              <w:t xml:space="preserve">Beneficio del ejercicio:</w:t>
+            </w:r>
+            <w:r>
+              <w:rPr>
+                <w:rFonts w:ascii="Verdana" w:hAnsi="Verdana"/>
+                <w:lang w:val="es-PE"/>
+                <w:b w:val="0"/>
+              </w:rPr>
+              <w:t xml:space="preserve"> observar qué se guarda, quién puede consultarlo y qué daño surgiría con datos reales. De ahí se obtienen un inventario, ocho riesgos concretos, restricciones comprobables y una decisión condicionada.</w:t>
+            </w:r>
+          </w:p>
+          <w:p>
+            <w:pPr>
+              <w:rPr>
+                <w:rFonts w:ascii="Verdana" w:hAnsi="Verdana"/>
+                <w:lang w:val="en-US"/>
+              </w:rPr>
+              <w:spacing w:after="0"/>
+              <w:keepNext w:val="0"/>
+              <w:keepLines w:val="1"/>
+            </w:pPr>
+            <w:r>
+              <w:rPr>
+                <w:rFonts w:ascii="Verdana" w:hAnsi="Verdana"/>
+                <w:lang w:val="es-PE"/>
+                <w:b w:val="1"/>
+              </w:rPr>
+              <w:t xml:space="preserve">Límites:</w:t>
+            </w:r>
+            <w:r>
+              <w:rPr>
+                <w:rFonts w:ascii="Verdana" w:hAnsi="Verdana"/>
+                <w:lang w:val="es-PE"/>
+                <w:b w:val="0"/>
+              </w:rPr>
+              <w:t xml:space="preserve"> no hay publicidad, venta, perfiles ni usos secundarios. El teléfono no tiene utilidad operativa. La obligación académica de incluir nombres, apellidos y correo no demuestra que esos campos sean necesarios en cualquier servicio futuro; una finalidad nueva requiere revisar necesidad, base y riesgos.</w:t>
             </w:r>
           </w:p>
         </w:tc>
@@ -2833,6 +3034,7 @@
         <w:rPr>
           <w:lang w:eastAsia="en-GB"/>
         </w:rPr>
+        <w:pageBreakBefore/>
       </w:pPr>
       <w:r>
         <w:rPr>
@@ -2893,12 +3095,138 @@
           </w:tcPr>
           <w:p>
             <w:pPr>
-              <w:spacing w:before="120" w:after="120"/>
-              <w:rPr>
-                <w:rFonts w:ascii="Verdana" w:hAnsi="Verdana"/>
-                <w:lang w:val="en-US"/>
-              </w:rPr>
-            </w:pPr>
+              <w:rPr>
+                <w:rFonts w:ascii="Verdana" w:hAnsi="Verdana"/>
+                <w:lang w:val="en-US"/>
+              </w:rPr>
+              <w:spacing w:after="100"/>
+              <w:keepNext w:val="0"/>
+              <w:keepLines w:val="1"/>
+            </w:pPr>
+            <w:r>
+              <w:rPr>
+                <w:rFonts w:ascii="Verdana" w:hAnsi="Verdana"/>
+                <w:lang w:val="es-PE"/>
+                <w:b w:val="1"/>
+              </w:rPr>
+              <w:t xml:space="preserve">Consulta a titulares:</w:t>
+            </w:r>
+            <w:r>
+              <w:rPr>
+                <w:rFonts w:ascii="Verdana" w:hAnsi="Verdana"/>
+                <w:lang w:val="es-PE"/>
+                <w:b w:val="0"/>
+              </w:rPr>
+              <w:t xml:space="preserve"> las pruebas actuales emplean personas inventadas, por lo que no existe una población real a la que atribuir opiniones. Antes de admitir datos reales se realizarán sesiones voluntarias para comprobar que se entienden la finalidad, los campos solicitados, quién puede consultar los registros, el plazo de conservación y el modo de ejercer derechos.</w:t>
+            </w:r>
+          </w:p>
+          <w:p>
+            <w:pPr>
+              <w:rPr>
+                <w:rFonts w:ascii="Verdana" w:hAnsi="Verdana"/>
+                <w:lang w:val="en-US"/>
+              </w:rPr>
+              <w:spacing w:after="100"/>
+              <w:keepNext w:val="0"/>
+              <w:keepLines w:val="1"/>
+            </w:pPr>
+            <w:r>
+              <w:rPr>
+                <w:rFonts w:ascii="Verdana" w:hAnsi="Verdana"/>
+                <w:lang w:val="es-PE"/>
+                <w:b w:val="1"/>
+              </w:rPr>
+              <w:t xml:space="preserve">Revisión cruzada del curso:</w:t>
+            </w:r>
+            <w:r>
+              <w:rPr>
+                <w:rFonts w:ascii="Verdana" w:hAnsi="Verdana"/>
+                <w:lang w:val="es-PE"/>
+                <w:b w:val="0"/>
+              </w:rPr>
+              <w:t xml:space="preserve"> se solicitará a otro grupo que examine la DPIA y el repositorio con los seis criterios de la presentación: inventario, riesgo faltante, puntuación, restricciones verificables, transparencia y decisión. Se le pedirá contrastar el listado y dos restricciones con su prueba de aceptación. Los comentarios recibidos se documentarán con el hallazgo, su impacto y el ajuste acordado.</w:t>
+            </w:r>
+          </w:p>
+          <w:p>
+            <w:pPr>
+              <w:rPr>
+                <w:rFonts w:ascii="Verdana" w:hAnsi="Verdana"/>
+                <w:lang w:val="en-US"/>
+              </w:rPr>
+              <w:spacing w:after="100"/>
+              <w:keepNext w:val="0"/>
+              <w:keepLines w:val="1"/>
+            </w:pPr>
+            <w:r>
+              <w:rPr>
+                <w:rFonts w:ascii="Verdana" w:hAnsi="Verdana"/>
+                <w:lang w:val="es-PE"/>
+                <w:b w:val="1"/>
+              </w:rPr>
+              <w:t xml:space="preserve">Revisión técnica individual:</w:t>
+            </w:r>
+            <w:r>
+              <w:rPr>
+                <w:rFonts w:ascii="Verdana" w:hAnsi="Verdana"/>
+                <w:lang w:val="es-PE"/>
+                <w:b w:val="0"/>
+              </w:rPr>
+              <w:t xml:space="preserve"> el autor comprobará los recorridos de alta y listado con datos ficticios, el aislamiento exigido por C01 y C06, y la relación entre cada riesgo y su restricción. Se distinguirán las observaciones reproducidas de las condiciones aprobadas para una implementación posterior.</w:t>
+            </w:r>
+          </w:p>
+          <w:p>
+            <w:pPr>
+              <w:rPr>
+                <w:rFonts w:ascii="Verdana" w:hAnsi="Verdana"/>
+                <w:lang w:val="en-US"/>
+              </w:rPr>
+              <w:spacing w:after="100"/>
+              <w:keepNext w:val="0"/>
+              <w:keepLines w:val="1"/>
+            </w:pPr>
+            <w:r>
+              <w:rPr>
+                <w:rFonts w:ascii="Verdana" w:hAnsi="Verdana"/>
+                <w:lang w:val="es-PE"/>
+                <w:b w:val="1"/>
+              </w:rPr>
+              <w:t xml:space="preserve">Participación docente y especializada:</w:t>
+            </w:r>
+            <w:r>
+              <w:rPr>
+                <w:rFonts w:ascii="Verdana" w:hAnsi="Verdana"/>
+                <w:lang w:val="es-PE"/>
+                <w:b w:val="0"/>
+              </w:rPr>
+              <w:t xml:space="preserve"> las dudas sobre necesidad de campos, valoración de impacto o alcance del tratamiento se someterán al docente. Si se plantea un servicio real, se solicitará revisión de privacidad y seguridad antes de cerrar la base del tratamiento, el aviso y la aceptación de riesgos. No se incorpora un dictamen de DPO a esta ficha.</w:t>
+            </w:r>
+          </w:p>
+          <w:p>
+            <w:pPr>
+              <w:rPr>
+                <w:rFonts w:ascii="Verdana" w:hAnsi="Verdana"/>
+                <w:lang w:val="en-US"/>
+              </w:rPr>
+              <w:spacing w:after="0"/>
+              <w:keepNext w:val="0"/>
+              <w:keepLines w:val="1"/>
+            </w:pPr>
+            <w:r>
+              <w:rPr>
+                <w:rFonts w:ascii="Verdana" w:hAnsi="Verdana"/>
+                <w:lang w:val="es-PE"/>
+                <w:b w:val="1"/>
+              </w:rPr>
+              <w:t xml:space="preserve">Proveedores y seguimiento:</w:t>
+            </w:r>
+            <w:r>
+              <w:rPr>
+                <w:rFonts w:ascii="Verdana" w:hAnsi="Verdana"/>
+                <w:lang w:val="es-PE"/>
+                <w:b w:val="0"/>
+              </w:rPr>
+              <w:t xml:space="preserve"> el backend evaluado es local y no tiene un encargado externo al que consultar. Un traslado a nube requerirá revisar región, accesos, conservación, copias y condiciones del proveedor. Cada consulta deberá quedar vinculada a una decisión y a la versión del diseño afectada; la DPIA se revisará si cambian los datos, la finalidad o la tecnología.</w:t>
+            </w:r>
           </w:p>
         </w:tc>
       </w:tr>
@@ -2991,70 +3319,160 @@
                 <w:rFonts w:ascii="Verdana" w:hAnsi="Verdana"/>
                 <w:lang w:val="en-US"/>
               </w:rPr>
-              <w:spacing w:after="80"/>
-              <w:keepNext w:val="0"/>
-              <w:keepLines w:val="1"/>
-            </w:pPr>
-            <w:r>
-              <w:rPr>
-                <w:rFonts w:ascii="Verdana" w:hAnsi="Verdana"/>
-                <w:lang w:val="en-US"/>
-              </w:rPr>
-              <w:t>Base y finalidad: la práctica utiliza datos ficticios con una finalidad académica. El registro permite observar persistencia y consulta; el listado abierto no es necesario para demostrar esas funciones. C04 exige definir y documentar una base antes de recolectar datos reales.</w:t>
-            </w:r>
-          </w:p>
-          <w:p>
-            <w:pPr>
-              <w:rPr>
-                <w:rFonts w:ascii="Verdana" w:hAnsi="Verdana"/>
-                <w:lang w:val="en-US"/>
-              </w:rPr>
-              <w:spacing w:after="80"/>
-              <w:keepNext w:val="0"/>
-              <w:keepLines w:val="1"/>
-            </w:pPr>
-            <w:r>
-              <w:rPr>
-                <w:rFonts w:ascii="Verdana" w:hAnsi="Verdana"/>
-                <w:lang w:val="en-US"/>
-              </w:rPr>
-              <w:t>Minimización y calidad: C03 elimina teléfono si no existe una finalidad necesaria. Nombres y apellidos se conservan en el ejercicio por el enunciado; para un servicio real se debe valorar si bastan menos datos. C07 validaría formato y unicidad del correo, sin confundir validación con prueba de identidad.</w:t>
-            </w:r>
-          </w:p>
-          <w:p>
-            <w:pPr>
-              <w:rPr>
-                <w:rFonts w:ascii="Verdana" w:hAnsi="Verdana"/>
-                <w:lang w:val="en-US"/>
-              </w:rPr>
-              <w:spacing w:after="80"/>
-              <w:keepNext w:val="0"/>
-              <w:keepLines w:val="1"/>
-            </w:pPr>
-            <w:r>
-              <w:rPr>
-                <w:rFonts w:ascii="Verdana" w:hAnsi="Verdana"/>
-                <w:lang w:val="en-US"/>
-              </w:rPr>
-              <w:t>Transparencia y derechos: C04 propone aviso breve y política versionada con finalidad, destinatarios, campos obligatorios, plazo y contacto para ejercer derechos. El consentimiento, cuando sea la base elegida, se registra por finalidad y versión. C06 prevé acceso, corrección, borrado y exportación autenticados, con pruebas de aislamiento.</w:t>
-            </w:r>
-          </w:p>
-          <w:p>
-            <w:pPr>
-              <w:rPr>
-                <w:rFonts w:ascii="Verdana" w:hAnsi="Verdana"/>
-                <w:lang w:val="en-US"/>
-              </w:rPr>
-              <w:spacing w:after="0"/>
-              <w:keepNext w:val="0"/>
-              <w:keepLines w:val="1"/>
-            </w:pPr>
-            <w:r>
-              <w:rPr>
-                <w:rFonts w:ascii="Verdana" w:hAnsi="Verdana"/>
-                <w:lang w:val="en-US"/>
-              </w:rPr>
-              <w:t>Conservación y seguridad: C01–C02 limitarían acceso y cifrarían contactos; C05 fijaría borrado diario a los 30 días; C08 aportaría auditoría y respuesta a incidentes. No hay encargados externos ni transferencias en este flujo local. Un cambio de finalidad, datos o tecnología exige revisar la DPIA. Todas estas medidas siguen siendo propuestas.</w:t>
+              <w:spacing w:after="100"/>
+              <w:keepNext w:val="0"/>
+              <w:keepLines w:val="1"/>
+            </w:pPr>
+            <w:r>
+              <w:rPr>
+                <w:rFonts w:ascii="Verdana" w:hAnsi="Verdana"/>
+                <w:lang w:val="es-PE"/>
+                <w:b w:val="1"/>
+              </w:rPr>
+              <w:t xml:space="preserve">Base prevista y alcance:</w:t>
+            </w:r>
+            <w:r>
+              <w:rPr>
+                <w:rFonts w:ascii="Verdana" w:hAnsi="Verdana"/>
+                <w:lang w:val="es-PE"/>
+                <w:b w:val="0"/>
+              </w:rPr>
+              <w:t xml:space="preserve"> la práctica actual utiliza datos ficticios. Para un eventual registro voluntario se adopta como base de diseño el consentimiento previo, informado, expreso e inequívoco, con retiro disponible; se documentará antes del primer dato real (Ley 29733, arts. 13.5 y 13.7). Esta elección no sustituye la justificación de necesidad ni autoriza usos adicionales.</w:t>
+            </w:r>
+          </w:p>
+          <w:p>
+            <w:pPr>
+              <w:rPr>
+                <w:rFonts w:ascii="Verdana" w:hAnsi="Verdana"/>
+                <w:lang w:val="en-US"/>
+              </w:rPr>
+              <w:spacing w:after="100"/>
+              <w:keepNext w:val="0"/>
+              <w:keepLines w:val="1"/>
+            </w:pPr>
+            <w:r>
+              <w:rPr>
+                <w:rFonts w:ascii="Verdana" w:hAnsi="Verdana"/>
+                <w:lang w:val="es-PE"/>
+                <w:b w:val="1"/>
+              </w:rPr>
+              <w:t xml:space="preserve">Necesidad y alternativas:</w:t>
+            </w:r>
+            <w:r>
+              <w:rPr>
+                <w:rFonts w:ascii="Verdana" w:hAnsi="Verdana"/>
+                <w:lang w:val="es-PE"/>
+                <w:b w:val="0"/>
+              </w:rPr>
+              <w:t xml:space="preserve"> la persistencia permite observar registro y consulta, pero el listado público completo no es necesario. Nombres, apellidos y correo reproducen el enunciado; antes de un servicio real se deberá valorar si bastan identificadores menos precisos o menos campos. C03 exige eliminar el teléfono mientras no exista una finalidad necesaria.</w:t>
+            </w:r>
+          </w:p>
+          <w:p>
+            <w:pPr>
+              <w:rPr>
+                <w:rFonts w:ascii="Verdana" w:hAnsi="Verdana"/>
+                <w:lang w:val="en-US"/>
+              </w:rPr>
+              <w:spacing w:after="100"/>
+              <w:keepNext w:val="0"/>
+              <w:keepLines w:val="1"/>
+            </w:pPr>
+            <w:r>
+              <w:rPr>
+                <w:rFonts w:ascii="Verdana" w:hAnsi="Verdana"/>
+                <w:lang w:val="es-PE"/>
+                <w:b w:val="1"/>
+              </w:rPr>
+              <w:t xml:space="preserve">Calidad de los datos:</w:t>
+            </w:r>
+            <w:r>
+              <w:rPr>
+                <w:rFonts w:ascii="Verdana" w:hAnsi="Verdana"/>
+                <w:lang w:val="es-PE"/>
+                <w:b w:val="0"/>
+              </w:rPr>
+              <w:t xml:space="preserve"> C07 exige texto no vacío, formato y normalización del correo, además de unicidad. Las pruebas deberán rechazar formatos inválidos y duplicados. Validar una dirección no demuestra por sí solo quién es su titular; no se atribuirán decisiones sobre personas a una identidad sin verificar.</w:t>
+            </w:r>
+          </w:p>
+          <w:p>
+            <w:pPr>
+              <w:rPr>
+                <w:rFonts w:ascii="Verdana" w:hAnsi="Verdana"/>
+                <w:lang w:val="en-US"/>
+              </w:rPr>
+              <w:spacing w:after="100"/>
+              <w:keepNext w:val="0"/>
+              <w:keepLines w:val="1"/>
+            </w:pPr>
+            <w:r>
+              <w:rPr>
+                <w:rFonts w:ascii="Verdana" w:hAnsi="Verdana"/>
+                <w:lang w:val="es-PE"/>
+                <w:b w:val="1"/>
+              </w:rPr>
+              <w:t xml:space="preserve">Información y consentimiento:</w:t>
+            </w:r>
+            <w:r>
+              <w:rPr>
+                <w:rFonts w:ascii="Verdana" w:hAnsi="Verdana"/>
+                <w:lang w:val="es-PE"/>
+                <w:b w:val="0"/>
+              </w:rPr>
+              <w:t xml:space="preserve"> C04 exige aviso breve junto a la recogida y política accesible y versionada. Debe indicar identidad y domicilio de quien trata los datos, finalidad, destinatarios, banco, campos obligatorios, consecuencias de no responder, transferencias, conservación y vías de derechos (art. 18). El consentimiento se registra por finalidad, versión y fecha, sin casillas premarcadas; un nuevo uso requiere una revisión independiente.</w:t>
+            </w:r>
+          </w:p>
+          <w:p>
+            <w:pPr>
+              <w:rPr>
+                <w:rFonts w:ascii="Verdana" w:hAnsi="Verdana"/>
+                <w:lang w:val="en-US"/>
+              </w:rPr>
+              <w:spacing w:after="100"/>
+              <w:keepNext w:val="0"/>
+              <w:keepLines w:val="1"/>
+            </w:pPr>
+            <w:r>
+              <w:rPr>
+                <w:rFonts w:ascii="Verdana" w:hAnsi="Verdana"/>
+                <w:lang w:val="es-PE"/>
+                <w:b w:val="1"/>
+              </w:rPr>
+              <w:t xml:space="preserve">Derechos y conservación:</w:t>
+            </w:r>
+            <w:r>
+              <w:rPr>
+                <w:rFonts w:ascii="Verdana" w:hAnsi="Verdana"/>
+                <w:lang w:val="es-PE"/>
+                <w:b w:val="0"/>
+              </w:rPr>
+              <w:t xml:space="preserve"> C06 exige acceso propio, corrección, eliminación y exportación autenticados; otro titular no debe poder operar sobre datos ajenos. También deberá existir una vía para retirar el consentimiento. C05 limita la conservación a 30 días desde el alta, con borrado diario y vencimiento de copias, como plazo de diseño justificado para evaluación y correcciones.</w:t>
+            </w:r>
+          </w:p>
+          <w:p>
+            <w:pPr>
+              <w:rPr>
+                <w:rFonts w:ascii="Verdana" w:hAnsi="Verdana"/>
+                <w:lang w:val="en-US"/>
+              </w:rPr>
+              <w:spacing w:after="0"/>
+              <w:keepNext w:val="0"/>
+              <w:keepLines w:val="1"/>
+            </w:pPr>
+            <w:r>
+              <w:rPr>
+                <w:rFonts w:ascii="Verdana" w:hAnsi="Verdana"/>
+                <w:lang w:val="es-PE"/>
+                <w:b w:val="1"/>
+              </w:rPr>
+              <w:t xml:space="preserve">Seguridad y cambios:</w:t>
+            </w:r>
+            <w:r>
+              <w:rPr>
+                <w:rFonts w:ascii="Verdana" w:hAnsi="Verdana"/>
+                <w:lang w:val="es-PE"/>
+                <w:b w:val="0"/>
+              </w:rPr>
+              <w:t xml:space="preserve"> C01 limita acceso y oculta contactos; C02 exige cifrado autenticado y claves separadas; C08 establece auditoría y respuesta a incidentes. No hay encargados externos ni transferencias en el flujo local. Antes de cambiar alojamiento o destinatarios se revisarán sus condiciones. Las medidas están aprobadas como exigencias del diseño; su implementación y prueba son condiciones de lanzamiento.</w:t>
             </w:r>
           </w:p>
         </w:tc>
@@ -3240,8 +3658,17 @@
               <w:rPr>
                 <w:rFonts w:ascii="Verdana" w:hAnsi="Verdana"/>
                 <w:lang w:val="es-PE"/>
-              </w:rPr>
-              <w:t>R1 El listado completo expone nombres y contactos a cualquier cliente del servicio; puede facilitar contacto no deseado o suplantación. Divulgación.</w:t>
+                <w:b w:val="1"/>
+              </w:rPr>
+              <w:t xml:space="preserve">R1</w:t>
+            </w:r>
+            <w:r>
+              <w:rPr>
+                <w:rFonts w:ascii="Verdana" w:hAnsi="Verdana"/>
+                <w:lang w:val="es-PE"/>
+                <w:b w:val="0"/>
+              </w:rPr>
+              <w:t xml:space="preserve"> El listado completo expone nombres y contactos a cualquier cliente del servicio; puede facilitar contacto no deseado o suplantación. Divulgación.</w:t>
             </w:r>
           </w:p>
         </w:tc>
@@ -3264,9 +3691,10 @@
               <w:rPr>
                 <w:rFonts w:ascii="Verdana" w:hAnsi="Verdana"/>
                 <w:sz w:val="22"/>
-                <w:lang w:val="en-US"/>
-              </w:rPr>
-              <w:t>Alta (3)</w:t>
+                <w:lang w:val="es-PE"/>
+                <w:b w:val="0"/>
+              </w:rPr>
+              <w:t xml:space="preserve">Alta (3)</w:t>
             </w:r>
           </w:p>
         </w:tc>
@@ -3289,9 +3717,10 @@
               <w:rPr>
                 <w:rFonts w:ascii="Verdana" w:hAnsi="Verdana"/>
                 <w:sz w:val="22"/>
-                <w:lang w:val="en-US"/>
-              </w:rPr>
-              <w:t>Alto (3)</w:t>
+                <w:lang w:val="es-PE"/>
+                <w:b w:val="0"/>
+              </w:rPr>
+              <w:t xml:space="preserve">Alto (3)</w:t>
             </w:r>
           </w:p>
         </w:tc>
@@ -3314,9 +3743,10 @@
               <w:rPr>
                 <w:rFonts w:ascii="Verdana" w:hAnsi="Verdana"/>
                 <w:sz w:val="22"/>
-                <w:lang w:val="en-US"/>
-              </w:rPr>
-              <w:t>Alto (9)</w:t>
+                <w:lang w:val="es-PE"/>
+                <w:b w:val="0"/>
+              </w:rPr>
+              <w:t xml:space="preserve">Alto (9)</w:t>
             </w:r>
           </w:p>
         </w:tc>
@@ -3343,8 +3773,17 @@
               <w:rPr>
                 <w:rFonts w:ascii="Verdana" w:hAnsi="Verdana"/>
                 <w:lang w:val="es-PE"/>
-              </w:rPr>
-              <w:t>R2 Una copia de lab.db revela contactos legibles sin pasar por la API; permite su reutilización no autorizada. Divulgación.</w:t>
+                <w:b w:val="1"/>
+              </w:rPr>
+              <w:t xml:space="preserve">R2</w:t>
+            </w:r>
+            <w:r>
+              <w:rPr>
+                <w:rFonts w:ascii="Verdana" w:hAnsi="Verdana"/>
+                <w:lang w:val="es-PE"/>
+                <w:b w:val="0"/>
+              </w:rPr>
+              <w:t xml:space="preserve"> Una copia de lab.db revela contactos legibles sin pasar por la API; permite su reutilización no autorizada. Divulgación.</w:t>
             </w:r>
           </w:p>
         </w:tc>
@@ -3367,9 +3806,10 @@
               <w:rPr>
                 <w:rFonts w:ascii="Verdana" w:hAnsi="Verdana"/>
                 <w:sz w:val="22"/>
-                <w:lang w:val="en-US"/>
-              </w:rPr>
-              <w:t>Media (2)</w:t>
+                <w:lang w:val="es-PE"/>
+                <w:b w:val="0"/>
+              </w:rPr>
+              <w:t xml:space="preserve">Media (2)</w:t>
             </w:r>
           </w:p>
         </w:tc>
@@ -3392,9 +3832,10 @@
               <w:rPr>
                 <w:rFonts w:ascii="Verdana" w:hAnsi="Verdana"/>
                 <w:sz w:val="22"/>
-                <w:lang w:val="en-US"/>
-              </w:rPr>
-              <w:t>Alto (3)</w:t>
+                <w:lang w:val="es-PE"/>
+                <w:b w:val="0"/>
+              </w:rPr>
+              <w:t xml:space="preserve">Alto (3)</w:t>
             </w:r>
           </w:p>
         </w:tc>
@@ -3417,9 +3858,10 @@
               <w:rPr>
                 <w:rFonts w:ascii="Verdana" w:hAnsi="Verdana"/>
                 <w:sz w:val="22"/>
-                <w:lang w:val="en-US"/>
-              </w:rPr>
-              <w:t>Alto (6)</w:t>
+                <w:lang w:val="es-PE"/>
+                <w:b w:val="0"/>
+              </w:rPr>
+              <w:t xml:space="preserve">Alto (6)</w:t>
             </w:r>
           </w:p>
         </w:tc>
@@ -3446,8 +3888,17 @@
               <w:rPr>
                 <w:rFonts w:ascii="Verdana" w:hAnsi="Verdana"/>
                 <w:lang w:val="es-PE"/>
-              </w:rPr>
-              <w:t>R3 Se recopila y expone teléfono opcional sin necesidad demostrada, aumentando la información vinculable a una persona. Incumplimiento y vinculación.</w:t>
+                <w:b w:val="1"/>
+              </w:rPr>
+              <w:t xml:space="preserve">R3</w:t>
+            </w:r>
+            <w:r>
+              <w:rPr>
+                <w:rFonts w:ascii="Verdana" w:hAnsi="Verdana"/>
+                <w:lang w:val="es-PE"/>
+                <w:b w:val="0"/>
+              </w:rPr>
+              <w:t xml:space="preserve"> Se recopila y expone teléfono opcional sin necesidad demostrada, aumentando la información vinculable a una persona. Incumplimiento y vinculación.</w:t>
             </w:r>
           </w:p>
         </w:tc>
@@ -3470,9 +3921,10 @@
               <w:rPr>
                 <w:rFonts w:ascii="Verdana" w:hAnsi="Verdana"/>
                 <w:sz w:val="22"/>
-                <w:lang w:val="en-US"/>
-              </w:rPr>
-              <w:t>Alta (3)</w:t>
+                <w:lang w:val="es-PE"/>
+                <w:b w:val="0"/>
+              </w:rPr>
+              <w:t xml:space="preserve">Alta (3)</w:t>
             </w:r>
           </w:p>
         </w:tc>
@@ -3495,9 +3947,10 @@
               <w:rPr>
                 <w:rFonts w:ascii="Verdana" w:hAnsi="Verdana"/>
                 <w:sz w:val="22"/>
-                <w:lang w:val="en-US"/>
-              </w:rPr>
-              <w:t>Bajo (1)</w:t>
+                <w:lang w:val="es-PE"/>
+                <w:b w:val="0"/>
+              </w:rPr>
+              <w:t xml:space="preserve">Bajo (1)</w:t>
             </w:r>
           </w:p>
         </w:tc>
@@ -3520,9 +3973,10 @@
               <w:rPr>
                 <w:rFonts w:ascii="Verdana" w:hAnsi="Verdana"/>
                 <w:sz w:val="22"/>
-                <w:lang w:val="en-US"/>
-              </w:rPr>
-              <w:t>Medio (3)</w:t>
+                <w:lang w:val="es-PE"/>
+                <w:b w:val="0"/>
+              </w:rPr>
+              <w:t xml:space="preserve">Medio (3)</w:t>
             </w:r>
           </w:p>
         </w:tc>
@@ -3549,8 +4003,17 @@
               <w:rPr>
                 <w:rFonts w:ascii="Verdana" w:hAnsi="Verdana"/>
                 <w:lang w:val="es-PE"/>
-              </w:rPr>
-              <w:t>R4 La ausencia de aviso completo y base documentada impide conocer finalidad, acceso y conservación. Falta de conocimiento.</w:t>
+                <w:b w:val="1"/>
+              </w:rPr>
+              <w:t xml:space="preserve">R4</w:t>
+            </w:r>
+            <w:r>
+              <w:rPr>
+                <w:rFonts w:ascii="Verdana" w:hAnsi="Verdana"/>
+                <w:lang w:val="es-PE"/>
+                <w:b w:val="0"/>
+              </w:rPr>
+              <w:t xml:space="preserve"> Sin aviso completo ni registro de consentimiento, no se informa al titular ni se acredita su autorización. Falta de conocimiento e incumplimiento.</w:t>
             </w:r>
           </w:p>
         </w:tc>
@@ -3573,9 +4036,10 @@
               <w:rPr>
                 <w:rFonts w:ascii="Verdana" w:hAnsi="Verdana"/>
                 <w:sz w:val="22"/>
-                <w:lang w:val="en-US"/>
-              </w:rPr>
-              <w:t>Alta (3)</w:t>
+                <w:lang w:val="es-PE"/>
+                <w:b w:val="0"/>
+              </w:rPr>
+              <w:t xml:space="preserve">Alta (3)</w:t>
             </w:r>
           </w:p>
         </w:tc>
@@ -3598,9 +4062,10 @@
               <w:rPr>
                 <w:rFonts w:ascii="Verdana" w:hAnsi="Verdana"/>
                 <w:sz w:val="22"/>
-                <w:lang w:val="en-US"/>
-              </w:rPr>
-              <w:t>Medio (2)</w:t>
+                <w:lang w:val="es-PE"/>
+                <w:b w:val="0"/>
+              </w:rPr>
+              <w:t xml:space="preserve">Medio (2)</w:t>
             </w:r>
           </w:p>
         </w:tc>
@@ -3623,9 +4088,10 @@
               <w:rPr>
                 <w:rFonts w:ascii="Verdana" w:hAnsi="Verdana"/>
                 <w:sz w:val="22"/>
-                <w:lang w:val="en-US"/>
-              </w:rPr>
-              <w:t>Alto (6)</w:t>
+                <w:lang w:val="es-PE"/>
+                <w:b w:val="0"/>
+              </w:rPr>
+              <w:t xml:space="preserve">Alto (6)</w:t>
             </w:r>
           </w:p>
         </w:tc>
@@ -3652,8 +4118,17 @@
               <w:rPr>
                 <w:rFonts w:ascii="Verdana" w:hAnsi="Verdana"/>
                 <w:lang w:val="es-PE"/>
-              </w:rPr>
-              <w:t>R5 No hay plazo ni borrado automático; los contactos siguen expuestos después de terminar su finalidad. Incumplimiento.</w:t>
+                <w:b w:val="1"/>
+              </w:rPr>
+              <w:t xml:space="preserve">R5</w:t>
+            </w:r>
+            <w:r>
+              <w:rPr>
+                <w:rFonts w:ascii="Verdana" w:hAnsi="Verdana"/>
+                <w:lang w:val="es-PE"/>
+                <w:b w:val="0"/>
+              </w:rPr>
+              <w:t xml:space="preserve"> No hay plazo ni borrado automático; los contactos siguen expuestos después de terminar su finalidad. Incumplimiento.</w:t>
             </w:r>
           </w:p>
         </w:tc>
@@ -3676,9 +4151,10 @@
               <w:rPr>
                 <w:rFonts w:ascii="Verdana" w:hAnsi="Verdana"/>
                 <w:sz w:val="22"/>
-                <w:lang w:val="en-US"/>
-              </w:rPr>
-              <w:t>Alta (3)</w:t>
+                <w:lang w:val="es-PE"/>
+                <w:b w:val="0"/>
+              </w:rPr>
+              <w:t xml:space="preserve">Alta (3)</w:t>
             </w:r>
           </w:p>
         </w:tc>
@@ -3701,9 +4177,10 @@
               <w:rPr>
                 <w:rFonts w:ascii="Verdana" w:hAnsi="Verdana"/>
                 <w:sz w:val="22"/>
-                <w:lang w:val="en-US"/>
-              </w:rPr>
-              <w:t>Medio (2)</w:t>
+                <w:lang w:val="es-PE"/>
+                <w:b w:val="0"/>
+              </w:rPr>
+              <w:t xml:space="preserve">Medio (2)</w:t>
             </w:r>
           </w:p>
         </w:tc>
@@ -3726,9 +4203,10 @@
               <w:rPr>
                 <w:rFonts w:ascii="Verdana" w:hAnsi="Verdana"/>
                 <w:sz w:val="22"/>
-                <w:lang w:val="en-US"/>
-              </w:rPr>
-              <w:t>Alto (6)</w:t>
+                <w:lang w:val="es-PE"/>
+                <w:b w:val="0"/>
+              </w:rPr>
+              <w:t xml:space="preserve">Alto (6)</w:t>
             </w:r>
           </w:p>
         </w:tc>
@@ -3755,8 +4233,17 @@
               <w:rPr>
                 <w:rFonts w:ascii="Verdana" w:hAnsi="Verdana"/>
                 <w:lang w:val="es-PE"/>
-              </w:rPr>
-              <w:t>R6 El titular no puede autenticarse para consultar, corregir, eliminar o exportar sus datos. Incumplimiento.</w:t>
+                <w:b w:val="1"/>
+              </w:rPr>
+              <w:t xml:space="preserve">R6</w:t>
+            </w:r>
+            <w:r>
+              <w:rPr>
+                <w:rFonts w:ascii="Verdana" w:hAnsi="Verdana"/>
+                <w:lang w:val="es-PE"/>
+                <w:b w:val="0"/>
+              </w:rPr>
+              <w:t xml:space="preserve"> El titular no puede autenticarse para consultar, corregir, eliminar o exportar sus datos. Incumplimiento.</w:t>
             </w:r>
           </w:p>
         </w:tc>
@@ -3779,9 +4266,10 @@
               <w:rPr>
                 <w:rFonts w:ascii="Verdana" w:hAnsi="Verdana"/>
                 <w:sz w:val="22"/>
-                <w:lang w:val="en-US"/>
-              </w:rPr>
-              <w:t>Alta (3)</w:t>
+                <w:lang w:val="es-PE"/>
+                <w:b w:val="0"/>
+              </w:rPr>
+              <w:t xml:space="preserve">Alta (3)</w:t>
             </w:r>
           </w:p>
         </w:tc>
@@ -3804,9 +4292,10 @@
               <w:rPr>
                 <w:rFonts w:ascii="Verdana" w:hAnsi="Verdana"/>
                 <w:sz w:val="22"/>
-                <w:lang w:val="en-US"/>
-              </w:rPr>
-              <w:t>Medio (2)</w:t>
+                <w:lang w:val="es-PE"/>
+                <w:b w:val="0"/>
+              </w:rPr>
+              <w:t xml:space="preserve">Medio (2)</w:t>
             </w:r>
           </w:p>
         </w:tc>
@@ -3829,9 +4318,10 @@
               <w:rPr>
                 <w:rFonts w:ascii="Verdana" w:hAnsi="Verdana"/>
                 <w:sz w:val="22"/>
-                <w:lang w:val="en-US"/>
-              </w:rPr>
-              <w:t>Alto (6)</w:t>
+                <w:lang w:val="es-PE"/>
+                <w:b w:val="0"/>
+              </w:rPr>
+              <w:t xml:space="preserve">Alto (6)</w:t>
             </w:r>
           </w:p>
         </w:tc>
@@ -3858,8 +4348,17 @@
               <w:rPr>
                 <w:rFonts w:ascii="Verdana" w:hAnsi="Verdana"/>
                 <w:lang w:val="es-PE"/>
-              </w:rPr>
-              <w:t>R7 Se admiten correos repetidos o inválidos; una entrada puede atribuir información incorrecta a otra persona. Incumplimiento.</w:t>
+                <w:b w:val="1"/>
+              </w:rPr>
+              <w:t xml:space="preserve">R7</w:t>
+            </w:r>
+            <w:r>
+              <w:rPr>
+                <w:rFonts w:ascii="Verdana" w:hAnsi="Verdana"/>
+                <w:lang w:val="es-PE"/>
+                <w:b w:val="0"/>
+              </w:rPr>
+              <w:t xml:space="preserve"> Se admiten correos repetidos o inválidos; una entrada puede atribuir información incorrecta a otra persona. Incumplimiento.</w:t>
             </w:r>
           </w:p>
         </w:tc>
@@ -3882,9 +4381,10 @@
               <w:rPr>
                 <w:rFonts w:ascii="Verdana" w:hAnsi="Verdana"/>
                 <w:sz w:val="22"/>
-                <w:lang w:val="en-US"/>
-              </w:rPr>
-              <w:t>Media (2)</w:t>
+                <w:lang w:val="es-PE"/>
+                <w:b w:val="0"/>
+              </w:rPr>
+              <w:t xml:space="preserve">Media (2)</w:t>
             </w:r>
           </w:p>
         </w:tc>
@@ -3907,9 +4407,10 @@
               <w:rPr>
                 <w:rFonts w:ascii="Verdana" w:hAnsi="Verdana"/>
                 <w:sz w:val="22"/>
-                <w:lang w:val="en-US"/>
-              </w:rPr>
-              <w:t>Medio (2)</w:t>
+                <w:lang w:val="es-PE"/>
+                <w:b w:val="0"/>
+              </w:rPr>
+              <w:t xml:space="preserve">Medio (2)</w:t>
             </w:r>
           </w:p>
         </w:tc>
@@ -3932,9 +4433,10 @@
               <w:rPr>
                 <w:rFonts w:ascii="Verdana" w:hAnsi="Verdana"/>
                 <w:sz w:val="22"/>
-                <w:lang w:val="en-US"/>
-              </w:rPr>
-              <w:t>Medio (4)</w:t>
+                <w:lang w:val="es-PE"/>
+                <w:b w:val="0"/>
+              </w:rPr>
+              <w:t xml:space="preserve">Medio (4)</w:t>
             </w:r>
           </w:p>
         </w:tc>
@@ -3961,8 +4463,17 @@
               <w:rPr>
                 <w:rFonts w:ascii="Verdana" w:hAnsi="Verdana"/>
                 <w:lang w:val="es-PE"/>
-              </w:rPr>
-              <w:t>R8 Sin auditoría de accesos ni procedimiento de incidentes, una divulgación puede detectarse tarde y prolongar el daño. Divulgación.</w:t>
+                <w:b w:val="1"/>
+              </w:rPr>
+              <w:t xml:space="preserve">R8</w:t>
+            </w:r>
+            <w:r>
+              <w:rPr>
+                <w:rFonts w:ascii="Verdana" w:hAnsi="Verdana"/>
+                <w:lang w:val="es-PE"/>
+                <w:b w:val="0"/>
+              </w:rPr>
+              <w:t xml:space="preserve"> Sin auditoría de accesos ni procedimiento de incidentes, una divulgación puede detectarse tarde y prolongar el daño. Divulgación.</w:t>
             </w:r>
           </w:p>
         </w:tc>
@@ -3985,9 +4496,10 @@
               <w:rPr>
                 <w:rFonts w:ascii="Verdana" w:hAnsi="Verdana"/>
                 <w:sz w:val="22"/>
-                <w:lang w:val="en-US"/>
-              </w:rPr>
-              <w:t>Media (2)</w:t>
+                <w:lang w:val="es-PE"/>
+                <w:b w:val="0"/>
+              </w:rPr>
+              <w:t xml:space="preserve">Media (2)</w:t>
             </w:r>
           </w:p>
         </w:tc>
@@ -4010,9 +4522,10 @@
               <w:rPr>
                 <w:rFonts w:ascii="Verdana" w:hAnsi="Verdana"/>
                 <w:sz w:val="22"/>
-                <w:lang w:val="en-US"/>
-              </w:rPr>
-              <w:t>Medio (2)</w:t>
+                <w:lang w:val="es-PE"/>
+                <w:b w:val="0"/>
+              </w:rPr>
+              <w:t xml:space="preserve">Medio (2)</w:t>
             </w:r>
           </w:p>
         </w:tc>
@@ -4035,9 +4548,10 @@
               <w:rPr>
                 <w:rFonts w:ascii="Verdana" w:hAnsi="Verdana"/>
                 <w:sz w:val="22"/>
-                <w:lang w:val="en-US"/>
-              </w:rPr>
-              <w:t>Medio (4)</w:t>
+                <w:lang w:val="es-PE"/>
+                <w:b w:val="0"/>
+              </w:rPr>
+              <w:t xml:space="preserve">Medio (4)</w:t>
             </w:r>
           </w:p>
         </w:tc>
@@ -4284,9 +4798,10 @@
             <w:r>
               <w:rPr>
                 <w:rFonts w:ascii="Verdana" w:hAnsi="Verdana"/>
-                <w:lang w:val="en-US"/>
-              </w:rPr>
-              <w:t>R1</w:t>
+                <w:lang w:val="es-PE"/>
+                <w:b w:val="1"/>
+              </w:rPr>
+              <w:t xml:space="preserve">R1</w:t>
             </w:r>
           </w:p>
         </w:tc>
@@ -4307,9 +4822,34 @@
             <w:r>
               <w:rPr>
                 <w:rFonts w:ascii="Verdana" w:hAnsi="Verdana"/>
-                <w:lang w:val="en-US"/>
-              </w:rPr>
-              <w:t>C01 API. Antes del primer dato real: autenticar; limitar el listado global al administrador y ocultar contactos. Prueba: anónimo recibe 401; otro rol, 403; el listado no revela contactos completos.</w:t>
+                <w:lang w:val="es-PE"/>
+                <w:b w:val="1"/>
+              </w:rPr>
+              <w:t xml:space="preserve">C01 API. Antes del primer dato real:</w:t>
+            </w:r>
+            <w:r>
+              <w:rPr>
+                <w:rFonts w:ascii="Verdana" w:hAnsi="Verdana"/>
+                <w:lang w:val="es-PE"/>
+                <w:b w:val="0"/>
+              </w:rPr>
+              <w:t xml:space="preserve"> autenticar; limitar el listado global al administrador y ocultar contactos. </w:t>
+            </w:r>
+            <w:r>
+              <w:rPr>
+                <w:rFonts w:ascii="Verdana" w:hAnsi="Verdana"/>
+                <w:lang w:val="es-PE"/>
+                <w:b w:val="1"/>
+              </w:rPr>
+              <w:t xml:space="preserve">Prueba:</w:t>
+            </w:r>
+            <w:r>
+              <w:rPr>
+                <w:rFonts w:ascii="Verdana" w:hAnsi="Verdana"/>
+                <w:lang w:val="es-PE"/>
+                <w:b w:val="0"/>
+              </w:rPr>
+              <w:t xml:space="preserve"> anónimo recibe 401; otro rol, 403; el listado no revela contactos completos.</w:t>
             </w:r>
           </w:p>
         </w:tc>
@@ -4330,9 +4870,10 @@
             <w:r>
               <w:rPr>
                 <w:rFonts w:ascii="Verdana" w:hAnsi="Verdana"/>
-                <w:lang w:val="en-US"/>
-              </w:rPr>
-              <w:t>Reducción prevista</w:t>
+                <w:lang w:val="es-PE"/>
+                <w:b w:val="0"/>
+              </w:rPr>
+              <w:t xml:space="preserve">Reducido en el diseño</w:t>
             </w:r>
           </w:p>
         </w:tc>
@@ -4353,11 +4894,12 @@
             <w:r>
               <w:rPr>
                 <w:rFonts w:ascii="Verdana" w:hAnsi="Verdana"/>
-                <w:lang w:val="en-US"/>
-              </w:rPr>
-              <w:t>Medio (3)</w:t>
+                <w:lang w:val="es-PE"/>
+                <w:b w:val="0"/>
+              </w:rPr>
+              <w:t xml:space="preserve">Medio (3)</w:t>
               <w:br/>
-              <w:t>P1 × I3</w:t>
+              <w:t xml:space="preserve">P1 × I3</w:t>
             </w:r>
           </w:p>
         </w:tc>
@@ -4378,9 +4920,10 @@
             <w:r>
               <w:rPr>
                 <w:rFonts w:ascii="Verdana" w:hAnsi="Verdana"/>
-                <w:lang w:val="en-US"/>
-              </w:rPr>
-              <w:t>Propuesta</w:t>
+                <w:lang w:val="es-PE"/>
+                <w:b w:val="0"/>
+              </w:rPr>
+              <w:t xml:space="preserve">Sí</w:t>
             </w:r>
           </w:p>
         </w:tc>
@@ -4406,9 +4949,10 @@
             <w:r>
               <w:rPr>
                 <w:rFonts w:ascii="Verdana" w:hAnsi="Verdana"/>
-                <w:lang w:val="en-US"/>
-              </w:rPr>
-              <w:t>R2</w:t>
+                <w:lang w:val="es-PE"/>
+                <w:b w:val="1"/>
+              </w:rPr>
+              <w:t xml:space="preserve">R2</w:t>
             </w:r>
           </w:p>
         </w:tc>
@@ -4429,9 +4973,34 @@
             <w:r>
               <w:rPr>
                 <w:rFonts w:ascii="Verdana" w:hAnsi="Verdana"/>
-                <w:lang w:val="en-US"/>
-              </w:rPr>
-              <w:t>C02 BD/configuración. Antes del primer dato real: cifrar contactos con AES-GCM y separar claves de la BD y Git. Prueba: copia sin contactos legibles, descifrado autorizado y rechazo de datos cifrados alterados.</w:t>
+                <w:lang w:val="es-PE"/>
+                <w:b w:val="1"/>
+              </w:rPr>
+              <w:t xml:space="preserve">C02 BD/configuración. Antes del primer dato real:</w:t>
+            </w:r>
+            <w:r>
+              <w:rPr>
+                <w:rFonts w:ascii="Verdana" w:hAnsi="Verdana"/>
+                <w:lang w:val="es-PE"/>
+                <w:b w:val="0"/>
+              </w:rPr>
+              <w:t xml:space="preserve"> cifrar contactos con AES-GCM y separar claves de la BD y Git. </w:t>
+            </w:r>
+            <w:r>
+              <w:rPr>
+                <w:rFonts w:ascii="Verdana" w:hAnsi="Verdana"/>
+                <w:lang w:val="es-PE"/>
+                <w:b w:val="1"/>
+              </w:rPr>
+              <w:t xml:space="preserve">Prueba:</w:t>
+            </w:r>
+            <w:r>
+              <w:rPr>
+                <w:rFonts w:ascii="Verdana" w:hAnsi="Verdana"/>
+                <w:lang w:val="es-PE"/>
+                <w:b w:val="0"/>
+              </w:rPr>
+              <w:t xml:space="preserve"> copia sin contactos legibles, descifrado autorizado y rechazo de datos cifrados alterados.</w:t>
             </w:r>
           </w:p>
         </w:tc>
@@ -4452,9 +5021,10 @@
             <w:r>
               <w:rPr>
                 <w:rFonts w:ascii="Verdana" w:hAnsi="Verdana"/>
-                <w:lang w:val="en-US"/>
-              </w:rPr>
-              <w:t>Baja probabilidad; impacto alto</w:t>
+                <w:lang w:val="es-PE"/>
+                <w:b w:val="0"/>
+              </w:rPr>
+              <w:t xml:space="preserve">Baja probabilidad; impacto alto</w:t>
             </w:r>
           </w:p>
         </w:tc>
@@ -4475,11 +5045,12 @@
             <w:r>
               <w:rPr>
                 <w:rFonts w:ascii="Verdana" w:hAnsi="Verdana"/>
-                <w:lang w:val="en-US"/>
-              </w:rPr>
-              <w:t>Medio (3)</w:t>
+                <w:lang w:val="es-PE"/>
+                <w:b w:val="0"/>
+              </w:rPr>
+              <w:t xml:space="preserve">Medio (3)</w:t>
               <w:br/>
-              <w:t>P1 × I3</w:t>
+              <w:t xml:space="preserve">P1 × I3</w:t>
             </w:r>
           </w:p>
         </w:tc>
@@ -4500,9 +5071,10 @@
             <w:r>
               <w:rPr>
                 <w:rFonts w:ascii="Verdana" w:hAnsi="Verdana"/>
-                <w:lang w:val="en-US"/>
-              </w:rPr>
-              <w:t>Propuesta</w:t>
+                <w:lang w:val="es-PE"/>
+                <w:b w:val="0"/>
+              </w:rPr>
+              <w:t xml:space="preserve">Sí</w:t>
             </w:r>
           </w:p>
         </w:tc>
@@ -4528,9 +5100,10 @@
             <w:r>
               <w:rPr>
                 <w:rFonts w:ascii="Verdana" w:hAnsi="Verdana"/>
-                <w:lang w:val="en-US"/>
-              </w:rPr>
-              <w:t>R3</w:t>
+                <w:lang w:val="es-PE"/>
+                <w:b w:val="1"/>
+              </w:rPr>
+              <w:t xml:space="preserve">R3</w:t>
             </w:r>
           </w:p>
         </w:tc>
@@ -4551,9 +5124,34 @@
             <w:r>
               <w:rPr>
                 <w:rFonts w:ascii="Verdana" w:hAnsi="Verdana"/>
-                <w:lang w:val="en-US"/>
-              </w:rPr>
-              <w:t>C03 API/BD. Antes del primer dato real: eliminar teléfono si no se justifica una finalidad necesaria. Prueba: tras migrar, el campo no existe en esquema, solicitudes ni respuestas.</w:t>
+                <w:lang w:val="es-PE"/>
+                <w:b w:val="1"/>
+              </w:rPr>
+              <w:t xml:space="preserve">C03 API/BD. Antes del primer dato real:</w:t>
+            </w:r>
+            <w:r>
+              <w:rPr>
+                <w:rFonts w:ascii="Verdana" w:hAnsi="Verdana"/>
+                <w:lang w:val="es-PE"/>
+                <w:b w:val="0"/>
+              </w:rPr>
+              <w:t xml:space="preserve"> eliminar teléfono si no se justifica una finalidad necesaria. </w:t>
+            </w:r>
+            <w:r>
+              <w:rPr>
+                <w:rFonts w:ascii="Verdana" w:hAnsi="Verdana"/>
+                <w:lang w:val="es-PE"/>
+                <w:b w:val="1"/>
+              </w:rPr>
+              <w:t xml:space="preserve">Prueba:</w:t>
+            </w:r>
+            <w:r>
+              <w:rPr>
+                <w:rFonts w:ascii="Verdana" w:hAnsi="Verdana"/>
+                <w:lang w:val="es-PE"/>
+                <w:b w:val="0"/>
+              </w:rPr>
+              <w:t xml:space="preserve"> tras migrar, el campo no existe en esquema, solicitudes ni respuestas.</w:t>
             </w:r>
           </w:p>
         </w:tc>
@@ -4574,9 +5172,10 @@
             <w:r>
               <w:rPr>
                 <w:rFonts w:ascii="Verdana" w:hAnsi="Verdana"/>
-                <w:lang w:val="en-US"/>
-              </w:rPr>
-              <w:t>Reducción prevista</w:t>
+                <w:lang w:val="es-PE"/>
+                <w:b w:val="0"/>
+              </w:rPr>
+              <w:t xml:space="preserve">Reducido en el diseño</w:t>
             </w:r>
           </w:p>
         </w:tc>
@@ -4597,11 +5196,12 @@
             <w:r>
               <w:rPr>
                 <w:rFonts w:ascii="Verdana" w:hAnsi="Verdana"/>
-                <w:lang w:val="en-US"/>
-              </w:rPr>
-              <w:t>Bajo (1)</w:t>
+                <w:lang w:val="es-PE"/>
+                <w:b w:val="0"/>
+              </w:rPr>
+              <w:t xml:space="preserve">Bajo (1)</w:t>
               <w:br/>
-              <w:t>P1 × I1</w:t>
+              <w:t xml:space="preserve">P1 × I1</w:t>
             </w:r>
           </w:p>
         </w:tc>
@@ -4622,9 +5222,10 @@
             <w:r>
               <w:rPr>
                 <w:rFonts w:ascii="Verdana" w:hAnsi="Verdana"/>
-                <w:lang w:val="en-US"/>
-              </w:rPr>
-              <w:t>Propuesta</w:t>
+                <w:lang w:val="es-PE"/>
+                <w:b w:val="0"/>
+              </w:rPr>
+              <w:t xml:space="preserve">Sí</w:t>
             </w:r>
           </w:p>
         </w:tc>
@@ -4650,9 +5251,10 @@
             <w:r>
               <w:rPr>
                 <w:rFonts w:ascii="Verdana" w:hAnsi="Verdana"/>
-                <w:lang w:val="en-US"/>
-              </w:rPr>
-              <w:t>R4</w:t>
+                <w:lang w:val="es-PE"/>
+                <w:b w:val="1"/>
+              </w:rPr>
+              <w:t xml:space="preserve">R4</w:t>
             </w:r>
           </w:p>
         </w:tc>
@@ -4673,9 +5275,34 @@
             <w:r>
               <w:rPr>
                 <w:rFonts w:ascii="Verdana" w:hAnsi="Verdana"/>
-                <w:lang w:val="en-US"/>
-              </w:rPr>
-              <w:t>C04 Interfaz/proceso. Antes de recolectar: aviso con identidad, finalidad, base, destinatarios, retención, derechos, contacto y campos obligatorios. Si corresponde consentimiento, registrar finalidad, versión, fecha y retiro. Prueba: cotejar aviso y evidencia.</w:t>
+                <w:lang w:val="es-PE"/>
+                <w:b w:val="1"/>
+              </w:rPr>
+              <w:t xml:space="preserve">C04 Interfaz/proceso. Antes del primer dato real:</w:t>
+            </w:r>
+            <w:r>
+              <w:rPr>
+                <w:rFonts w:ascii="Verdana" w:hAnsi="Verdana"/>
+                <w:lang w:val="es-PE"/>
+                <w:b w:val="0"/>
+              </w:rPr>
+              <w:t xml:space="preserve"> aviso y política conforme al art. 18; consentimiento por finalidad, versión, fecha y retiro, sin casillas premarcadas. </w:t>
+            </w:r>
+            <w:r>
+              <w:rPr>
+                <w:rFonts w:ascii="Verdana" w:hAnsi="Verdana"/>
+                <w:lang w:val="es-PE"/>
+                <w:b w:val="1"/>
+              </w:rPr>
+              <w:t xml:space="preserve">Prueba:</w:t>
+            </w:r>
+            <w:r>
+              <w:rPr>
+                <w:rFonts w:ascii="Verdana" w:hAnsi="Verdana"/>
+                <w:lang w:val="es-PE"/>
+                <w:b w:val="0"/>
+              </w:rPr>
+              <w:t xml:space="preserve"> cotejar información y evidencia de aceptación y retiro.</w:t>
             </w:r>
           </w:p>
         </w:tc>
@@ -4696,9 +5323,10 @@
             <w:r>
               <w:rPr>
                 <w:rFonts w:ascii="Verdana" w:hAnsi="Verdana"/>
-                <w:lang w:val="en-US"/>
-              </w:rPr>
-              <w:t>Reducción prevista</w:t>
+                <w:lang w:val="es-PE"/>
+                <w:b w:val="0"/>
+              </w:rPr>
+              <w:t xml:space="preserve">Reducido en el diseño</w:t>
             </w:r>
           </w:p>
         </w:tc>
@@ -4719,11 +5347,12 @@
             <w:r>
               <w:rPr>
                 <w:rFonts w:ascii="Verdana" w:hAnsi="Verdana"/>
-                <w:lang w:val="en-US"/>
-              </w:rPr>
-              <w:t>Bajo (2)</w:t>
+                <w:lang w:val="es-PE"/>
+                <w:b w:val="0"/>
+              </w:rPr>
+              <w:t xml:space="preserve">Bajo (2)</w:t>
               <w:br/>
-              <w:t>P1 × I2</w:t>
+              <w:t xml:space="preserve">P1 × I2</w:t>
             </w:r>
           </w:p>
         </w:tc>
@@ -4744,9 +5373,10 @@
             <w:r>
               <w:rPr>
                 <w:rFonts w:ascii="Verdana" w:hAnsi="Verdana"/>
-                <w:lang w:val="en-US"/>
-              </w:rPr>
-              <w:t>Propuesta</w:t>
+                <w:lang w:val="es-PE"/>
+                <w:b w:val="0"/>
+              </w:rPr>
+              <w:t xml:space="preserve">Sí</w:t>
             </w:r>
           </w:p>
         </w:tc>
@@ -4772,9 +5402,10 @@
             <w:r>
               <w:rPr>
                 <w:rFonts w:ascii="Verdana" w:hAnsi="Verdana"/>
-                <w:lang w:val="en-US"/>
-              </w:rPr>
-              <w:t>R5</w:t>
+                <w:lang w:val="es-PE"/>
+                <w:b w:val="1"/>
+              </w:rPr>
+              <w:t xml:space="preserve">R5</w:t>
             </w:r>
           </w:p>
         </w:tc>
@@ -4795,9 +5426,34 @@
             <w:r>
               <w:rPr>
                 <w:rFonts w:ascii="Verdana" w:hAnsi="Verdana"/>
-                <w:lang w:val="en-US"/>
-              </w:rPr>
-              <w:t>C05 BD/tarea. Antes del primer dato real: justificar máximo de 30 días desde el alta y borrado diario; definir vencimiento de copias. Prueba: eliminar entrada de 31 días y conservar la de 29.</w:t>
+                <w:lang w:val="es-PE"/>
+                <w:b w:val="1"/>
+              </w:rPr>
+              <w:t xml:space="preserve">C05 BD/tarea. Antes del primer dato real:</w:t>
+            </w:r>
+            <w:r>
+              <w:rPr>
+                <w:rFonts w:ascii="Verdana" w:hAnsi="Verdana"/>
+                <w:lang w:val="es-PE"/>
+                <w:b w:val="0"/>
+              </w:rPr>
+              <w:t xml:space="preserve"> justificar máximo de 30 días desde el alta y borrado diario; definir vencimiento de copias. </w:t>
+            </w:r>
+            <w:r>
+              <w:rPr>
+                <w:rFonts w:ascii="Verdana" w:hAnsi="Verdana"/>
+                <w:lang w:val="es-PE"/>
+                <w:b w:val="1"/>
+              </w:rPr>
+              <w:t xml:space="preserve">Prueba:</w:t>
+            </w:r>
+            <w:r>
+              <w:rPr>
+                <w:rFonts w:ascii="Verdana" w:hAnsi="Verdana"/>
+                <w:lang w:val="es-PE"/>
+                <w:b w:val="0"/>
+              </w:rPr>
+              <w:t xml:space="preserve"> eliminar entrada de 31 días y conservar la de 29.</w:t>
             </w:r>
           </w:p>
         </w:tc>
@@ -4818,9 +5474,10 @@
             <w:r>
               <w:rPr>
                 <w:rFonts w:ascii="Verdana" w:hAnsi="Verdana"/>
-                <w:lang w:val="en-US"/>
-              </w:rPr>
-              <w:t>Reducción prevista</w:t>
+                <w:lang w:val="es-PE"/>
+                <w:b w:val="0"/>
+              </w:rPr>
+              <w:t xml:space="preserve">Reducido en el diseño</w:t>
             </w:r>
           </w:p>
         </w:tc>
@@ -4841,11 +5498,12 @@
             <w:r>
               <w:rPr>
                 <w:rFonts w:ascii="Verdana" w:hAnsi="Verdana"/>
-                <w:lang w:val="en-US"/>
-              </w:rPr>
-              <w:t>Bajo (2)</w:t>
+                <w:lang w:val="es-PE"/>
+                <w:b w:val="0"/>
+              </w:rPr>
+              <w:t xml:space="preserve">Bajo (2)</w:t>
               <w:br/>
-              <w:t>P1 × I2</w:t>
+              <w:t xml:space="preserve">P1 × I2</w:t>
             </w:r>
           </w:p>
         </w:tc>
@@ -4866,9 +5524,10 @@
             <w:r>
               <w:rPr>
                 <w:rFonts w:ascii="Verdana" w:hAnsi="Verdana"/>
-                <w:lang w:val="en-US"/>
-              </w:rPr>
-              <w:t>Propuesta</w:t>
+                <w:lang w:val="es-PE"/>
+                <w:b w:val="0"/>
+              </w:rPr>
+              <w:t xml:space="preserve">Sí</w:t>
             </w:r>
           </w:p>
         </w:tc>
@@ -4894,9 +5553,10 @@
             <w:r>
               <w:rPr>
                 <w:rFonts w:ascii="Verdana" w:hAnsi="Verdana"/>
-                <w:lang w:val="en-US"/>
-              </w:rPr>
-              <w:t>R6</w:t>
+                <w:lang w:val="es-PE"/>
+                <w:b w:val="1"/>
+              </w:rPr>
+              <w:t xml:space="preserve">R6</w:t>
             </w:r>
           </w:p>
         </w:tc>
@@ -4917,9 +5577,34 @@
             <w:r>
               <w:rPr>
                 <w:rFonts w:ascii="Verdana" w:hAnsi="Verdana"/>
-                <w:lang w:val="en-US"/>
-              </w:rPr>
-              <w:t>C06 API/proceso. Antes del primer dato real: acceso propio, corrección, borrado y exportación autenticados. Prueba: bloquear operaciones sobre otro titular; comprobar cambio, eliminación y contenido exportado.</w:t>
+                <w:lang w:val="es-PE"/>
+                <w:b w:val="1"/>
+              </w:rPr>
+              <w:t xml:space="preserve">C06 API/proceso. Antes del primer dato real:</w:t>
+            </w:r>
+            <w:r>
+              <w:rPr>
+                <w:rFonts w:ascii="Verdana" w:hAnsi="Verdana"/>
+                <w:lang w:val="es-PE"/>
+                <w:b w:val="0"/>
+              </w:rPr>
+              <w:t xml:space="preserve"> acceso propio, corrección, borrado y exportación autenticados, más retiro del consentimiento. </w:t>
+            </w:r>
+            <w:r>
+              <w:rPr>
+                <w:rFonts w:ascii="Verdana" w:hAnsi="Verdana"/>
+                <w:lang w:val="es-PE"/>
+                <w:b w:val="1"/>
+              </w:rPr>
+              <w:t xml:space="preserve">Prueba:</w:t>
+            </w:r>
+            <w:r>
+              <w:rPr>
+                <w:rFonts w:ascii="Verdana" w:hAnsi="Verdana"/>
+                <w:lang w:val="es-PE"/>
+                <w:b w:val="0"/>
+              </w:rPr>
+              <w:t xml:space="preserve"> bloquear operaciones ajenas y comprobar actualización, eliminación, exportación y retiro.</w:t>
             </w:r>
           </w:p>
         </w:tc>
@@ -4940,9 +5625,10 @@
             <w:r>
               <w:rPr>
                 <w:rFonts w:ascii="Verdana" w:hAnsi="Verdana"/>
-                <w:lang w:val="en-US"/>
-              </w:rPr>
-              <w:t>Reducción prevista</w:t>
+                <w:lang w:val="es-PE"/>
+                <w:b w:val="0"/>
+              </w:rPr>
+              <w:t xml:space="preserve">Reducido en el diseño</w:t>
             </w:r>
           </w:p>
         </w:tc>
@@ -4963,11 +5649,12 @@
             <w:r>
               <w:rPr>
                 <w:rFonts w:ascii="Verdana" w:hAnsi="Verdana"/>
-                <w:lang w:val="en-US"/>
-              </w:rPr>
-              <w:t>Bajo (2)</w:t>
+                <w:lang w:val="es-PE"/>
+                <w:b w:val="0"/>
+              </w:rPr>
+              <w:t xml:space="preserve">Bajo (2)</w:t>
               <w:br/>
-              <w:t>P1 × I2</w:t>
+              <w:t xml:space="preserve">P1 × I2</w:t>
             </w:r>
           </w:p>
         </w:tc>
@@ -4988,9 +5675,10 @@
             <w:r>
               <w:rPr>
                 <w:rFonts w:ascii="Verdana" w:hAnsi="Verdana"/>
-                <w:lang w:val="en-US"/>
-              </w:rPr>
-              <w:t>Propuesta</w:t>
+                <w:lang w:val="es-PE"/>
+                <w:b w:val="0"/>
+              </w:rPr>
+              <w:t xml:space="preserve">Sí</w:t>
             </w:r>
           </w:p>
         </w:tc>
@@ -5016,9 +5704,10 @@
             <w:r>
               <w:rPr>
                 <w:rFonts w:ascii="Verdana" w:hAnsi="Verdana"/>
-                <w:lang w:val="en-US"/>
-              </w:rPr>
-              <w:t>R7</w:t>
+                <w:lang w:val="es-PE"/>
+                <w:b w:val="1"/>
+              </w:rPr>
+              <w:t xml:space="preserve">R7</w:t>
             </w:r>
           </w:p>
         </w:tc>
@@ -5039,9 +5728,34 @@
             <w:r>
               <w:rPr>
                 <w:rFonts w:ascii="Verdana" w:hAnsi="Verdana"/>
-                <w:lang w:val="en-US"/>
-              </w:rPr>
-              <w:t>C07 API/BD. Antes del primer dato real: exigir texto no vacío, validar formato y normalizar correo con unicidad. Prueba: formato inválido devuelve 400; duplicado, 409. No acredita identidad.</w:t>
+                <w:lang w:val="es-PE"/>
+                <w:b w:val="1"/>
+              </w:rPr>
+              <w:t xml:space="preserve">C07 API/BD. Antes del primer dato real:</w:t>
+            </w:r>
+            <w:r>
+              <w:rPr>
+                <w:rFonts w:ascii="Verdana" w:hAnsi="Verdana"/>
+                <w:lang w:val="es-PE"/>
+                <w:b w:val="0"/>
+              </w:rPr>
+              <w:t xml:space="preserve"> exigir texto no vacío, validar formato y normalizar correo con unicidad. </w:t>
+            </w:r>
+            <w:r>
+              <w:rPr>
+                <w:rFonts w:ascii="Verdana" w:hAnsi="Verdana"/>
+                <w:lang w:val="es-PE"/>
+                <w:b w:val="1"/>
+              </w:rPr>
+              <w:t xml:space="preserve">Prueba:</w:t>
+            </w:r>
+            <w:r>
+              <w:rPr>
+                <w:rFonts w:ascii="Verdana" w:hAnsi="Verdana"/>
+                <w:lang w:val="es-PE"/>
+                <w:b w:val="0"/>
+              </w:rPr>
+              <w:t xml:space="preserve"> formato inválido devuelve 400; duplicado, 409. No acredita identidad.</w:t>
             </w:r>
           </w:p>
         </w:tc>
@@ -5062,9 +5776,10 @@
             <w:r>
               <w:rPr>
                 <w:rFonts w:ascii="Verdana" w:hAnsi="Verdana"/>
-                <w:lang w:val="en-US"/>
-              </w:rPr>
-              <w:t>Reducción prevista</w:t>
+                <w:lang w:val="es-PE"/>
+                <w:b w:val="0"/>
+              </w:rPr>
+              <w:t xml:space="preserve">Reducido en el diseño</w:t>
             </w:r>
           </w:p>
         </w:tc>
@@ -5085,11 +5800,12 @@
             <w:r>
               <w:rPr>
                 <w:rFonts w:ascii="Verdana" w:hAnsi="Verdana"/>
-                <w:lang w:val="en-US"/>
-              </w:rPr>
-              <w:t>Bajo (2)</w:t>
+                <w:lang w:val="es-PE"/>
+                <w:b w:val="0"/>
+              </w:rPr>
+              <w:t xml:space="preserve">Bajo (2)</w:t>
               <w:br/>
-              <w:t>P1 × I2</w:t>
+              <w:t xml:space="preserve">P1 × I2</w:t>
             </w:r>
           </w:p>
         </w:tc>
@@ -5110,9 +5826,10 @@
             <w:r>
               <w:rPr>
                 <w:rFonts w:ascii="Verdana" w:hAnsi="Verdana"/>
-                <w:lang w:val="en-US"/>
-              </w:rPr>
-              <w:t>Propuesta</w:t>
+                <w:lang w:val="es-PE"/>
+                <w:b w:val="0"/>
+              </w:rPr>
+              <w:t xml:space="preserve">Sí</w:t>
             </w:r>
           </w:p>
         </w:tc>
@@ -5138,9 +5855,10 @@
             <w:r>
               <w:rPr>
                 <w:rFonts w:ascii="Verdana" w:hAnsi="Verdana"/>
-                <w:lang w:val="en-US"/>
-              </w:rPr>
-              <w:t>R8</w:t>
+                <w:lang w:val="es-PE"/>
+                <w:b w:val="1"/>
+              </w:rPr>
+              <w:t xml:space="preserve">R8</w:t>
             </w:r>
           </w:p>
         </w:tc>
@@ -5161,9 +5879,34 @@
             <w:r>
               <w:rPr>
                 <w:rFonts w:ascii="Verdana" w:hAnsi="Verdana"/>
-                <w:lang w:val="en-US"/>
-              </w:rPr>
-              <w:t>C08 Auditoría/proceso. Antes del primer dato real: registrar actor, acción y fecha sin contactos completos; restringir consulta y definir respuesta a incidentes. Prueba: simular divulgación y comprobar traza y respuesta.</w:t>
+                <w:lang w:val="es-PE"/>
+                <w:b w:val="1"/>
+              </w:rPr>
+              <w:t xml:space="preserve">C08 Auditoría/proceso. Antes del primer dato real:</w:t>
+            </w:r>
+            <w:r>
+              <w:rPr>
+                <w:rFonts w:ascii="Verdana" w:hAnsi="Verdana"/>
+                <w:lang w:val="es-PE"/>
+                <w:b w:val="0"/>
+              </w:rPr>
+              <w:t xml:space="preserve"> registrar actor, acción y fecha sin contactos completos; restringir consulta y definir respuesta a incidentes. </w:t>
+            </w:r>
+            <w:r>
+              <w:rPr>
+                <w:rFonts w:ascii="Verdana" w:hAnsi="Verdana"/>
+                <w:lang w:val="es-PE"/>
+                <w:b w:val="1"/>
+              </w:rPr>
+              <w:t xml:space="preserve">Prueba:</w:t>
+            </w:r>
+            <w:r>
+              <w:rPr>
+                <w:rFonts w:ascii="Verdana" w:hAnsi="Verdana"/>
+                <w:lang w:val="es-PE"/>
+                <w:b w:val="0"/>
+              </w:rPr>
+              <w:t xml:space="preserve"> simular divulgación y comprobar traza y respuesta.</w:t>
             </w:r>
           </w:p>
         </w:tc>
@@ -5184,9 +5927,10 @@
             <w:r>
               <w:rPr>
                 <w:rFonts w:ascii="Verdana" w:hAnsi="Verdana"/>
-                <w:lang w:val="en-US"/>
-              </w:rPr>
-              <w:t>Reducción prevista</w:t>
+                <w:lang w:val="es-PE"/>
+                <w:b w:val="0"/>
+              </w:rPr>
+              <w:t xml:space="preserve">Reducido en el diseño</w:t>
             </w:r>
           </w:p>
         </w:tc>
@@ -5207,11 +5951,12 @@
             <w:r>
               <w:rPr>
                 <w:rFonts w:ascii="Verdana" w:hAnsi="Verdana"/>
-                <w:lang w:val="en-US"/>
-              </w:rPr>
-              <w:t>Bajo (2)</w:t>
+                <w:lang w:val="es-PE"/>
+                <w:b w:val="0"/>
+              </w:rPr>
+              <w:t xml:space="preserve">Bajo (2)</w:t>
               <w:br/>
-              <w:t>P1 × I2</w:t>
+              <w:t xml:space="preserve">P1 × I2</w:t>
             </w:r>
           </w:p>
         </w:tc>
@@ -5232,9 +5977,10 @@
             <w:r>
               <w:rPr>
                 <w:rFonts w:ascii="Verdana" w:hAnsi="Verdana"/>
-                <w:lang w:val="en-US"/>
-              </w:rPr>
-              <w:t>Propuesta</w:t>
+                <w:lang w:val="es-PE"/>
+                <w:b w:val="0"/>
+              </w:rPr>
+              <w:t xml:space="preserve">Sí</w:t>
             </w:r>
           </w:p>
         </w:tc>
@@ -5414,11 +6160,12 @@
             <w:r>
               <w:rPr>
                 <w:rFonts w:ascii="Verdana" w:hAnsi="Verdana"/>
-                <w:lang w:val="en-US"/>
-              </w:rPr>
-              <w:t>Ronal Condor Blas</w:t>
+                <w:lang w:val="es-PE"/>
+                <w:b w:val="0"/>
+              </w:rPr>
+              <w:t xml:space="preserve">Ronal Condor Blas</w:t>
               <w:br/>
-              <w:t>23 de octubre de 2026</w:t>
+              <w:t xml:space="preserve">23 de octubre de 2026</w:t>
             </w:r>
           </w:p>
         </w:tc>
@@ -5485,11 +6232,12 @@
             <w:r>
               <w:rPr>
                 <w:rFonts w:ascii="Verdana" w:hAnsi="Verdana"/>
-                <w:lang w:val="en-US"/>
-              </w:rPr>
-              <w:t>Ronal Condor Blas</w:t>
+                <w:lang w:val="es-PE"/>
+                <w:b w:val="0"/>
+              </w:rPr>
+              <w:t xml:space="preserve">Ronal Condor Blas</w:t>
               <w:br/>
-              <w:t>23 de octubre de 2026</w:t>
+              <w:t xml:space="preserve">23 de octubre de 2026</w:t>
             </w:r>
           </w:p>
         </w:tc>
@@ -5545,12 +6293,22 @@
           </w:tcPr>
           <w:p>
             <w:pPr>
-              <w:spacing w:before="120" w:after="120"/>
-              <w:rPr>
-                <w:rFonts w:ascii="Verdana" w:hAnsi="Verdana"/>
-                <w:lang w:val="en-US"/>
-              </w:rPr>
-            </w:pPr>
+              <w:rPr>
+                <w:rFonts w:ascii="Verdana" w:hAnsi="Verdana"/>
+                <w:lang w:val="en-US"/>
+              </w:rPr>
+              <w:spacing w:after="0"/>
+              <w:keepNext w:val="0"/>
+              <w:keepLines w:val="1"/>
+            </w:pPr>
+            <w:r>
+              <w:rPr>
+                <w:rFonts w:ascii="Verdana" w:hAnsi="Verdana"/>
+                <w:lang w:val="es-PE"/>
+                <w:b w:val="0"/>
+              </w:rPr>
+              <w:t xml:space="preserve">No se incorpora un dictamen de DPO.</w:t>
+            </w:r>
           </w:p>
         </w:tc>
         <w:tc>
@@ -5588,33 +6346,44 @@
           </w:tcPr>
           <w:p>
             <w:pPr>
-              <w:spacing w:before="120" w:after="120"/>
               <w:rPr>
                 <w:rFonts w:ascii="Verdana" w:hAnsi="Verdana"/>
                 <w:sz w:val="20"/>
                 <w:lang w:val="en-US"/>
               </w:rPr>
-            </w:pPr>
-            <w:r>
-              <w:rPr>
-                <w:rFonts w:ascii="Verdana" w:hAnsi="Verdana"/>
-                <w:lang w:val="en-US"/>
-              </w:rPr>
-              <w:t>Summary</w:t>
-            </w:r>
-            <w:r>
-              <w:rPr>
-                <w:rFonts w:ascii="Verdana" w:hAnsi="Verdana"/>
-                <w:lang w:val="en-US"/>
-              </w:rPr>
-              <w:t xml:space="preserve"> of DPO advice</w:t>
-            </w:r>
-            <w:r>
-              <w:rPr>
-                <w:rFonts w:ascii="Verdana" w:hAnsi="Verdana"/>
-                <w:lang w:val="en-US"/>
-              </w:rPr>
-              <w:t>:</w:t>
+              <w:spacing w:after="100"/>
+              <w:keepNext w:val="0"/>
+              <w:keepLines w:val="1"/>
+            </w:pPr>
+            <w:r>
+              <w:rPr>
+                <w:rFonts w:ascii="Verdana" w:hAnsi="Verdana"/>
+                <w:sz w:val="20"/>
+                <w:lang w:val="es-PE"/>
+                <w:b w:val="1"/>
+              </w:rPr>
+              <w:t xml:space="preserve">Summary of DPO advice:</w:t>
+            </w:r>
+          </w:p>
+          <w:p>
+            <w:pPr>
+              <w:rPr>
+                <w:rFonts w:ascii="Verdana" w:hAnsi="Verdana"/>
+                <w:sz w:val="20"/>
+                <w:lang w:val="en-US"/>
+              </w:rPr>
+              <w:spacing w:after="0"/>
+              <w:keepNext w:val="0"/>
+              <w:keepLines w:val="1"/>
+            </w:pPr>
+            <w:r>
+              <w:rPr>
+                <w:rFonts w:ascii="Verdana" w:hAnsi="Verdana"/>
+                <w:sz w:val="20"/>
+                <w:lang w:val="es-PE"/>
+                <w:b w:val="0"/>
+              </w:rPr>
+              <w:t xml:space="preserve">La evaluación contiene una revisión técnica individual y un plan de consulta descrito en el paso 3. No se atribuyen recomendaciones a un DPO ni a terceros. Las observaciones externas recibidas se registrarán en sus casillas específicas.</w:t>
             </w:r>
           </w:p>
         </w:tc>
@@ -5647,12 +6416,30 @@
           </w:tcPr>
           <w:p>
             <w:pPr>
-              <w:spacing w:before="120" w:after="120"/>
-              <w:rPr>
-                <w:rFonts w:ascii="Verdana" w:hAnsi="Verdana"/>
-                <w:lang w:val="en-US"/>
-              </w:rPr>
-            </w:pPr>
+              <w:rPr>
+                <w:rFonts w:ascii="Verdana" w:hAnsi="Verdana"/>
+                <w:lang w:val="en-US"/>
+              </w:rPr>
+              <w:spacing w:after="0"/>
+              <w:keepNext w:val="0"/>
+              <w:keepLines w:val="1"/>
+            </w:pPr>
+            <w:r>
+              <w:rPr>
+                <w:rFonts w:ascii="Verdana" w:hAnsi="Verdana"/>
+                <w:lang w:val="es-PE"/>
+                <w:b w:val="1"/>
+              </w:rPr>
+              <w:t xml:space="preserve">No aplica:</w:t>
+            </w:r>
+            <w:r>
+              <w:rPr>
+                <w:rFonts w:ascii="Verdana" w:hAnsi="Verdana"/>
+                <w:lang w:val="es-PE"/>
+                <w:b w:val="0"/>
+              </w:rPr>
+              <w:t xml:space="preserve"> no se incorpora dictamen de DPO que aceptar o rechazar.</w:t>
+            </w:r>
           </w:p>
         </w:tc>
         <w:tc>
@@ -5694,52 +6481,71 @@
                 <w:rFonts w:ascii="Verdana" w:hAnsi="Verdana"/>
                 <w:lang w:val="en-US"/>
               </w:rPr>
-              <w:spacing w:after="80"/>
-              <w:keepNext w:val="0"/>
-              <w:keepLines w:val="1"/>
-            </w:pPr>
-            <w:r>
-              <w:rPr>
-                <w:rFonts w:ascii="Verdana" w:hAnsi="Verdana"/>
-                <w:lang w:val="en-US"/>
-              </w:rPr>
-              <w:t>Comments:</w:t>
-            </w:r>
-          </w:p>
-          <w:p>
-            <w:pPr>
-              <w:rPr>
-                <w:rFonts w:ascii="Verdana" w:hAnsi="Verdana"/>
-                <w:lang w:val="en-US"/>
-              </w:rPr>
-              <w:spacing w:after="80"/>
-              <w:keepNext w:val="0"/>
-              <w:keepLines w:val="1"/>
-            </w:pPr>
-            <w:r>
-              <w:rPr>
-                <w:rFonts w:ascii="Verdana" w:hAnsi="Verdana"/>
-                <w:lang w:val="en-US"/>
-              </w:rPr>
-              <w:t>El backend actual no se puede lanzar con datos reales: R1, R2, R4, R5 y R6 son altos. Se puede lanzar con condiciones: implementar y verificar C01–C08 antes del primer dato real. La aprobación se refiere al diseño propuesto.</w:t>
-            </w:r>
-          </w:p>
-          <w:p>
-            <w:pPr>
-              <w:rPr>
-                <w:rFonts w:ascii="Verdana" w:hAnsi="Verdana"/>
-                <w:lang w:val="en-US"/>
-              </w:rPr>
-              <w:spacing w:after="0"/>
-              <w:keepNext w:val="0"/>
-              <w:keepLines w:val="1"/>
-            </w:pPr>
-            <w:r>
-              <w:rPr>
-                <w:rFonts w:ascii="Verdana" w:hAnsi="Verdana"/>
-                <w:lang w:val="en-US"/>
-              </w:rPr>
-              <w:t>R1 y R2 quedan en medio por el impacto de un acceso o compromiso de claves. Se acepta ese residual condicionado a probar C01 y C02, limitar privilegios y revisar el resultado antes de operar. No queda riesgo residual alto previsto.</w:t>
+              <w:spacing w:after="100"/>
+              <w:keepNext w:val="0"/>
+              <w:keepLines w:val="1"/>
+            </w:pPr>
+            <w:r>
+              <w:rPr>
+                <w:rFonts w:ascii="Verdana" w:hAnsi="Verdana"/>
+                <w:lang w:val="es-PE"/>
+                <w:b w:val="1"/>
+              </w:rPr>
+              <w:t xml:space="preserve">Comments:</w:t>
+            </w:r>
+          </w:p>
+          <w:p>
+            <w:pPr>
+              <w:rPr>
+                <w:rFonts w:ascii="Verdana" w:hAnsi="Verdana"/>
+                <w:lang w:val="en-US"/>
+              </w:rPr>
+              <w:spacing w:after="100"/>
+              <w:keepNext w:val="0"/>
+              <w:keepLines w:val="1"/>
+            </w:pPr>
+            <w:r>
+              <w:rPr>
+                <w:rFonts w:ascii="Verdana" w:hAnsi="Verdana"/>
+                <w:lang w:val="es-PE"/>
+                <w:b w:val="1"/>
+              </w:rPr>
+              <w:t xml:space="preserve">Decisión:</w:t>
+            </w:r>
+            <w:r>
+              <w:rPr>
+                <w:rFonts w:ascii="Verdana" w:hAnsi="Verdana"/>
+                <w:lang w:val="es-PE"/>
+                <w:b w:val="0"/>
+              </w:rPr>
+              <w:t xml:space="preserve"> se puede lanzar con condiciones. Antes del primer dato real deben implementarse y verificarse C01–C08. El backend actual mantiene cinco riesgos altos (R1, R2, R4, R5 y R6). «Sí» aprueba las medidas de diseño; no acredita su implementación.</w:t>
+            </w:r>
+          </w:p>
+          <w:p>
+            <w:pPr>
+              <w:rPr>
+                <w:rFonts w:ascii="Verdana" w:hAnsi="Verdana"/>
+                <w:lang w:val="en-US"/>
+              </w:rPr>
+              <w:spacing w:after="0"/>
+              <w:keepNext w:val="0"/>
+              <w:keepLines w:val="1"/>
+            </w:pPr>
+            <w:r>
+              <w:rPr>
+                <w:rFonts w:ascii="Verdana" w:hAnsi="Verdana"/>
+                <w:lang w:val="es-PE"/>
+                <w:b w:val="1"/>
+              </w:rPr>
+              <w:t xml:space="preserve">Riesgo residual:</w:t>
+            </w:r>
+            <w:r>
+              <w:rPr>
+                <w:rFonts w:ascii="Verdana" w:hAnsi="Verdana"/>
+                <w:lang w:val="es-PE"/>
+                <w:b w:val="0"/>
+              </w:rPr>
+              <w:t xml:space="preserve"> R1 y R2 quedan en medio por el impacto del acceso indebido o del compromiso de claves. Se aceptan condicionados a comprobar C01–C02, limitar privilegios y revisar los resultados. No queda riesgo alto previsto.</w:t>
             </w:r>
           </w:p>
         </w:tc>
@@ -5860,12 +6666,22 @@
           </w:tcPr>
           <w:p>
             <w:pPr>
-              <w:spacing w:before="120" w:after="120"/>
-              <w:rPr>
-                <w:rFonts w:ascii="Verdana" w:hAnsi="Verdana"/>
-                <w:lang w:val="en-US"/>
-              </w:rPr>
-            </w:pPr>
+              <w:rPr>
+                <w:rFonts w:ascii="Verdana" w:hAnsi="Verdana"/>
+                <w:lang w:val="en-US"/>
+              </w:rPr>
+              <w:spacing w:after="0"/>
+              <w:keepNext w:val="0"/>
+              <w:keepLines w:val="1"/>
+            </w:pPr>
+            <w:r>
+              <w:rPr>
+                <w:rFonts w:ascii="Verdana" w:hAnsi="Verdana"/>
+                <w:lang w:val="es-PE"/>
+                <w:b w:val="0"/>
+              </w:rPr>
+              <w:t xml:space="preserve">Ronal Condor Blas</w:t>
+            </w:r>
           </w:p>
         </w:tc>
         <w:tc>
@@ -5895,12 +6711,12 @@
     </w:tbl>
     <w:p>
       <w:pPr>
-        <w:spacing w:line="240" w:lineRule="auto"/>
         <w:rPr>
-          <w:sz w:val="24"/>
           <w:szCs w:val="24"/>
           <w:lang w:val="en-US"/>
+          <w:sz w:val="2"/>
         </w:rPr>
+        <w:spacing w:before="0" w:after="0" w:line="20" w:lineRule="exact"/>
       </w:pPr>
     </w:p>
     <w:sectPr>

</xml_diff>